<commit_message>
bmm350v2 geschreven en de scriptie verder geschreven
</commit_message>
<xml_diff>
--- a/scriptie en voorstelling/Flight_Controller_Scriptie.docx
+++ b/scriptie en voorstelling/Flight_Controller_Scriptie.docx
@@ -5,6 +5,55 @@
     <w:p>
       <w:pPr>
         <w:spacing w:after="100"/>
+        <w:rPr>
+          <w:b/>
+          <w:bCs/>
+          <w:sz w:val="16"/>
+          <w:szCs w:val="16"/>
+        </w:rPr>
+      </w:pPr>
+      <w:r>
+        <w:rPr>
+          <w:b/>
+          <w:bCs/>
+          <w:sz w:val="16"/>
+          <w:szCs w:val="16"/>
+          <w:highlight w:val="green"/>
+        </w:rPr>
+        <w:t>Bijlage nog doen opt einde</w:t>
+      </w:r>
+      <w:r>
+        <w:rPr>
+          <w:b/>
+          <w:bCs/>
+          <w:sz w:val="16"/>
+          <w:szCs w:val="16"/>
+        </w:rPr>
+        <w:t xml:space="preserve"> </w:t>
+      </w:r>
+      <w:r>
+        <w:rPr>
+          <w:b/>
+          <w:bCs/>
+          <w:sz w:val="16"/>
+          <w:szCs w:val="16"/>
+        </w:rPr>
+        <w:t xml:space="preserve">  </w:t>
+      </w:r>
+      <w:r>
+        <w:rPr>
+          <w:b/>
+          <w:bCs/>
+          <w:sz w:val="16"/>
+          <w:szCs w:val="16"/>
+          <w:highlight w:val="yellow"/>
+        </w:rPr>
+        <w:t>commentaar/nog niet werkend</w:t>
+      </w:r>
+    </w:p>
+    <w:p>
+      <w:pPr>
+        <w:spacing w:after="100"/>
         <w:jc w:val="center"/>
       </w:pPr>
       <w:r>
@@ -42,7 +91,7 @@
           <w:sz w:val="24"/>
           <w:szCs w:val="24"/>
         </w:rPr>
-        <w:t>PE2 – Projecteindwerk</w:t>
+        <w:t xml:space="preserve">PE2 </w:t>
       </w:r>
     </w:p>
     <w:p>
@@ -56,58 +105,55 @@
     </w:p>
     <w:p>
       <w:pPr>
-        <w:spacing w:after="200" w:line="276" w:lineRule="auto"/>
-      </w:pPr>
-      <w:r>
+        <w:spacing w:after="120"/>
+        <w:rPr>
+          <w:rFonts w:ascii="Verdana" w:hAnsi="Verdana"/>
+        </w:rPr>
+      </w:pPr>
+      <w:r>
+        <w:rPr>
+          <w:rFonts w:ascii="Verdana" w:hAnsi="Verdana"/>
+        </w:rPr>
         <w:t>Wij hebben gekozen voor het ontwerpen van een drone. De drie grote onderdelen van een drone zijn de flight controller</w:t>
       </w:r>
       <w:r>
-        <w:t xml:space="preserve">, de </w:t>
-      </w:r>
-      <w:proofErr w:type="spellStart"/>
-      <w:r>
-        <w:t>esc</w:t>
-      </w:r>
-      <w:proofErr w:type="spellEnd"/>
-      <w:r>
-        <w:t xml:space="preserve"> en de motor. De motors hebben we aangekocht de andere twee waren de bedoeling om zelf te ontwikkelen. Doorheen het semester hebben we bij beide onze problemen gehad. Er is uiteindelijk besloten om voor de herkansing in augustus te gaan voor het werkende krijgen van de flight controller en ook de </w:t>
-      </w:r>
-      <w:proofErr w:type="spellStart"/>
-      <w:r>
-        <w:t>esc</w:t>
-      </w:r>
-      <w:proofErr w:type="spellEnd"/>
-      <w:r>
-        <w:t xml:space="preserve"> modules aan te kopen. Ondanks dat dit een teleurstelling is zullen we in deze scriptie de </w:t>
-      </w:r>
-      <w:proofErr w:type="spellStart"/>
-      <w:r>
-        <w:t>esc</w:t>
-      </w:r>
-      <w:proofErr w:type="spellEnd"/>
-      <w:r>
-        <w:t xml:space="preserve"> als module nog wel aanhalen maar de eigen ontwikkeling ervan aan de kant laten.</w:t>
-      </w:r>
-    </w:p>
-    <w:p>
-      <w:pPr>
-        <w:spacing w:after="200" w:line="276" w:lineRule="auto"/>
-      </w:pPr>
-      <w:r>
+        <w:rPr>
+          <w:rFonts w:ascii="Verdana" w:hAnsi="Verdana"/>
+        </w:rPr>
+        <w:t>, de esc en de motor. De motors hebben we aangekocht de andere twee waren de bedoeling om zelf te ontwikkelen. Doorheen het semester hebben we bij beide onze problemen gehad. Er is uiteindelijk besloten om voor de herkansing in augustus te gaan voor het werkende krijgen van de flight controller en ook de esc modules aan te kopen. Ondanks dat dit een teleurstelling is zullen we in deze scriptie de esc als module nog wel aanhalen maar de eigen ontwikkeling ervan aan de kant laten.</w:t>
+      </w:r>
+    </w:p>
+    <w:p>
+      <w:pPr>
+        <w:spacing w:after="120"/>
+        <w:rPr>
+          <w:rFonts w:ascii="Verdana" w:hAnsi="Verdana"/>
+        </w:rPr>
+      </w:pPr>
+      <w:r>
+        <w:rPr>
+          <w:rFonts w:ascii="Verdana" w:hAnsi="Verdana"/>
+        </w:rPr>
         <w:t xml:space="preserve">Voor de flight controller het brein hebben we gekozen om 2 opties te voorzien voor onze drone aan te sturen namelijk autonoom als ook met behulp van een controller beide met hun specifieke benodigde componenten als 1 gemeenschappelijke zijnde de gyroscoop. </w:t>
       </w:r>
     </w:p>
     <w:p>
       <w:pPr>
-        <w:spacing w:after="200" w:line="276" w:lineRule="auto"/>
-      </w:pPr>
-      <w:r>
-        <w:t>D</w:t>
-      </w:r>
-      <w:r>
-        <w:t xml:space="preserve">it document beschrijft achtereenvolgens de gemaakte ontwerpkeuzes, de opbouw van de printplaat, de problemen die tijdens het eerste semester zijn opgetreden en hoe daarmee is omgegaan, en tot slot de voortgang </w:t>
-      </w:r>
-      <w:r>
+        <w:spacing w:after="120"/>
+        <w:rPr>
+          <w:rFonts w:ascii="Verdana" w:hAnsi="Verdana"/>
+        </w:rPr>
+      </w:pPr>
+      <w:r>
+        <w:rPr>
+          <w:rFonts w:ascii="Verdana" w:hAnsi="Verdana"/>
+        </w:rPr>
+        <w:t xml:space="preserve">Dit document beschrijft achtereenvolgens de gemaakte ontwerpkeuzes, de opbouw van de printplaat, de problemen die tijdens het eerste semester zijn opgetreden en hoe daarmee is omgegaan, en tot slot de voortgang </w:t>
+      </w:r>
+      <w:r>
+        <w:rPr>
+          <w:rFonts w:ascii="Verdana" w:hAnsi="Verdana"/>
+        </w:rPr>
         <w:t>die we hebben weten te boeken tijdens de herexamen periode.</w:t>
       </w:r>
     </w:p>
@@ -122,10 +168,28 @@
     </w:p>
     <w:p>
       <w:pPr>
-        <w:spacing w:after="200" w:line="276" w:lineRule="auto"/>
-      </w:pPr>
-      <w:r>
-        <w:t>Om de drone stabiel te houden en beide vliegmodi te ondersteunen, is de flight controller uitgerust met de volgende functionaliteiten:</w:t>
+        <w:spacing w:after="120"/>
+        <w:rPr>
+          <w:rFonts w:ascii="Verdana" w:hAnsi="Verdana"/>
+        </w:rPr>
+      </w:pPr>
+      <w:r>
+        <w:rPr>
+          <w:rFonts w:ascii="Verdana" w:hAnsi="Verdana"/>
+        </w:rPr>
+        <w:t>Om de drone stabiel te houden en beide vliegmod</w:t>
+      </w:r>
+      <w:r>
+        <w:rPr>
+          <w:rFonts w:ascii="Verdana" w:hAnsi="Verdana"/>
+        </w:rPr>
+        <w:t>usen</w:t>
+      </w:r>
+      <w:r>
+        <w:rPr>
+          <w:rFonts w:ascii="Verdana" w:hAnsi="Verdana"/>
+        </w:rPr>
+        <w:t xml:space="preserve"> te ondersteunen, is de flight controller uitgerust met de volgende functionaliteiten:</w:t>
       </w:r>
     </w:p>
     <w:p>
@@ -164,20 +228,18 @@
         <w:pStyle w:val="Lijstalinea"/>
         <w:numPr>
           <w:ilvl w:val="0"/>
-          <w:numId w:val="5"/>
+          <w:numId w:val="6"/>
         </w:numPr>
-        <w:spacing w:after="80"/>
-      </w:pPr>
-      <w:r>
-        <w:t xml:space="preserve">BMI330 – IMU met drie </w:t>
-      </w:r>
-      <w:proofErr w:type="spellStart"/>
-      <w:r>
-        <w:t>accelerometers</w:t>
-      </w:r>
-      <w:proofErr w:type="spellEnd"/>
-      <w:r>
-        <w:t xml:space="preserve"> en drie gyroscopen</w:t>
+        <w:spacing w:after="120"/>
+        <w:rPr>
+          <w:rFonts w:ascii="Verdana" w:hAnsi="Verdana"/>
+        </w:rPr>
+      </w:pPr>
+      <w:r>
+        <w:rPr>
+          <w:rFonts w:ascii="Verdana" w:hAnsi="Verdana"/>
+        </w:rPr>
+        <w:t>BMI330 – IMU met drie accelerometers en drie gyroscopen</w:t>
       </w:r>
     </w:p>
     <w:p>
@@ -208,26 +270,18 @@
         <w:pStyle w:val="Lijstalinea"/>
         <w:numPr>
           <w:ilvl w:val="0"/>
-          <w:numId w:val="3"/>
+          <w:numId w:val="6"/>
         </w:numPr>
-        <w:spacing w:after="80"/>
-      </w:pPr>
-      <w:r>
-        <w:t xml:space="preserve">MPU6050 – IMU module </w:t>
-      </w:r>
-      <w:r>
-        <w:t xml:space="preserve">drie </w:t>
-      </w:r>
-      <w:proofErr w:type="spellStart"/>
-      <w:r>
-        <w:t>accelerometers</w:t>
-      </w:r>
-      <w:proofErr w:type="spellEnd"/>
-      <w:r>
-        <w:t xml:space="preserve"> en drie gyroscopen</w:t>
-      </w:r>
-      <w:r>
-        <w:t xml:space="preserve"> </w:t>
+        <w:spacing w:after="120"/>
+        <w:rPr>
+          <w:rFonts w:ascii="Verdana" w:hAnsi="Verdana"/>
+        </w:rPr>
+      </w:pPr>
+      <w:r>
+        <w:rPr>
+          <w:rFonts w:ascii="Verdana" w:hAnsi="Verdana"/>
+        </w:rPr>
+        <w:t xml:space="preserve">MPU6050 – IMU module drie accelerometers en drie gyroscopen </w:t>
       </w:r>
     </w:p>
     <w:p>
@@ -240,14 +294,7 @@
           <w:b/>
           <w:bCs/>
         </w:rPr>
-        <w:t>A</w:t>
-      </w:r>
-      <w:r>
-        <w:rPr>
-          <w:b/>
-          <w:bCs/>
-        </w:rPr>
-        <w:t>utonoom vliegen</w:t>
+        <w:t>Autonoom vliegen</w:t>
       </w:r>
     </w:p>
     <w:p>
@@ -255,11 +302,17 @@
         <w:pStyle w:val="Lijstalinea"/>
         <w:numPr>
           <w:ilvl w:val="0"/>
-          <w:numId w:val="2"/>
+          <w:numId w:val="6"/>
         </w:numPr>
-        <w:spacing w:after="80"/>
-      </w:pPr>
-      <w:r>
+        <w:spacing w:after="120"/>
+        <w:rPr>
+          <w:rFonts w:ascii="Verdana" w:hAnsi="Verdana"/>
+        </w:rPr>
+      </w:pPr>
+      <w:r>
+        <w:rPr>
+          <w:rFonts w:ascii="Verdana" w:hAnsi="Verdana"/>
+        </w:rPr>
         <w:t>GPS-module</w:t>
       </w:r>
     </w:p>
@@ -268,11 +321,17 @@
         <w:pStyle w:val="Lijstalinea"/>
         <w:numPr>
           <w:ilvl w:val="0"/>
-          <w:numId w:val="2"/>
+          <w:numId w:val="6"/>
         </w:numPr>
-        <w:spacing w:after="80"/>
-      </w:pPr>
-      <w:r>
+        <w:spacing w:after="120"/>
+        <w:rPr>
+          <w:rFonts w:ascii="Verdana" w:hAnsi="Verdana"/>
+        </w:rPr>
+      </w:pPr>
+      <w:r>
+        <w:rPr>
+          <w:rFonts w:ascii="Verdana" w:hAnsi="Verdana"/>
+        </w:rPr>
         <w:t>Magnetometer</w:t>
       </w:r>
     </w:p>
@@ -281,11 +340,17 @@
         <w:pStyle w:val="Lijstalinea"/>
         <w:numPr>
           <w:ilvl w:val="0"/>
-          <w:numId w:val="2"/>
+          <w:numId w:val="6"/>
         </w:numPr>
-        <w:spacing w:after="80"/>
-      </w:pPr>
-      <w:r>
+        <w:spacing w:after="120"/>
+        <w:rPr>
+          <w:rFonts w:ascii="Verdana" w:hAnsi="Verdana"/>
+        </w:rPr>
+      </w:pPr>
+      <w:r>
+        <w:rPr>
+          <w:rFonts w:ascii="Verdana" w:hAnsi="Verdana"/>
+        </w:rPr>
         <w:t>Barometer</w:t>
       </w:r>
     </w:p>
@@ -294,17 +359,18 @@
         <w:pStyle w:val="Lijstalinea"/>
         <w:numPr>
           <w:ilvl w:val="0"/>
-          <w:numId w:val="2"/>
+          <w:numId w:val="6"/>
         </w:numPr>
-        <w:spacing w:after="80"/>
-      </w:pPr>
-      <w:proofErr w:type="spellStart"/>
-      <w:r>
-        <w:t>MicroSD</w:t>
-      </w:r>
-      <w:proofErr w:type="spellEnd"/>
-      <w:r>
-        <w:t>-kaart voor routegegevens</w:t>
+        <w:spacing w:after="120"/>
+        <w:rPr>
+          <w:rFonts w:ascii="Verdana" w:hAnsi="Verdana"/>
+        </w:rPr>
+      </w:pPr>
+      <w:r>
+        <w:rPr>
+          <w:rFonts w:ascii="Verdana" w:hAnsi="Verdana"/>
+        </w:rPr>
+        <w:t>MicroSD-kaart voor routegegevens</w:t>
       </w:r>
     </w:p>
     <w:p>
@@ -325,20 +391,18 @@
         <w:pStyle w:val="Lijstalinea"/>
         <w:numPr>
           <w:ilvl w:val="0"/>
-          <w:numId w:val="2"/>
+          <w:numId w:val="6"/>
         </w:numPr>
-        <w:spacing w:after="80"/>
-      </w:pPr>
-      <w:r>
-        <w:t>2,4 GHz-</w:t>
-      </w:r>
-      <w:proofErr w:type="spellStart"/>
-      <w:r>
-        <w:t>transceiver</w:t>
-      </w:r>
-      <w:proofErr w:type="spellEnd"/>
-      <w:r>
-        <w:t xml:space="preserve"> met bijhorende antenne</w:t>
+        <w:spacing w:after="120"/>
+        <w:rPr>
+          <w:rFonts w:ascii="Verdana" w:hAnsi="Verdana"/>
+        </w:rPr>
+      </w:pPr>
+      <w:r>
+        <w:rPr>
+          <w:rFonts w:ascii="Verdana" w:hAnsi="Verdana"/>
+        </w:rPr>
+        <w:t>2,4 GHz-transceiver met bijhorende antenne</w:t>
       </w:r>
     </w:p>
     <w:p>
@@ -346,20 +410,18 @@
         <w:pStyle w:val="Lijstalinea"/>
         <w:numPr>
           <w:ilvl w:val="0"/>
-          <w:numId w:val="2"/>
+          <w:numId w:val="6"/>
         </w:numPr>
-        <w:spacing w:after="80"/>
-      </w:pPr>
-      <w:r>
-        <w:t xml:space="preserve">Gebruik van enkele sensors nodig voor </w:t>
-      </w:r>
-      <w:proofErr w:type="spellStart"/>
-      <w:r>
-        <w:t>autnoom</w:t>
-      </w:r>
-      <w:proofErr w:type="spellEnd"/>
-      <w:r>
-        <w:t xml:space="preserve"> vliegen als aanvulling</w:t>
+        <w:spacing w:after="120"/>
+        <w:rPr>
+          <w:rFonts w:ascii="Verdana" w:hAnsi="Verdana"/>
+        </w:rPr>
+      </w:pPr>
+      <w:r>
+        <w:rPr>
+          <w:rFonts w:ascii="Verdana" w:hAnsi="Verdana"/>
+        </w:rPr>
+        <w:t>Gebruik van enkele sensors nodig voor autnoom vliegen als aanvulling</w:t>
       </w:r>
     </w:p>
     <w:p>
@@ -368,6 +430,7 @@
         <w:spacing w:before="400" w:after="200"/>
       </w:pPr>
       <w:r>
+        <w:lastRenderedPageBreak/>
         <w:t>3. Ontwerpkeuzes</w:t>
       </w:r>
     </w:p>
@@ -377,38 +440,64 @@
         <w:spacing w:before="300" w:after="150"/>
       </w:pPr>
       <w:r>
-        <w:lastRenderedPageBreak/>
         <w:t>3.1 Microcontroller: STM32</w:t>
       </w:r>
     </w:p>
     <w:p>
       <w:pPr>
         <w:spacing w:after="200" w:line="276" w:lineRule="auto"/>
-      </w:pPr>
-      <w:r>
+        <w:rPr>
+          <w:rFonts w:ascii="Verdana" w:hAnsi="Verdana"/>
+        </w:rPr>
+      </w:pPr>
+      <w:r>
+        <w:rPr>
+          <w:rFonts w:ascii="Verdana" w:hAnsi="Verdana"/>
+        </w:rPr>
         <w:t xml:space="preserve">Voor de verwerking van alle sensordata is gekozen voor de STM32F745VGT6. Tijdens </w:t>
       </w:r>
       <w:r>
+        <w:rPr>
+          <w:rFonts w:ascii="Verdana" w:hAnsi="Verdana"/>
+        </w:rPr>
         <w:t xml:space="preserve">de research </w:t>
       </w:r>
       <w:r>
+        <w:rPr>
+          <w:rFonts w:ascii="Verdana" w:hAnsi="Verdana"/>
+        </w:rPr>
         <w:t xml:space="preserve"> zijn verschillende microcontrollers vergeleken die vaak worden toegepast in flight controllers, waaronder de lichtere STM32F411 en de krachtigere STM32H743. Uiteindelijk is de F7-variant gekozen om voldoende rekenkracht te garanderen voor de PID-regellussen en de bijhorende berekeningen. </w:t>
       </w:r>
       <w:r>
+        <w:rPr>
+          <w:rFonts w:ascii="Verdana" w:hAnsi="Verdana"/>
+        </w:rPr>
         <w:t>De H7 was ten eerste ontzettend duur en echt overkill voor wat wij zouden nodig hebben.</w:t>
       </w:r>
     </w:p>
     <w:p>
       <w:pPr>
         <w:spacing w:after="200" w:line="276" w:lineRule="auto"/>
-      </w:pPr>
-      <w:r>
+        <w:rPr>
+          <w:rFonts w:ascii="Verdana" w:hAnsi="Verdana"/>
+        </w:rPr>
+      </w:pPr>
+      <w:r>
+        <w:rPr>
+          <w:rFonts w:ascii="Verdana" w:hAnsi="Verdana"/>
+        </w:rPr>
         <w:t xml:space="preserve">Achteraf bleek de STM32F7 ruim voldoende capaciteit te bieden voor de toepassing. Voor een toekomstige versie zou een lichtere en goedkopere chip, zoals de STM32F411, waarschijnlijk </w:t>
       </w:r>
       <w:r>
+        <w:rPr>
+          <w:rFonts w:ascii="Verdana" w:hAnsi="Verdana"/>
+        </w:rPr>
         <w:t>zeker hebben volstaan</w:t>
       </w:r>
       <w:r>
+        <w:rPr>
+          <w:rFonts w:ascii="Verdana" w:hAnsi="Verdana"/>
+        </w:rPr>
         <w:t>.</w:t>
       </w:r>
     </w:p>
@@ -424,112 +513,153 @@
     <w:p>
       <w:pPr>
         <w:spacing w:after="200" w:line="276" w:lineRule="auto"/>
-      </w:pPr>
-      <w:r>
+        <w:rPr>
+          <w:rFonts w:ascii="Verdana" w:hAnsi="Verdana"/>
+        </w:rPr>
+      </w:pPr>
+      <w:r>
+        <w:rPr>
+          <w:rFonts w:ascii="Verdana" w:hAnsi="Verdana"/>
+        </w:rPr>
         <w:t>Om de drone te kunnen stabiliseren en autonoom te laten navigeren, zijn de volgende sensoren op de flight controller geïntegreerd:</w:t>
       </w:r>
     </w:p>
     <w:p>
       <w:pPr>
-        <w:spacing w:after="120"/>
-      </w:pPr>
-      <w:r>
-        <w:rPr>
+        <w:spacing w:after="200" w:line="276" w:lineRule="auto"/>
+        <w:rPr>
+          <w:rFonts w:ascii="Verdana" w:hAnsi="Verdana"/>
+        </w:rPr>
+      </w:pPr>
+      <w:r>
+        <w:rPr>
+          <w:rFonts w:ascii="Verdana" w:hAnsi="Verdana"/>
           <w:b/>
           <w:bCs/>
         </w:rPr>
-        <w:t xml:space="preserve">Gyroscoop: </w:t>
-      </w:r>
-      <w:r>
+        <w:t>Gyroscoop</w:t>
+      </w:r>
+      <w:r>
+        <w:rPr>
+          <w:rFonts w:ascii="Verdana" w:hAnsi="Verdana"/>
+        </w:rPr>
+        <w:t xml:space="preserve">: </w:t>
+      </w:r>
+      <w:r>
+        <w:rPr>
+          <w:rFonts w:ascii="Verdana" w:hAnsi="Verdana"/>
+        </w:rPr>
         <w:t>voor de PID-loop en de algemene stabilisatie van de drone zijn we uiteindelijk beland bij de MPU6050 (lees paragraaf 5.4 Overstap naar de MPU6050)</w:t>
       </w:r>
     </w:p>
     <w:p>
       <w:pPr>
-        <w:spacing w:after="120"/>
-      </w:pPr>
-      <w:r>
-        <w:rPr>
+        <w:spacing w:after="200" w:line="276" w:lineRule="auto"/>
+        <w:rPr>
+          <w:rFonts w:ascii="Verdana" w:hAnsi="Verdana"/>
+        </w:rPr>
+      </w:pPr>
+      <w:r>
+        <w:rPr>
+          <w:rFonts w:ascii="Verdana" w:hAnsi="Verdana"/>
           <w:b/>
           <w:bCs/>
         </w:rPr>
-        <w:t xml:space="preserve">Magnetometer: </w:t>
-      </w:r>
-      <w:r>
-        <w:t xml:space="preserve">voor autonome navigatie is een kompas onmisbaar om de </w:t>
-      </w:r>
-      <w:proofErr w:type="spellStart"/>
-      <w:r>
+        <w:t>Magnetometer</w:t>
+      </w:r>
+      <w:r>
+        <w:rPr>
+          <w:rFonts w:ascii="Verdana" w:hAnsi="Verdana"/>
+        </w:rPr>
+        <w:t xml:space="preserve">: voor autonome navigatie is een kompas onmisbaar om de </w:t>
+      </w:r>
+      <w:r>
+        <w:rPr>
+          <w:rFonts w:ascii="Verdana" w:hAnsi="Verdana"/>
+        </w:rPr>
         <w:t>vlieg</w:t>
       </w:r>
       <w:r>
-        <w:t>ichting</w:t>
-      </w:r>
-      <w:proofErr w:type="spellEnd"/>
-      <w:r>
-        <w:t xml:space="preserve"> te bepalen. Hiervoor is de Bosch BMM350 toegepast.</w:t>
-      </w:r>
-    </w:p>
-    <w:p>
-      <w:pPr>
-        <w:spacing w:after="120"/>
-      </w:pPr>
-      <w:r>
-        <w:rPr>
+        <w:rPr>
+          <w:rFonts w:ascii="Verdana" w:hAnsi="Verdana"/>
+        </w:rPr>
+        <w:t>r</w:t>
+      </w:r>
+      <w:r>
+        <w:rPr>
+          <w:rFonts w:ascii="Verdana" w:hAnsi="Verdana"/>
+        </w:rPr>
+        <w:t>ichting te bepalen. Hiervoor is de Bosch BMM350 toegepast.</w:t>
+      </w:r>
+    </w:p>
+    <w:p>
+      <w:pPr>
+        <w:spacing w:after="200" w:line="276" w:lineRule="auto"/>
+        <w:rPr>
+          <w:rFonts w:ascii="Verdana" w:hAnsi="Verdana"/>
+        </w:rPr>
+      </w:pPr>
+      <w:r>
+        <w:rPr>
+          <w:rFonts w:ascii="Verdana" w:hAnsi="Verdana"/>
           <w:b/>
           <w:bCs/>
         </w:rPr>
-        <w:t xml:space="preserve">Barometer: </w:t>
-      </w:r>
-      <w:r>
-        <w:t>om tijdens autonome vluchten de hoogte te bepalen, maakt de flight controller gebruik van de Bosch BMP384</w:t>
-      </w:r>
-      <w:r>
-        <w:rPr>
+        <w:t>Barometer</w:t>
+      </w:r>
+      <w:r>
+        <w:rPr>
+          <w:rFonts w:ascii="Verdana" w:hAnsi="Verdana"/>
+        </w:rPr>
+        <w:t>: om tijdens autonome vluchten de hoogte te bepalen, maakt de flight controller gebruik van de Bosch BMP384.</w:t>
+      </w:r>
+      <w:r>
+        <w:rPr>
+          <w:rFonts w:ascii="Verdana" w:hAnsi="Verdana"/>
+        </w:rPr>
+        <w:t xml:space="preserve"> </w:t>
+      </w:r>
+      <w:r>
+        <w:rPr>
+          <w:rFonts w:ascii="Verdana" w:hAnsi="Verdana"/>
           <w:highlight w:val="yellow"/>
         </w:rPr>
-        <w:t>.</w:t>
-      </w:r>
-      <w:r>
-        <w:rPr>
-          <w:highlight w:val="yellow"/>
-        </w:rPr>
-        <w:t xml:space="preserve"> Momenteel werkt deze nog niet op de nieuwe print. Dus kunnen we dit niet implementeren en moeten we zonder exacte hoogte bepaling autonoom vliegen.</w:t>
-      </w:r>
-    </w:p>
-    <w:p>
-      <w:pPr>
-        <w:spacing w:after="120"/>
-      </w:pPr>
-      <w:r>
-        <w:rPr>
+        <w:t>Momenteel werkt deze nog niet op de nieuwe print. Dus kunnen we dit niet implementeren en moeten we zonder exacte hoogte bepaling autonoom vliegen.</w:t>
+      </w:r>
+    </w:p>
+    <w:p>
+      <w:pPr>
+        <w:spacing w:after="200" w:line="276" w:lineRule="auto"/>
+        <w:rPr>
+          <w:rFonts w:ascii="Verdana" w:hAnsi="Verdana"/>
+        </w:rPr>
+      </w:pPr>
+      <w:r>
+        <w:rPr>
+          <w:rFonts w:ascii="Verdana" w:hAnsi="Verdana"/>
           <w:b/>
           <w:bCs/>
         </w:rPr>
-        <w:t xml:space="preserve">GPS-module: </w:t>
-      </w:r>
-      <w:r>
-        <w:t>voor positionering is gekozen voor de U-</w:t>
-      </w:r>
-      <w:proofErr w:type="spellStart"/>
-      <w:r>
-        <w:t>blox</w:t>
-      </w:r>
-      <w:proofErr w:type="spellEnd"/>
-      <w:r>
-        <w:t xml:space="preserve"> DAN-F10N. Deze module beschikt over een geïntegreerde antenne, waardoor geen aparte antenne en RF-ontvanger op de printplaat nodig zijn.</w:t>
-      </w:r>
-      <w:r>
+        <w:t>GPS-module</w:t>
+      </w:r>
+      <w:r>
+        <w:rPr>
+          <w:rFonts w:ascii="Verdana" w:hAnsi="Verdana"/>
+        </w:rPr>
+        <w:t>: voor positionering is gekozen voor de U-blox DAN-F10N. Deze module beschikt over een geïntegreerde antenne, waardoor geen aparte antenne en RF-ontvanger op de printplaat nodig zijn.</w:t>
+      </w:r>
+      <w:r>
+        <w:rPr>
+          <w:rFonts w:ascii="Verdana" w:hAnsi="Verdana"/>
+        </w:rPr>
         <w:t xml:space="preserve"> </w:t>
       </w:r>
       <w:r>
         <w:rPr>
+          <w:rFonts w:ascii="Verdana" w:hAnsi="Verdana"/>
           <w:highlight w:val="yellow"/>
         </w:rPr>
-        <w:t>Deze is pas later aangekomen en om toch te kunnen beginnen in de vakantie is besloten om even zonder deze verder te gaan</w:t>
-      </w:r>
-      <w:r>
-        <w:t>.</w:t>
+        <w:t>Deze is pas later aangekomen en om toch te kunnen beginnen in de vakantie is besloten om even zonder deze verder te gaan.</w:t>
       </w:r>
     </w:p>
     <w:p>
@@ -544,17 +674,492 @@
     <w:p>
       <w:pPr>
         <w:spacing w:after="200" w:line="276" w:lineRule="auto"/>
-      </w:pPr>
-      <w:r>
-        <w:t xml:space="preserve">Voor de communicatie met de afstandsbediening is de SX1280-chip toegepast. Deze chip ondersteunt het </w:t>
-      </w:r>
-      <w:proofErr w:type="spellStart"/>
-      <w:r>
-        <w:t>ExpressLRS</w:t>
-      </w:r>
-      <w:proofErr w:type="spellEnd"/>
-      <w:r>
-        <w:t>-protocol (ELRS), een veelgebruikte standaard voor de verbinding tussen afstandsbedieningen en drones.</w:t>
+        <w:rPr>
+          <w:rFonts w:ascii="Verdana" w:hAnsi="Verdana"/>
+        </w:rPr>
+      </w:pPr>
+      <w:r>
+        <w:rPr>
+          <w:rFonts w:ascii="Verdana" w:hAnsi="Verdana"/>
+        </w:rPr>
+        <w:t xml:space="preserve">Voor de communicatie met de afstandsbediening is de </w:t>
+      </w:r>
+      <w:r>
+        <w:rPr>
+          <w:rFonts w:ascii="Verdana" w:hAnsi="Verdana"/>
+          <w:b/>
+          <w:bCs/>
+        </w:rPr>
+        <w:t>SX1280</w:t>
+      </w:r>
+      <w:r>
+        <w:rPr>
+          <w:rFonts w:ascii="Verdana" w:hAnsi="Verdana"/>
+        </w:rPr>
+        <w:t>-chip toegepast. Deze chip ondersteunt het ExpressLRS-protocol (ELRS</w:t>
+      </w:r>
+      <w:r>
+        <w:rPr>
+          <w:rFonts w:ascii="Verdana" w:hAnsi="Verdana"/>
+        </w:rPr>
+        <w:t>). Deze draaien we op het LORA (long range) principe</w:t>
+      </w:r>
+      <w:r>
+        <w:rPr>
+          <w:rFonts w:ascii="Verdana" w:hAnsi="Verdana"/>
+        </w:rPr>
+        <w:t xml:space="preserve">. Het is een open source protocol ontworpen voor FPV-drones. Het geeft ook de mogelijkheid om feedback van op de drone terug te sturen naar de antenne. Om de communicatie </w:t>
+      </w:r>
+      <w:r>
+        <w:rPr>
+          <w:rFonts w:ascii="Verdana" w:hAnsi="Verdana"/>
+        </w:rPr>
+        <w:t xml:space="preserve">van onze drone tot stand te brengen hebben we op school gemeten met de spectrum analyzer en zagen we dat er 2.4GHz werd uitgezonden we wisten op basis hiervan </w:t>
+      </w:r>
+      <w:r>
+        <w:rPr>
+          <w:rFonts w:ascii="Verdana" w:hAnsi="Verdana"/>
+        </w:rPr>
+        <w:t>dat de chip “leefde” waardoor we verder konden ontwikkelen. Dit is op het oorspronkelijke bord nooit gelukt om aan te tonen.</w:t>
+      </w:r>
+    </w:p>
+    <w:p>
+      <w:pPr>
+        <w:spacing w:after="200" w:line="276" w:lineRule="auto"/>
+        <w:rPr>
+          <w:rFonts w:ascii="Verdana" w:hAnsi="Verdana"/>
+        </w:rPr>
+      </w:pPr>
+    </w:p>
+    <w:p>
+      <w:pPr>
+        <w:spacing w:after="200" w:line="276" w:lineRule="auto"/>
+        <w:rPr>
+          <w:rFonts w:ascii="Verdana" w:hAnsi="Verdana"/>
+        </w:rPr>
+      </w:pPr>
+    </w:p>
+    <w:p>
+      <w:pPr>
+        <w:spacing w:after="200" w:line="276" w:lineRule="auto"/>
+        <w:rPr>
+          <w:rFonts w:ascii="Verdana" w:hAnsi="Verdana"/>
+        </w:rPr>
+      </w:pPr>
+    </w:p>
+    <w:p>
+      <w:pPr>
+        <w:pStyle w:val="Kop2"/>
+        <w:spacing w:before="300" w:after="150"/>
+      </w:pPr>
+      <w:r>
+        <w:lastRenderedPageBreak/>
+        <w:t>3.4 Batterij</w:t>
+      </w:r>
+    </w:p>
+    <w:p>
+      <w:pPr>
+        <w:pStyle w:val="Kop2"/>
+        <w:spacing w:before="300" w:after="150"/>
+        <w:rPr>
+          <w:rFonts w:ascii="Verdana" w:hAnsi="Verdana"/>
+          <w:color w:val="auto"/>
+          <w:sz w:val="20"/>
+          <w:szCs w:val="20"/>
+        </w:rPr>
+      </w:pPr>
+      <w:r>
+        <w:rPr>
+          <w:rFonts w:ascii="Verdana" w:hAnsi="Verdana"/>
+          <w:color w:val="auto"/>
+          <w:sz w:val="20"/>
+          <w:szCs w:val="20"/>
+        </w:rPr>
+        <w:drawing>
+          <wp:anchor distT="0" distB="0" distL="114300" distR="114300" simplePos="0" relativeHeight="251659264" behindDoc="0" locked="0" layoutInCell="1" allowOverlap="1" wp14:anchorId="0009B2C0" wp14:editId="2F6C8CA9">
+            <wp:simplePos x="0" y="0"/>
+            <wp:positionH relativeFrom="margin">
+              <wp:align>left</wp:align>
+            </wp:positionH>
+            <wp:positionV relativeFrom="paragraph">
+              <wp:posOffset>2048790</wp:posOffset>
+            </wp:positionV>
+            <wp:extent cx="1001395" cy="760730"/>
+            <wp:effectExtent l="0" t="0" r="8255" b="1270"/>
+            <wp:wrapTopAndBottom/>
+            <wp:docPr id="1582417133" name="Afbeelding 1"/>
+            <wp:cNvGraphicFramePr>
+              <a:graphicFrameLocks xmlns:a="http://schemas.openxmlformats.org/drawingml/2006/main" noChangeAspect="1"/>
+            </wp:cNvGraphicFramePr>
+            <a:graphic xmlns:a="http://schemas.openxmlformats.org/drawingml/2006/main">
+              <a:graphicData uri="http://schemas.openxmlformats.org/drawingml/2006/picture">
+                <pic:pic xmlns:pic="http://schemas.openxmlformats.org/drawingml/2006/picture">
+                  <pic:nvPicPr>
+                    <pic:cNvPr id="1582417133" name=""/>
+                    <pic:cNvPicPr/>
+                  </pic:nvPicPr>
+                  <pic:blipFill>
+                    <a:blip r:embed="rId5" cstate="print">
+                      <a:extLst>
+                        <a:ext uri="{28A0092B-C50C-407E-A947-70E740481C1C}">
+                          <a14:useLocalDpi xmlns:a14="http://schemas.microsoft.com/office/drawing/2010/main" val="0"/>
+                        </a:ext>
+                      </a:extLst>
+                    </a:blip>
+                    <a:stretch>
+                      <a:fillRect/>
+                    </a:stretch>
+                  </pic:blipFill>
+                  <pic:spPr>
+                    <a:xfrm>
+                      <a:off x="0" y="0"/>
+                      <a:ext cx="1001395" cy="760730"/>
+                    </a:xfrm>
+                    <a:prstGeom prst="rect">
+                      <a:avLst/>
+                    </a:prstGeom>
+                  </pic:spPr>
+                </pic:pic>
+              </a:graphicData>
+            </a:graphic>
+          </wp:anchor>
+        </w:drawing>
+      </w:r>
+      <w:r>
+        <w:rPr>
+          <w:rFonts w:ascii="Verdana" w:hAnsi="Verdana"/>
+          <w:color w:val="auto"/>
+          <w:sz w:val="20"/>
+          <w:szCs w:val="20"/>
+        </w:rPr>
+        <w:t xml:space="preserve">Om een batterij te kiezen </w:t>
+      </w:r>
+      <w:r>
+        <w:rPr>
+          <w:rFonts w:ascii="Verdana" w:hAnsi="Verdana"/>
+          <w:color w:val="auto"/>
+          <w:sz w:val="20"/>
+          <w:szCs w:val="20"/>
+        </w:rPr>
+        <w:t xml:space="preserve">moesten we rekening houden met enkele dingen. De belangrijkste waren de AAD (average amp Draw), </w:t>
+      </w:r>
+      <w:r>
+        <w:rPr>
+          <w:rFonts w:ascii="Verdana" w:hAnsi="Verdana"/>
+          <w:color w:val="auto"/>
+          <w:sz w:val="20"/>
+          <w:szCs w:val="20"/>
+        </w:rPr>
+        <w:t xml:space="preserve">AUW (all up weight) en de tijd. De tijd was natuurlijk flexibel maar het mag ook niet te kort zijn want we wouden wel een </w:t>
+      </w:r>
+      <w:r>
+        <w:rPr>
+          <w:rFonts w:ascii="Verdana" w:hAnsi="Verdana"/>
+          <w:color w:val="auto"/>
+          <w:sz w:val="20"/>
+          <w:szCs w:val="20"/>
+        </w:rPr>
+        <w:t xml:space="preserve">deftige vluchttijd. De andere 2 waren op voorhand moeilijk exact te bepalen zonder de componenten exact te weten en </w:t>
+      </w:r>
+      <w:r>
+        <w:rPr>
+          <w:rFonts w:ascii="Verdana" w:hAnsi="Verdana"/>
+          <w:color w:val="auto"/>
+          <w:sz w:val="20"/>
+          <w:szCs w:val="20"/>
+        </w:rPr>
+        <w:t xml:space="preserve">parameters zoals frame gewicht nog niet in te kunnen brengen. </w:t>
+      </w:r>
+      <w:r>
+        <w:rPr>
+          <w:rFonts w:ascii="Verdana" w:hAnsi="Verdana"/>
+          <w:color w:val="auto"/>
+          <w:sz w:val="20"/>
+          <w:szCs w:val="20"/>
+        </w:rPr>
+        <w:t>We vonden online enkele formules zoals: tijd = (capaciteit * discharge) / AAD</w:t>
+      </w:r>
+      <w:r>
+        <w:rPr>
+          <w:rFonts w:ascii="Verdana" w:hAnsi="Verdana"/>
+          <w:color w:val="auto"/>
+          <w:sz w:val="20"/>
+          <w:szCs w:val="20"/>
+        </w:rPr>
+        <w:t xml:space="preserve"> en AAD = (AUW * P) / V waarbij V de nominale batterij spanning is en P</w:t>
+      </w:r>
+      <w:r>
+        <w:rPr>
+          <w:rFonts w:ascii="Verdana" w:hAnsi="Verdana"/>
+          <w:color w:val="auto"/>
+          <w:sz w:val="20"/>
+          <w:szCs w:val="20"/>
+        </w:rPr>
+        <w:t xml:space="preserve"> het vermogen per kilogram opstijg gewicht. Dat laatste vonden we online </w:t>
+      </w:r>
+      <w:r>
+        <w:rPr>
+          <w:rFonts w:ascii="Verdana" w:hAnsi="Verdana"/>
+          <w:color w:val="auto"/>
+          <w:sz w:val="20"/>
+          <w:szCs w:val="20"/>
+        </w:rPr>
+        <w:t xml:space="preserve">namelijk </w:t>
+      </w:r>
+      <w:r>
+        <w:rPr>
+          <w:rFonts w:ascii="Verdana" w:hAnsi="Verdana"/>
+          <w:color w:val="auto"/>
+          <w:sz w:val="20"/>
+          <w:szCs w:val="20"/>
+        </w:rPr>
+        <w:t xml:space="preserve">170 W/KG. </w:t>
+      </w:r>
+      <w:r>
+        <w:rPr>
+          <w:rFonts w:ascii="Verdana" w:hAnsi="Verdana"/>
+          <w:color w:val="auto"/>
+          <w:sz w:val="20"/>
+          <w:szCs w:val="20"/>
+        </w:rPr>
+        <w:t>Na een gewichtsinschatting te doen kwamen we bij een gewicht van 623g.</w:t>
+      </w:r>
+      <w:r>
+        <w:rPr>
+          <w:rFonts w:ascii="Verdana" w:hAnsi="Verdana"/>
+          <w:color w:val="auto"/>
+          <w:sz w:val="20"/>
+          <w:szCs w:val="20"/>
+        </w:rPr>
+        <w:t xml:space="preserve"> We </w:t>
+      </w:r>
+      <w:r>
+        <w:rPr>
+          <w:rFonts w:ascii="Verdana" w:hAnsi="Verdana"/>
+          <w:color w:val="auto"/>
+          <w:sz w:val="20"/>
+          <w:szCs w:val="20"/>
+        </w:rPr>
+        <w:t xml:space="preserve">wouden een vliegtijd van 10 min halen wat ons op een nominale spanning  van </w:t>
+      </w:r>
+      <w:r>
+        <w:rPr>
+          <w:rFonts w:ascii="Verdana" w:hAnsi="Verdana"/>
+          <w:color w:val="auto"/>
+          <w:sz w:val="20"/>
+          <w:szCs w:val="20"/>
+        </w:rPr>
+        <w:t>ongeveer 15 volt kwam waardoor we op een 4s LIPo batterij kwamen.</w:t>
+      </w:r>
+      <w:r>
+        <w:rPr>
+          <w:rFonts w:ascii="Verdana" w:hAnsi="Verdana"/>
+          <w:color w:val="auto"/>
+          <w:sz w:val="20"/>
+          <w:szCs w:val="20"/>
+        </w:rPr>
+        <w:t xml:space="preserve"> </w:t>
+      </w:r>
+      <w:r>
+        <w:rPr>
+          <w:rFonts w:ascii="Verdana" w:hAnsi="Verdana"/>
+          <w:color w:val="auto"/>
+          <w:sz w:val="20"/>
+          <w:szCs w:val="20"/>
+        </w:rPr>
+        <w:t>(het uiteindelijke gewicht kwam uit op net geen 500 gram.)</w:t>
+      </w:r>
+    </w:p>
+    <w:p>
+      <w:pPr>
+        <w:pStyle w:val="Kop2"/>
+        <w:spacing w:before="300" w:after="150"/>
+        <w:rPr>
+          <w:noProof/>
+        </w:rPr>
+      </w:pPr>
+      <w:r>
+        <w:rPr>
+          <w:noProof/>
+        </w:rPr>
+        <w:t>3.5 Motors en propellors</w:t>
+      </w:r>
+    </w:p>
+    <w:p>
+      <w:pPr>
+        <w:pStyle w:val="Kop2"/>
+        <w:spacing w:before="300" w:after="150"/>
+        <w:rPr>
+          <w:rFonts w:ascii="Verdana" w:hAnsi="Verdana"/>
+          <w:color w:val="auto"/>
+          <w:sz w:val="20"/>
+          <w:szCs w:val="20"/>
+        </w:rPr>
+      </w:pPr>
+      <w:r>
+        <w:rPr>
+          <w:color w:val="auto"/>
+          <w:sz w:val="20"/>
+          <w:szCs w:val="20"/>
+        </w:rPr>
+        <w:t xml:space="preserve"> </w:t>
+      </w:r>
+      <w:r>
+        <w:rPr>
+          <w:rFonts w:ascii="Verdana" w:hAnsi="Verdana"/>
+          <w:color w:val="auto"/>
+          <w:sz w:val="20"/>
+          <w:szCs w:val="20"/>
+        </w:rPr>
+        <w:t>De KV-waarde van een b</w:t>
+      </w:r>
+      <w:r>
+        <w:rPr>
+          <w:rFonts w:ascii="Verdana" w:hAnsi="Verdana"/>
+          <w:color w:val="auto"/>
+          <w:sz w:val="20"/>
+          <w:szCs w:val="20"/>
+        </w:rPr>
+        <w:t xml:space="preserve">rushless dc </w:t>
+      </w:r>
+      <w:r>
+        <w:rPr>
+          <w:rFonts w:ascii="Verdana" w:hAnsi="Verdana"/>
+          <w:color w:val="auto"/>
+          <w:sz w:val="20"/>
+          <w:szCs w:val="20"/>
+        </w:rPr>
+        <w:t>motor (uitgedrukt in RPM/volt) geeft aan hoeveel toeren per minuut de motor onbelast draait per volt aangelegde spanning. Deze waarde is een directe ontwerpparameter: ze bepaalt in grote mate of een motor geschikt is voor snelle, wendbare toepassingen dan wel voor toepassingen met veel stuwkracht bij lagere toerentallen.</w:t>
+      </w:r>
+    </w:p>
+    <w:p>
+      <w:pPr>
+        <w:pStyle w:val="Kop2"/>
+        <w:spacing w:before="300" w:after="150"/>
+        <w:rPr>
+          <w:rFonts w:ascii="Verdana" w:hAnsi="Verdana"/>
+          <w:color w:val="auto"/>
+          <w:sz w:val="20"/>
+          <w:szCs w:val="20"/>
+        </w:rPr>
+      </w:pPr>
+      <w:r>
+        <w:rPr>
+          <w:rFonts w:ascii="Verdana" w:hAnsi="Verdana"/>
+          <w:color w:val="auto"/>
+          <w:sz w:val="20"/>
+          <w:szCs w:val="20"/>
+        </w:rPr>
+        <w:t xml:space="preserve">Onze kv waarde werd dus berekend met de door de batterij geleverde spanning, nominaal 14.8v. </w:t>
+      </w:r>
+      <w:r>
+        <w:rPr>
+          <w:rFonts w:ascii="Verdana" w:hAnsi="Verdana"/>
+          <w:color w:val="auto"/>
+          <w:sz w:val="20"/>
+          <w:szCs w:val="20"/>
+        </w:rPr>
+        <w:t xml:space="preserve">De vraag was nu hoeveel RPM we nodig hadden. Hier is de grote en hoeveelheid spaken van de propollors ook van belang. </w:t>
+      </w:r>
+      <w:r>
+        <w:rPr>
+          <w:rFonts w:ascii="Verdana" w:hAnsi="Verdana"/>
+          <w:color w:val="auto"/>
+          <w:sz w:val="20"/>
+          <w:szCs w:val="20"/>
+        </w:rPr>
+        <w:t xml:space="preserve">Uiteindelijk is het geen exacte wetenschap met 1 exact antwoord. Maar aangeizen kleine propellors met hoog toerental vooral nodig is voor pure snelheid en het omgekeerde voor stabiele vlucht hebben we gekozen voor een middenweg. </w:t>
+      </w:r>
+      <w:r>
+        <w:rPr>
+          <w:rFonts w:ascii="Verdana" w:hAnsi="Verdana"/>
+          <w:color w:val="auto"/>
+          <w:sz w:val="20"/>
+          <w:szCs w:val="20"/>
+        </w:rPr>
+        <w:t xml:space="preserve"> We hebben uiteinlijk motors van</w:t>
+      </w:r>
+      <w:r>
+        <w:rPr>
+          <w:rFonts w:ascii="Verdana" w:hAnsi="Verdana"/>
+          <w:color w:val="auto"/>
+          <w:sz w:val="20"/>
+          <w:szCs w:val="20"/>
+        </w:rPr>
+        <w:t xml:space="preserve"> 2400</w:t>
+      </w:r>
+      <w:r>
+        <w:rPr>
+          <w:rFonts w:ascii="Verdana" w:hAnsi="Verdana"/>
+          <w:color w:val="auto"/>
+          <w:sz w:val="20"/>
+          <w:szCs w:val="20"/>
+          <w:highlight w:val="yellow"/>
+        </w:rPr>
+        <w:t>KV</w:t>
+      </w:r>
+      <w:r>
+        <w:rPr>
+          <w:rFonts w:ascii="Verdana" w:hAnsi="Verdana"/>
+          <w:color w:val="auto"/>
+          <w:sz w:val="20"/>
+          <w:szCs w:val="20"/>
+        </w:rPr>
+        <w:t xml:space="preserve"> gekocht en 3 spakige propellors.</w:t>
+      </w:r>
+    </w:p>
+    <w:p>
+      <w:pPr>
+        <w:pStyle w:val="Kop2"/>
+        <w:spacing w:before="300" w:after="150"/>
+        <w:rPr>
+          <w:noProof/>
+        </w:rPr>
+      </w:pPr>
+      <w:r>
+        <w:rPr>
+          <w:noProof/>
+        </w:rPr>
+        <w:t>3.6 ESC’s</w:t>
+      </w:r>
+    </w:p>
+    <w:p>
+      <w:pPr>
+        <w:pStyle w:val="Kop2"/>
+        <w:spacing w:before="300" w:after="150"/>
+        <w:rPr>
+          <w:rFonts w:ascii="Verdana" w:hAnsi="Verdana"/>
+          <w:color w:val="auto"/>
+          <w:sz w:val="20"/>
+          <w:szCs w:val="20"/>
+        </w:rPr>
+      </w:pPr>
+      <w:r>
+        <w:rPr>
+          <w:rFonts w:ascii="Verdana" w:hAnsi="Verdana"/>
+          <w:color w:val="auto"/>
+          <w:sz w:val="20"/>
+          <w:szCs w:val="20"/>
+        </w:rPr>
+        <w:t xml:space="preserve">Zoals eerder vermeld was het oorspronkelijk de bedoeling om onze eigen ESC’s te ontwikkelen. Jammer genoeg is dat niet geluk. Hoewel het aangetoond is dat het kan werken (enkele seconden) is het niet gelukt om dit consistent te laten draaien doordat we de interne buck converter van de </w:t>
+      </w:r>
+      <w:r>
+        <w:rPr>
+          <w:rFonts w:ascii="Verdana" w:hAnsi="Verdana"/>
+          <w:color w:val="auto"/>
+          <w:sz w:val="20"/>
+          <w:szCs w:val="20"/>
+        </w:rPr>
+        <w:t>stspin32f0a niet aan de praat kregen. Hierdoor is gekozen om ons in de herexamen te focussen op de flight controller. We zijn dan voor esc modules van ali</w:t>
+      </w:r>
+      <w:r>
+        <w:rPr>
+          <w:rFonts w:ascii="Verdana" w:hAnsi="Verdana"/>
+          <w:color w:val="auto"/>
+          <w:sz w:val="20"/>
+          <w:szCs w:val="20"/>
+        </w:rPr>
+        <w:t>express gegaan.</w:t>
       </w:r>
     </w:p>
     <w:p>
@@ -571,57 +1176,789 @@
     </w:p>
     <w:p>
       <w:pPr>
+        <w:pStyle w:val="Kop1"/>
+        <w:spacing w:before="400" w:after="200"/>
+        <w:rPr>
+          <w:noProof/>
+          <w:sz w:val="26"/>
+          <w:szCs w:val="26"/>
+        </w:rPr>
+      </w:pPr>
+      <w:r>
+        <w:rPr>
+          <w:noProof/>
+          <w:sz w:val="26"/>
+          <w:szCs w:val="26"/>
+        </w:rPr>
+        <w:t xml:space="preserve">4.1 </w:t>
+      </w:r>
+      <w:r>
+        <w:rPr>
+          <w:noProof/>
+          <w:sz w:val="26"/>
+          <w:szCs w:val="26"/>
+        </w:rPr>
+        <w:t>Beschrijving</w:t>
+      </w:r>
+    </w:p>
+    <w:p>
+      <w:pPr>
+        <w:pStyle w:val="Kop1"/>
+        <w:spacing w:before="120" w:after="200"/>
+        <w:rPr>
+          <w:rFonts w:ascii="Verdana" w:hAnsi="Verdana"/>
+          <w:color w:val="auto"/>
+          <w:sz w:val="20"/>
+          <w:szCs w:val="20"/>
+        </w:rPr>
+      </w:pPr>
+      <w:r>
+        <w:rPr>
+          <w:rFonts w:ascii="Verdana" w:hAnsi="Verdana"/>
+          <w:color w:val="auto"/>
+          <w:sz w:val="20"/>
+          <w:szCs w:val="20"/>
+        </w:rPr>
+        <w:lastRenderedPageBreak/>
+        <w:drawing>
+          <wp:anchor distT="0" distB="0" distL="114300" distR="114300" simplePos="0" relativeHeight="251658240" behindDoc="1" locked="0" layoutInCell="1" allowOverlap="1" wp14:anchorId="72992E55" wp14:editId="131C12DF">
+            <wp:simplePos x="0" y="0"/>
+            <wp:positionH relativeFrom="margin">
+              <wp:posOffset>4191000</wp:posOffset>
+            </wp:positionH>
+            <wp:positionV relativeFrom="paragraph">
+              <wp:posOffset>18415</wp:posOffset>
+            </wp:positionV>
+            <wp:extent cx="1390650" cy="1282700"/>
+            <wp:effectExtent l="0" t="0" r="0" b="0"/>
+            <wp:wrapTight wrapText="bothSides">
+              <wp:wrapPolygon edited="0">
+                <wp:start x="0" y="0"/>
+                <wp:lineTo x="0" y="21172"/>
+                <wp:lineTo x="21304" y="21172"/>
+                <wp:lineTo x="21304" y="0"/>
+                <wp:lineTo x="0" y="0"/>
+              </wp:wrapPolygon>
+            </wp:wrapTight>
+            <wp:docPr id="491182244" name="Afbeelding 1"/>
+            <wp:cNvGraphicFramePr>
+              <a:graphicFrameLocks xmlns:a="http://schemas.openxmlformats.org/drawingml/2006/main" noChangeAspect="1"/>
+            </wp:cNvGraphicFramePr>
+            <a:graphic xmlns:a="http://schemas.openxmlformats.org/drawingml/2006/main">
+              <a:graphicData uri="http://schemas.openxmlformats.org/drawingml/2006/picture">
+                <pic:pic xmlns:pic="http://schemas.openxmlformats.org/drawingml/2006/picture">
+                  <pic:nvPicPr>
+                    <pic:cNvPr id="0" name="Picture 2"/>
+                    <pic:cNvPicPr>
+                      <a:picLocks noChangeAspect="1" noChangeArrowheads="1"/>
+                    </pic:cNvPicPr>
+                  </pic:nvPicPr>
+                  <pic:blipFill>
+                    <a:blip r:embed="rId6" cstate="print">
+                      <a:extLst>
+                        <a:ext uri="{28A0092B-C50C-407E-A947-70E740481C1C}">
+                          <a14:useLocalDpi xmlns:a14="http://schemas.microsoft.com/office/drawing/2010/main" val="0"/>
+                        </a:ext>
+                      </a:extLst>
+                    </a:blip>
+                    <a:srcRect/>
+                    <a:stretch>
+                      <a:fillRect/>
+                    </a:stretch>
+                  </pic:blipFill>
+                  <pic:spPr bwMode="auto">
+                    <a:xfrm>
+                      <a:off x="0" y="0"/>
+                      <a:ext cx="1390650" cy="1282700"/>
+                    </a:xfrm>
+                    <a:prstGeom prst="rect">
+                      <a:avLst/>
+                    </a:prstGeom>
+                    <a:noFill/>
+                  </pic:spPr>
+                </pic:pic>
+              </a:graphicData>
+            </a:graphic>
+            <wp14:sizeRelH relativeFrom="margin">
+              <wp14:pctWidth>0</wp14:pctWidth>
+            </wp14:sizeRelH>
+            <wp14:sizeRelV relativeFrom="margin">
+              <wp14:pctHeight>0</wp14:pctHeight>
+            </wp14:sizeRelV>
+          </wp:anchor>
+        </w:drawing>
+      </w:r>
+      <w:r>
+        <w:rPr>
+          <w:rFonts w:ascii="Verdana" w:hAnsi="Verdana"/>
+          <w:color w:val="auto"/>
+          <w:sz w:val="20"/>
+          <w:szCs w:val="20"/>
+        </w:rPr>
+        <w:t>We hebben gekozen voor een 4 laags PCB. Dit had enkele redenen</w:t>
+      </w:r>
+      <w:r>
+        <w:rPr>
+          <w:rFonts w:ascii="Verdana" w:hAnsi="Verdana"/>
+          <w:color w:val="auto"/>
+          <w:sz w:val="20"/>
+          <w:szCs w:val="20"/>
+        </w:rPr>
+        <w:t xml:space="preserve">. De eerste en belangrijkste reden was om verschillende powerplanes te hebben er loopt namelijk heel wat stroom </w:t>
+      </w:r>
+      <w:r>
+        <w:rPr>
+          <w:rFonts w:ascii="Verdana" w:hAnsi="Verdana"/>
+          <w:color w:val="auto"/>
+          <w:sz w:val="20"/>
+          <w:szCs w:val="20"/>
+        </w:rPr>
+        <w:t xml:space="preserve">door de flight controller aangezien de esc’s ook gevoed worden vanop de FC. Het maakte het ook mogelijk </w:t>
+      </w:r>
+      <w:r>
+        <w:rPr>
+          <w:rFonts w:ascii="Verdana" w:hAnsi="Verdana"/>
+          <w:color w:val="auto"/>
+          <w:sz w:val="20"/>
+          <w:szCs w:val="20"/>
+        </w:rPr>
+        <w:t>om een compact design te maken wat voor een drone van uitermate belang is. Bij dit compact design kwam dan als extra voordeel dat het ook minder gewicht met zich mee bracht.</w:t>
+      </w:r>
+      <w:r>
+        <w:rPr>
+          <w:rFonts w:ascii="Verdana" w:hAnsi="Verdana"/>
+          <w:color w:val="auto"/>
+          <w:sz w:val="20"/>
+          <w:szCs w:val="20"/>
+        </w:rPr>
+        <w:t xml:space="preserve"> </w:t>
+      </w:r>
+      <w:r>
+        <w:rPr>
+          <w:rFonts w:ascii="Verdana" w:hAnsi="Verdana"/>
+          <w:color w:val="auto"/>
+          <w:sz w:val="20"/>
+          <w:szCs w:val="20"/>
+          <w:highlight w:val="green"/>
+        </w:rPr>
+        <w:t>Bijlage..</w:t>
+      </w:r>
+      <w:r>
+        <w:rPr>
+          <w:rFonts w:ascii="Verdana" w:hAnsi="Verdana"/>
+          <w:color w:val="auto"/>
+          <w:sz w:val="20"/>
+          <w:szCs w:val="20"/>
+        </w:rPr>
+        <w:t xml:space="preserve"> is een voorbeeld van 1 van de planes.</w:t>
+      </w:r>
+    </w:p>
+    <w:p>
+      <w:pPr>
+        <w:pStyle w:val="Kop1"/>
+        <w:spacing w:before="400" w:after="200"/>
+        <w:rPr>
+          <w:noProof/>
+          <w:sz w:val="26"/>
+          <w:szCs w:val="26"/>
+        </w:rPr>
+      </w:pPr>
+      <w:r>
+        <w:rPr>
+          <w:noProof/>
+          <w:sz w:val="26"/>
+          <w:szCs w:val="26"/>
+        </w:rPr>
+        <w:t>4.2 Schemas</w:t>
+      </w:r>
+    </w:p>
+    <w:p>
+      <w:pPr>
+        <w:pStyle w:val="Kop1"/>
+        <w:spacing w:before="120" w:after="200"/>
+        <w:rPr>
+          <w:rFonts w:ascii="Verdana" w:hAnsi="Verdana"/>
+          <w:color w:val="auto"/>
+          <w:sz w:val="20"/>
+          <w:szCs w:val="20"/>
+        </w:rPr>
+      </w:pPr>
+      <w:r>
+        <w:rPr>
+          <w:rFonts w:ascii="Verdana" w:hAnsi="Verdana"/>
+          <w:color w:val="auto"/>
+          <w:sz w:val="20"/>
+          <w:szCs w:val="20"/>
+        </w:rPr>
+        <w:t xml:space="preserve">In </w:t>
+      </w:r>
+      <w:r>
+        <w:rPr>
+          <w:rFonts w:ascii="Verdana" w:hAnsi="Verdana"/>
+          <w:color w:val="auto"/>
+          <w:sz w:val="20"/>
+          <w:szCs w:val="20"/>
+          <w:highlight w:val="green"/>
+        </w:rPr>
+        <w:t>bijlage</w:t>
+      </w:r>
+      <w:r>
+        <w:rPr>
+          <w:rFonts w:ascii="Verdana" w:hAnsi="Verdana"/>
+          <w:color w:val="auto"/>
+          <w:sz w:val="20"/>
+          <w:szCs w:val="20"/>
+        </w:rPr>
+        <w:t xml:space="preserve"> kan u alles sheets van het schema bekijken maar dit zijn de aansluitingen van eerder vernoemde sensors. In deze paragraaf zou ik graag verder ingaan op de power schema’s</w:t>
+      </w:r>
+      <w:r>
+        <w:rPr>
+          <w:rFonts w:ascii="Verdana" w:hAnsi="Verdana"/>
+          <w:color w:val="auto"/>
+          <w:sz w:val="20"/>
+          <w:szCs w:val="20"/>
+        </w:rPr>
+        <w:t>. We zien in bijlage</w:t>
+      </w:r>
+      <w:r>
+        <w:rPr>
+          <w:rFonts w:ascii="Verdana" w:hAnsi="Verdana"/>
+          <w:color w:val="auto"/>
+          <w:sz w:val="20"/>
+          <w:szCs w:val="20"/>
+        </w:rPr>
+        <w:t xml:space="preserve"> 2 een twee traps </w:t>
+      </w:r>
+      <w:r>
+        <w:rPr>
+          <w:rFonts w:ascii="Verdana" w:hAnsi="Verdana"/>
+          <w:color w:val="auto"/>
+          <w:sz w:val="20"/>
+          <w:szCs w:val="20"/>
+        </w:rPr>
+        <w:t>voeding keten. De eerste trap gaan we van de batterij spanning naar de 3.3volt voedingspanning voor het over grote deel van onze fc</w:t>
+      </w:r>
+      <w:r>
+        <w:rPr>
+          <w:rFonts w:ascii="Verdana" w:hAnsi="Verdana"/>
+          <w:color w:val="auto"/>
+          <w:sz w:val="20"/>
+          <w:szCs w:val="20"/>
+        </w:rPr>
+        <w:t>. De esc’s worden hier trouwens niet aan verbonden dit gebeurd via de fc maar is wel op de batterij spanning.</w:t>
+      </w:r>
+      <w:r>
+        <w:rPr>
+          <w:rFonts w:ascii="Verdana" w:hAnsi="Verdana"/>
+          <w:color w:val="auto"/>
+          <w:sz w:val="20"/>
+          <w:szCs w:val="20"/>
+        </w:rPr>
+        <w:t xml:space="preserve"> Het eerste wat we zien na de connector is een diode, deze wordt gebruikt </w:t>
+      </w:r>
+      <w:r>
+        <w:rPr>
+          <w:rFonts w:ascii="Verdana" w:hAnsi="Verdana"/>
+          <w:color w:val="auto"/>
+          <w:sz w:val="20"/>
+          <w:szCs w:val="20"/>
+        </w:rPr>
+        <w:t xml:space="preserve">als polariteitsbescherming </w:t>
+      </w:r>
+      <w:r>
+        <w:rPr>
+          <w:rFonts w:ascii="Verdana" w:hAnsi="Verdana"/>
+          <w:color w:val="auto"/>
+          <w:sz w:val="20"/>
+          <w:szCs w:val="20"/>
+        </w:rPr>
+        <w:t xml:space="preserve">om de rest van de schakeling te beschermen tegen schade bij </w:t>
+      </w:r>
+      <w:r>
+        <w:rPr>
+          <w:rFonts w:ascii="Verdana" w:hAnsi="Verdana"/>
+          <w:color w:val="auto"/>
+          <w:sz w:val="20"/>
+          <w:szCs w:val="20"/>
+        </w:rPr>
+        <w:t>bijvoorbeeld</w:t>
+      </w:r>
+      <w:r>
+        <w:rPr>
+          <w:rFonts w:ascii="Verdana" w:hAnsi="Verdana"/>
+          <w:color w:val="auto"/>
+          <w:sz w:val="20"/>
+          <w:szCs w:val="20"/>
+        </w:rPr>
+        <w:t xml:space="preserve"> foutief aan</w:t>
+      </w:r>
+      <w:r>
+        <w:rPr>
+          <w:rFonts w:ascii="Verdana" w:hAnsi="Verdana"/>
+          <w:color w:val="auto"/>
+          <w:sz w:val="20"/>
+          <w:szCs w:val="20"/>
+        </w:rPr>
+        <w:t xml:space="preserve">sluiten van de </w:t>
+      </w:r>
+      <w:r>
+        <w:rPr>
+          <w:rFonts w:ascii="Verdana" w:hAnsi="Verdana"/>
+          <w:color w:val="auto"/>
+          <w:sz w:val="20"/>
+          <w:szCs w:val="20"/>
+        </w:rPr>
+        <w:t>batterij</w:t>
+      </w:r>
+      <w:r>
+        <w:rPr>
+          <w:rFonts w:ascii="Verdana" w:hAnsi="Verdana"/>
+          <w:color w:val="auto"/>
+          <w:sz w:val="20"/>
+          <w:szCs w:val="20"/>
+        </w:rPr>
+        <w:t>.</w:t>
+      </w:r>
+      <w:r>
+        <w:rPr>
+          <w:rFonts w:ascii="Verdana" w:hAnsi="Verdana"/>
+          <w:color w:val="auto"/>
+          <w:sz w:val="20"/>
+          <w:szCs w:val="20"/>
+        </w:rPr>
+        <w:t xml:space="preserve"> Dan zien we </w:t>
+      </w:r>
+      <w:r>
+        <w:rPr>
+          <w:rFonts w:ascii="Verdana" w:hAnsi="Verdana"/>
+          <w:color w:val="auto"/>
+          <w:sz w:val="20"/>
+          <w:szCs w:val="20"/>
+        </w:rPr>
+        <w:t>de effectieve buck converter</w:t>
+      </w:r>
+      <w:r>
+        <w:rPr>
+          <w:rFonts w:ascii="Verdana" w:hAnsi="Verdana"/>
+          <w:color w:val="auto"/>
+          <w:sz w:val="20"/>
+          <w:szCs w:val="20"/>
+        </w:rPr>
+        <w:t>.</w:t>
+      </w:r>
+      <w:r>
+        <w:rPr>
+          <w:rFonts w:ascii="Verdana" w:hAnsi="Verdana"/>
+          <w:color w:val="auto"/>
+          <w:sz w:val="20"/>
+          <w:szCs w:val="20"/>
+        </w:rPr>
+        <w:t xml:space="preserve"> </w:t>
+      </w:r>
+      <w:r>
+        <w:rPr>
+          <w:rFonts w:ascii="Verdana" w:hAnsi="Verdana"/>
+          <w:color w:val="auto"/>
+          <w:sz w:val="20"/>
+          <w:szCs w:val="20"/>
+        </w:rPr>
+        <w:t>D</w:t>
+      </w:r>
+      <w:r>
+        <w:rPr>
+          <w:rFonts w:ascii="Verdana" w:hAnsi="Verdana"/>
+          <w:color w:val="auto"/>
+          <w:sz w:val="20"/>
+          <w:szCs w:val="20"/>
+        </w:rPr>
+        <w:t>eze</w:t>
+      </w:r>
+      <w:r>
+        <w:rPr>
+          <w:rFonts w:ascii="Verdana" w:hAnsi="Verdana"/>
+          <w:color w:val="auto"/>
+          <w:sz w:val="20"/>
+          <w:szCs w:val="20"/>
+        </w:rPr>
+        <w:t xml:space="preserve"> werkt doordat een interne</w:t>
+      </w:r>
+      <w:r>
+        <w:rPr>
+          <w:rFonts w:ascii="Verdana" w:hAnsi="Verdana"/>
+          <w:color w:val="auto"/>
+          <w:sz w:val="20"/>
+          <w:szCs w:val="20"/>
+        </w:rPr>
+        <w:t xml:space="preserve"> transistor razendsnel “af” en “aan”</w:t>
+      </w:r>
+      <w:r>
+        <w:rPr>
+          <w:rFonts w:ascii="Verdana" w:hAnsi="Verdana"/>
+          <w:color w:val="auto"/>
+          <w:sz w:val="20"/>
+          <w:szCs w:val="20"/>
+        </w:rPr>
+        <w:t xml:space="preserve"> gaat door een pwm signaal aan de </w:t>
+      </w:r>
+      <w:r>
+        <w:rPr>
+          <w:rFonts w:ascii="Verdana" w:hAnsi="Verdana"/>
+          <w:color w:val="auto"/>
+          <w:sz w:val="20"/>
+          <w:szCs w:val="20"/>
+        </w:rPr>
+        <w:t>gate</w:t>
+      </w:r>
+      <w:r>
+        <w:rPr>
+          <w:rFonts w:ascii="Verdana" w:hAnsi="Verdana"/>
+          <w:color w:val="auto"/>
+          <w:sz w:val="20"/>
+          <w:szCs w:val="20"/>
+        </w:rPr>
+        <w:t>.</w:t>
+      </w:r>
+      <w:r>
+        <w:rPr>
+          <w:rFonts w:ascii="Verdana" w:hAnsi="Verdana"/>
+          <w:color w:val="auto"/>
+          <w:sz w:val="20"/>
+          <w:szCs w:val="20"/>
+        </w:rPr>
+        <w:t xml:space="preserve"> </w:t>
+      </w:r>
+      <w:r>
+        <w:rPr>
+          <w:rFonts w:ascii="Verdana" w:hAnsi="Verdana"/>
+          <w:color w:val="auto"/>
+          <w:sz w:val="20"/>
+          <w:szCs w:val="20"/>
+        </w:rPr>
+        <w:t>De energie word tussendoor opgeslagen door de spoel</w:t>
+      </w:r>
+      <w:r>
+        <w:rPr>
+          <w:rFonts w:ascii="Verdana" w:hAnsi="Verdana"/>
+          <w:color w:val="auto"/>
+          <w:sz w:val="20"/>
+          <w:szCs w:val="20"/>
+        </w:rPr>
+        <w:t xml:space="preserve">. Als de transistor aan staat zal de stroom lineair opbouwen over de spoel en als deze af staat zal de spoel deze plotse verandering tegen gaan door stroom terug te leveren uit zijn magnetisch veld. Dit word dan nog eens afgevlakt door een condensator waardoor </w:t>
+      </w:r>
+      <w:r>
+        <w:rPr>
+          <w:rFonts w:ascii="Verdana" w:hAnsi="Verdana"/>
+          <w:color w:val="auto"/>
+          <w:sz w:val="20"/>
+          <w:szCs w:val="20"/>
+        </w:rPr>
+        <w:t>er een mooie vlakke spanning van 3.3 volt ontstaat.</w:t>
+      </w:r>
+    </w:p>
+    <w:p>
+      <w:pPr>
+        <w:pStyle w:val="Kop1"/>
+        <w:spacing w:before="120" w:after="200"/>
+        <w:rPr>
+          <w:rFonts w:ascii="Verdana" w:hAnsi="Verdana"/>
+          <w:color w:val="auto"/>
+          <w:sz w:val="20"/>
+          <w:szCs w:val="20"/>
+        </w:rPr>
+      </w:pPr>
+      <w:r>
+        <w:rPr>
+          <w:rFonts w:ascii="Verdana" w:hAnsi="Verdana"/>
+          <w:color w:val="auto"/>
+          <w:sz w:val="20"/>
+          <w:szCs w:val="20"/>
+        </w:rPr>
+        <w:t xml:space="preserve">Voor de gps-module hebben we 1.8 volt nodig omdat de trap tussen </w:t>
+      </w:r>
+      <w:r>
+        <w:rPr>
+          <w:rFonts w:ascii="Verdana" w:hAnsi="Verdana"/>
+          <w:color w:val="auto"/>
+          <w:sz w:val="20"/>
+          <w:szCs w:val="20"/>
+        </w:rPr>
+        <w:t xml:space="preserve">3.3 volt en 1.8 volt niet zo groot is </w:t>
+      </w:r>
+      <w:r>
+        <w:rPr>
+          <w:rFonts w:ascii="Verdana" w:hAnsi="Verdana"/>
+          <w:color w:val="auto"/>
+          <w:sz w:val="20"/>
+          <w:szCs w:val="20"/>
+        </w:rPr>
+        <w:t xml:space="preserve">gebruiken we een ldo. </w:t>
+      </w:r>
+      <w:r>
+        <w:rPr>
+          <w:rFonts w:ascii="Verdana" w:hAnsi="Verdana"/>
+          <w:color w:val="auto"/>
+          <w:sz w:val="20"/>
+          <w:szCs w:val="20"/>
+        </w:rPr>
+        <w:t>Deze zet</w:t>
+      </w:r>
+      <w:r>
+        <w:rPr>
+          <w:rFonts w:ascii="Verdana" w:hAnsi="Verdana"/>
+          <w:color w:val="auto"/>
+          <w:sz w:val="20"/>
+          <w:szCs w:val="20"/>
+        </w:rPr>
+        <w:t xml:space="preserve"> via een transistor en een feedback loop een vaste 1.8 volt op de uitgang het overige vermogen wordt via warmte weg gereguleerd. Als we dus veel vermogen nodig hebben zou dit niet rendabel zijn omdat we dan veel hitte ontwikkelen en onze batterij te rap leeg trekken.</w:t>
+      </w:r>
+    </w:p>
+    <w:p>
+      <w:pPr>
+        <w:pStyle w:val="Kop1"/>
+        <w:spacing w:before="120" w:after="200"/>
+        <w:rPr>
+          <w:color w:val="auto"/>
+          <w:sz w:val="20"/>
+          <w:szCs w:val="20"/>
+        </w:rPr>
+      </w:pPr>
+      <w:r>
+        <w:rPr>
+          <w:color w:val="auto"/>
+          <w:sz w:val="20"/>
+          <w:szCs w:val="20"/>
+        </w:rPr>
+        <w:drawing>
+          <wp:inline distT="0" distB="0" distL="0" distR="0" wp14:anchorId="473BC2D6" wp14:editId="3029FB9C">
+            <wp:extent cx="3547872" cy="2207888"/>
+            <wp:effectExtent l="0" t="0" r="0" b="2540"/>
+            <wp:docPr id="4" name="Afbeelding 3" descr="Afbeelding met tekst, diagram, Plan, lijn&#10;&#10;Door AI gegenereerde inhoud is mogelijk onjuist.">
+              <a:extLst xmlns:a="http://schemas.openxmlformats.org/drawingml/2006/main">
+                <a:ext uri="{FF2B5EF4-FFF2-40B4-BE49-F238E27FC236}">
+                  <a16:creationId xmlns:a16="http://schemas.microsoft.com/office/drawing/2014/main" id="{CEEE51D9-2393-9FF0-C471-48BD903D47D1}"/>
+                </a:ext>
+              </a:extLst>
+            </wp:docPr>
+            <wp:cNvGraphicFramePr>
+              <a:graphicFrameLocks xmlns:a="http://schemas.openxmlformats.org/drawingml/2006/main" noChangeAspect="1"/>
+            </wp:cNvGraphicFramePr>
+            <a:graphic xmlns:a="http://schemas.openxmlformats.org/drawingml/2006/main">
+              <a:graphicData uri="http://schemas.openxmlformats.org/drawingml/2006/picture">
+                <pic:pic xmlns:pic="http://schemas.openxmlformats.org/drawingml/2006/picture">
+                  <pic:nvPicPr>
+                    <pic:cNvPr id="4" name="Afbeelding 3" descr="Afbeelding met tekst, diagram, Plan, lijn&#10;&#10;Door AI gegenereerde inhoud is mogelijk onjuist.">
+                      <a:extLst>
+                        <a:ext uri="{FF2B5EF4-FFF2-40B4-BE49-F238E27FC236}">
+                          <a16:creationId xmlns:a16="http://schemas.microsoft.com/office/drawing/2014/main" id="{CEEE51D9-2393-9FF0-C471-48BD903D47D1}"/>
+                        </a:ext>
+                      </a:extLst>
+                    </pic:cNvPr>
+                    <pic:cNvPicPr>
+                      <a:picLocks noChangeAspect="1"/>
+                    </pic:cNvPicPr>
+                  </pic:nvPicPr>
+                  <pic:blipFill>
+                    <a:blip r:embed="rId7"/>
+                    <a:stretch>
+                      <a:fillRect/>
+                    </a:stretch>
+                  </pic:blipFill>
+                  <pic:spPr>
+                    <a:xfrm>
+                      <a:off x="0" y="0"/>
+                      <a:ext cx="3556111" cy="2213015"/>
+                    </a:xfrm>
+                    <a:prstGeom prst="rect">
+                      <a:avLst/>
+                    </a:prstGeom>
+                  </pic:spPr>
+                </pic:pic>
+              </a:graphicData>
+            </a:graphic>
+          </wp:inline>
+        </w:drawing>
+      </w:r>
+    </w:p>
+    <w:p>
+      <w:pPr>
+        <w:pStyle w:val="Kop1"/>
+        <w:spacing w:before="400" w:after="200"/>
+      </w:pPr>
+      <w:r>
+        <w:t>5. Problemen en troubleshooting – eerste semester</w:t>
+      </w:r>
+    </w:p>
+    <w:p>
+      <w:pPr>
+        <w:spacing w:after="200" w:line="276" w:lineRule="auto"/>
+        <w:rPr>
+          <w:rFonts w:ascii="Verdana" w:hAnsi="Verdana"/>
+        </w:rPr>
+      </w:pPr>
+      <w:r>
+        <w:rPr>
+          <w:rFonts w:ascii="Verdana" w:hAnsi="Verdana"/>
+        </w:rPr>
+        <w:t>Tijdens de bouw en het testen van de printplaat is een reeks problemen aan het licht gekomen. Onderstaand overzicht beschrijft deze problemen, de oorzaak ervan en de manier waarop ze zijn aangepakt.</w:t>
+      </w:r>
+    </w:p>
+    <w:p>
+      <w:pPr>
         <w:pStyle w:val="Kop2"/>
         <w:spacing w:before="300" w:after="150"/>
-        <w:rPr>
-          <w:color w:val="auto"/>
-          <w:sz w:val="20"/>
-          <w:szCs w:val="20"/>
-        </w:rPr>
-      </w:pPr>
-      <w:r>
-        <w:rPr>
-          <w:color w:val="auto"/>
-          <w:sz w:val="20"/>
-          <w:szCs w:val="20"/>
-        </w:rPr>
-        <w:t xml:space="preserve">Nog te doen maar apart </w:t>
-      </w:r>
-      <w:proofErr w:type="spellStart"/>
-      <w:r>
-        <w:rPr>
-          <w:color w:val="auto"/>
-          <w:sz w:val="20"/>
-          <w:szCs w:val="20"/>
-        </w:rPr>
-        <w:t>voedingplane</w:t>
-      </w:r>
-      <w:proofErr w:type="spellEnd"/>
-      <w:r>
-        <w:rPr>
-          <w:color w:val="auto"/>
-          <w:sz w:val="20"/>
-          <w:szCs w:val="20"/>
-        </w:rPr>
-        <w:t xml:space="preserve">, uitsturing per </w:t>
-      </w:r>
-      <w:proofErr w:type="spellStart"/>
-      <w:r>
-        <w:rPr>
-          <w:color w:val="auto"/>
-          <w:sz w:val="20"/>
-          <w:szCs w:val="20"/>
-        </w:rPr>
-        <w:t>esc</w:t>
-      </w:r>
-      <w:proofErr w:type="spellEnd"/>
-      <w:r>
-        <w:rPr>
-          <w:color w:val="auto"/>
-          <w:sz w:val="20"/>
-          <w:szCs w:val="20"/>
-        </w:rPr>
-        <w:t>……</w:t>
+      </w:pPr>
+      <w:r>
+        <w:lastRenderedPageBreak/>
+        <w:t>5.1 Voeding en de buck-converter</w:t>
+      </w:r>
+    </w:p>
+    <w:p>
+      <w:pPr>
+        <w:spacing w:after="200" w:line="276" w:lineRule="auto"/>
+        <w:rPr>
+          <w:rFonts w:ascii="Verdana" w:hAnsi="Verdana"/>
+        </w:rPr>
+      </w:pPr>
+      <w:r>
+        <w:rPr>
+          <w:rFonts w:ascii="Verdana" w:hAnsi="Verdana"/>
+        </w:rPr>
+        <w:t>Bij het eerste testen van de printplaat bleek er geen 3,3V op het bord aanwezig te zijn. Aangezien deze spanning bijna alle sensoren en de STM32 voedt, functioneerde de print hierdoor volledig niet.</w:t>
+      </w:r>
+    </w:p>
+    <w:p>
+      <w:pPr>
+        <w:spacing w:after="200" w:line="276" w:lineRule="auto"/>
+        <w:rPr>
+          <w:rFonts w:ascii="Verdana" w:hAnsi="Verdana"/>
+        </w:rPr>
+      </w:pPr>
+      <w:r>
+        <w:rPr>
+          <w:rFonts w:ascii="Verdana" w:hAnsi="Verdana"/>
+        </w:rPr>
+        <w:t>Na het testen</w:t>
+      </w:r>
+      <w:r>
+        <w:rPr>
+          <w:rFonts w:ascii="Verdana" w:hAnsi="Verdana"/>
+        </w:rPr>
+        <w:t xml:space="preserve"> wees uit dat dit werd veroorzaakt door een verkeerd gekozen spoel na de buck-converter. De oorspronkelijk gekozen spoel had een saturatiestroom van slechts 60 mA, terwijl de print in normaal </w:t>
+      </w:r>
+      <w:r>
+        <w:rPr>
+          <w:rFonts w:ascii="Verdana" w:hAnsi="Verdana"/>
+        </w:rPr>
+        <w:t>werking</w:t>
+      </w:r>
+      <w:r>
+        <w:rPr>
+          <w:rFonts w:ascii="Verdana" w:hAnsi="Verdana"/>
+        </w:rPr>
+        <w:t xml:space="preserve"> al meer stroom vraagt. Om toch te kunnen testen, is de 3,3V-spanning gedurende lange tijd extern geïnjecteerd.</w:t>
+      </w:r>
+    </w:p>
+    <w:p>
+      <w:pPr>
+        <w:spacing w:after="200" w:line="276" w:lineRule="auto"/>
+        <w:rPr>
+          <w:rFonts w:ascii="Verdana" w:hAnsi="Verdana"/>
+        </w:rPr>
+      </w:pPr>
+      <w:r>
+        <w:rPr>
+          <w:rFonts w:ascii="Verdana" w:hAnsi="Verdana"/>
+        </w:rPr>
+        <w:t xml:space="preserve">Bij het bestellen van een vervangende spoel is bovendien per ongeluk een metrische in plaats van een imperial 0603-behuizing besteld, waardoor in werkelijkheid een 0201-spoel werd geleverd die niet bruikbaar was. </w:t>
+      </w:r>
+      <w:r>
+        <w:rPr>
+          <w:rFonts w:ascii="Verdana" w:hAnsi="Verdana"/>
+        </w:rPr>
+        <w:t>Na het bestellen van de juiste spoelen werkte de voeding naar verwachting.</w:t>
+      </w:r>
+    </w:p>
+    <w:p>
+      <w:pPr>
+        <w:pStyle w:val="Kop2"/>
+        <w:spacing w:before="300" w:after="150"/>
+      </w:pPr>
+      <w:r>
+        <w:t>5.2 Het 14V-incident en schade aan componenten</w:t>
+      </w:r>
+    </w:p>
+    <w:p>
+      <w:pPr>
+        <w:spacing w:after="200" w:line="276" w:lineRule="auto"/>
+        <w:rPr>
+          <w:rFonts w:ascii="Verdana" w:hAnsi="Verdana"/>
+        </w:rPr>
+      </w:pPr>
+      <w:r>
+        <w:rPr>
+          <w:rFonts w:ascii="Verdana" w:hAnsi="Verdana"/>
+        </w:rPr>
+        <w:t>Tijdens het handmatig injecteren van de 3,3V-testspanning is een fout gemaakt waarbij per ongeluk tweemaal 14V op de 3,3V-voedingsrail werd gezet.</w:t>
+      </w:r>
+    </w:p>
+    <w:p>
+      <w:pPr>
+        <w:spacing w:after="200" w:line="276" w:lineRule="auto"/>
+        <w:rPr>
+          <w:rFonts w:ascii="Verdana" w:hAnsi="Verdana"/>
+        </w:rPr>
+      </w:pPr>
+      <w:r>
+        <w:rPr>
+          <w:rFonts w:ascii="Verdana" w:hAnsi="Verdana"/>
+        </w:rPr>
+        <w:t>De aanwezige sensoren – de BMI330, de BMM350, de BMP384 en de GPS-module – hebben een absolute maximale spanning die ver onder deze 14V ligt. Als gevolg van dit incident zijn de geïntegreerde sensoren op de printplaat onbruikbaar geworden.</w:t>
+      </w:r>
+    </w:p>
+    <w:p>
+      <w:pPr>
+        <w:pStyle w:val="Kop2"/>
+        <w:spacing w:before="300" w:after="150"/>
+      </w:pPr>
+      <w:r>
+        <w:t>5.4 Overstap naar een MPU6050-module</w:t>
+      </w:r>
+    </w:p>
+    <w:p>
+      <w:pPr>
+        <w:spacing w:after="200" w:line="276" w:lineRule="auto"/>
+        <w:rPr>
+          <w:rFonts w:ascii="Verdana" w:hAnsi="Verdana"/>
+        </w:rPr>
+      </w:pPr>
+      <w:r>
+        <w:rPr>
+          <w:rFonts w:ascii="Verdana" w:hAnsi="Verdana"/>
+        </w:rPr>
+        <w:t>Zoals  in de functionaliteiten te lezen valt hebben we op ons bord een BMI330 voorzien echter hebben we deze tijdens de test fase beschadigd waardoor we deze niet meer konden gebruiken. De levertermijn voor deze was ontzettend ver en zelfs voor de herkansing in augustus was dit geen optie. Dankzij de tussenkomst van de docent is er gegaan voor een MPU6050 op een module ondanks dat deze chip niet meer gemaakt word is er wel een enorme hoeveelheid aan modules met deze chip op beschikbaar. Deze hebben we dan ook gesoldeerd op een I2C pin van de controller. Het grootste nadeel hieraan is dat we deze dus zo stevig en zo recht mogelijk aan het frame monteren. Of als alternatief op het recht monteren en kalibratie uitvoeren voor de vlucht.</w:t>
+      </w:r>
+    </w:p>
+    <w:p>
+      <w:pPr>
+        <w:pStyle w:val="Kop2"/>
+        <w:spacing w:before="300" w:after="150"/>
+      </w:pPr>
+      <w:r>
+        <w:t>5.5 Gespiegelde ST-Link footprint</w:t>
+      </w:r>
+    </w:p>
+    <w:p>
+      <w:pPr>
+        <w:spacing w:after="200" w:line="276" w:lineRule="auto"/>
+        <w:rPr>
+          <w:rFonts w:ascii="Verdana" w:hAnsi="Verdana"/>
+        </w:rPr>
+      </w:pPr>
+      <w:r>
+        <w:rPr>
+          <w:rFonts w:ascii="Verdana" w:hAnsi="Verdana"/>
+        </w:rPr>
+        <w:t>Bij het ontwerpen van de footprint voor de ST-Link is de pinout gespiegeld aangebracht. Hierdoor was achteraf een extra tussenstuk nodig om de ST-Link met de STM32 te kunnen laten communiceren.</w:t>
       </w:r>
     </w:p>
     <w:p>
@@ -630,209 +1967,35 @@
         <w:spacing w:before="400" w:after="200"/>
       </w:pPr>
       <w:r>
-        <w:t xml:space="preserve">5. Problemen en </w:t>
-      </w:r>
-      <w:proofErr w:type="spellStart"/>
-      <w:r>
-        <w:t>troubleshooting</w:t>
-      </w:r>
-      <w:proofErr w:type="spellEnd"/>
-      <w:r>
-        <w:t xml:space="preserve"> – eerste semester</w:t>
+        <w:t>6. Herexamen</w:t>
+      </w:r>
+      <w:r>
+        <w:t xml:space="preserve"> ontwikkeling</w:t>
       </w:r>
     </w:p>
     <w:p>
       <w:pPr>
         <w:spacing w:after="200" w:line="276" w:lineRule="auto"/>
-      </w:pPr>
-      <w:r>
-        <w:t>Tijdens de bouw en het testen van de printplaat is een reeks problemen aan het licht gekomen. Onderstaand overzicht beschrijft deze problemen, de oorzaak ervan en de manier waarop ze zijn aangepakt.</w:t>
-      </w:r>
-    </w:p>
-    <w:p>
-      <w:pPr>
-        <w:pStyle w:val="Kop2"/>
-        <w:spacing w:before="300" w:after="150"/>
-      </w:pPr>
-      <w:r>
-        <w:t xml:space="preserve">5.1 Voeding en de </w:t>
-      </w:r>
-      <w:proofErr w:type="spellStart"/>
-      <w:r>
-        <w:t>buck</w:t>
-      </w:r>
-      <w:proofErr w:type="spellEnd"/>
-      <w:r>
-        <w:t>-converter</w:t>
-      </w:r>
-    </w:p>
-    <w:p>
-      <w:pPr>
-        <w:spacing w:after="200" w:line="276" w:lineRule="auto"/>
-      </w:pPr>
-      <w:r>
-        <w:t>Bij het eerste testen van de printplaat bleek er geen 3,3V op het bord aanwezig te zijn. Aangezien deze spanning bijna alle sensoren en de STM32 voedt, functioneerde de print hierdoor volledig niet.</w:t>
-      </w:r>
-    </w:p>
-    <w:p>
-      <w:pPr>
-        <w:spacing w:after="200" w:line="276" w:lineRule="auto"/>
-      </w:pPr>
-      <w:r>
-        <w:t>Na het testen</w:t>
-      </w:r>
-      <w:r>
-        <w:t xml:space="preserve"> wees uit dat dit werd veroorzaakt door een verkeerd gekozen spoel na de </w:t>
-      </w:r>
-      <w:proofErr w:type="spellStart"/>
-      <w:r>
-        <w:t>buck</w:t>
-      </w:r>
-      <w:proofErr w:type="spellEnd"/>
-      <w:r>
-        <w:t xml:space="preserve">-converter. De oorspronkelijk gekozen spoel had een saturatiestroom van slechts 60 mA, terwijl de print in normaal </w:t>
-      </w:r>
-      <w:r>
-        <w:t>werking</w:t>
-      </w:r>
-      <w:r>
-        <w:t xml:space="preserve"> al meer stroom vraagt. Om toch te kunnen testen, is de 3,3V-spanning gedurende lange tijd extern geïnjecteerd.</w:t>
-      </w:r>
-    </w:p>
-    <w:p>
-      <w:pPr>
-        <w:spacing w:after="200" w:line="276" w:lineRule="auto"/>
-      </w:pPr>
-      <w:r>
-        <w:lastRenderedPageBreak/>
-        <w:t xml:space="preserve">Bij het bestellen van een vervangende spoel is bovendien per ongeluk een metrische in plaats van een </w:t>
-      </w:r>
-      <w:proofErr w:type="spellStart"/>
-      <w:r>
-        <w:t>imperial</w:t>
-      </w:r>
-      <w:proofErr w:type="spellEnd"/>
-      <w:r>
-        <w:t xml:space="preserve"> 0603-behuizing besteld, waardoor in werkelijkheid een 0201-spoel werd geleverd die niet bruikbaar was. </w:t>
-      </w:r>
-      <w:r>
-        <w:t>Na het bestellen van de juiste spoelen werkte de voeding naar verwachting.</w:t>
-      </w:r>
-    </w:p>
-    <w:p>
-      <w:pPr>
-        <w:pStyle w:val="Kop2"/>
-        <w:spacing w:before="300" w:after="150"/>
-      </w:pPr>
-      <w:r>
-        <w:t>5.2 Het 14V-incident en schade aan componenten</w:t>
-      </w:r>
-    </w:p>
-    <w:p>
-      <w:pPr>
-        <w:spacing w:after="200" w:line="276" w:lineRule="auto"/>
-      </w:pPr>
-      <w:r>
-        <w:t>Tijdens het handmatig injecteren van de 3,3V-testspanning is een fout gemaakt waarbij per ongeluk tweemaal 14V op de 3,3V-voedingsrail werd gezet.</w:t>
-      </w:r>
-    </w:p>
-    <w:p>
-      <w:pPr>
-        <w:spacing w:after="200" w:line="276" w:lineRule="auto"/>
-      </w:pPr>
-      <w:r>
-        <w:t>De aanwezige sensoren – de BMI330, de BMM350, de BMP384 en de GPS-module – hebben een absolute maximale spanning die ver onder deze 14V ligt. Als gevolg van dit incident zijn de geïntegreerde sensoren op de printplaat onbruikbaar geworden.</w:t>
-      </w:r>
-    </w:p>
-    <w:p>
-      <w:pPr>
-        <w:pStyle w:val="Kop2"/>
-        <w:spacing w:before="300" w:after="150"/>
-      </w:pPr>
-      <w:r>
-        <w:t>5.4 Overstap naar een MPU6050-module</w:t>
-      </w:r>
-    </w:p>
-    <w:p>
-      <w:pPr>
-        <w:spacing w:after="200" w:line="276" w:lineRule="auto"/>
-      </w:pPr>
-      <w:r>
-        <w:t>Z</w:t>
-      </w:r>
-      <w:r>
-        <w:t>oals  in de functionaliteiten te lezen valt hebben we op ons bord een BMI330 voorzien echter hebben we deze tijdens de test fase beschadigd waardoor we deze niet meer konden gebruiken. De levertermijn voor deze was ontzettend ver en zelfs voor de herkansing in augustus was dit geen optie. Dankzij de tussenkomst van de docent is er gegaan voor een MPU6050 op een module ondanks dat deze chip niet meer gemaakt word is er wel een enorme hoeveelheid aan modules met deze chip op beschikbaar. Deze hebben we dan ook gesoldeerd op een I2C pin van de controller.</w:t>
-      </w:r>
-      <w:r>
-        <w:t xml:space="preserve"> Het grootste nadeel hieraan is dat we deze dus zo stevig en zo recht mogelijk aan het frame monteren. Of als alternatief op het recht monteren en kalibratie uitvoeren voor de vlucht.</w:t>
-      </w:r>
-    </w:p>
-    <w:p>
-      <w:pPr>
-        <w:pStyle w:val="Kop2"/>
-        <w:spacing w:before="300" w:after="150"/>
-      </w:pPr>
-      <w:r>
-        <w:t>5.5 Gespiegelde ST-Link footprint</w:t>
-      </w:r>
-    </w:p>
-    <w:p>
-      <w:pPr>
-        <w:spacing w:after="200" w:line="276" w:lineRule="auto"/>
-      </w:pPr>
-      <w:r>
-        <w:t xml:space="preserve">Bij het ontwerpen van de footprint voor de ST-Link is de </w:t>
-      </w:r>
-      <w:proofErr w:type="spellStart"/>
-      <w:r>
-        <w:t>pinout</w:t>
-      </w:r>
-      <w:proofErr w:type="spellEnd"/>
-      <w:r>
-        <w:t xml:space="preserve"> gespiegeld aangebracht. Hierdoor was achteraf een extra tussenstuk nodig om de ST-Link met de STM32 te kunnen laten communiceren.</w:t>
-      </w:r>
-    </w:p>
-    <w:p>
-      <w:pPr>
-        <w:pStyle w:val="Kop1"/>
-        <w:spacing w:before="400" w:after="200"/>
-      </w:pPr>
-      <w:r>
-        <w:t xml:space="preserve">6. Herexamen: verdere ontwikkeling met MPU6050 en </w:t>
-      </w:r>
-      <w:proofErr w:type="spellStart"/>
-      <w:r>
-        <w:t>DShot</w:t>
-      </w:r>
-      <w:proofErr w:type="spellEnd"/>
-    </w:p>
-    <w:p>
-      <w:pPr>
-        <w:spacing w:after="200" w:line="276" w:lineRule="auto"/>
-      </w:pPr>
-      <w:r>
-        <w:t xml:space="preserve">Na het eerste semester is in het kader van het herexamen verder gewerkt aan een werkende flight controller op basis van de MPU6050 als vervangende IMU, met </w:t>
-      </w:r>
-      <w:proofErr w:type="spellStart"/>
-      <w:r>
-        <w:t>DShot</w:t>
-      </w:r>
-      <w:proofErr w:type="spellEnd"/>
-      <w:r>
-        <w:t xml:space="preserve"> als aansturingsprotocol voor de</w:t>
-      </w:r>
-      <w:r>
-        <w:t xml:space="preserve">  </w:t>
-      </w:r>
-      <w:proofErr w:type="spellStart"/>
-      <w:r>
-        <w:t>esc’s</w:t>
-      </w:r>
-      <w:proofErr w:type="spellEnd"/>
-      <w:r>
-        <w:t>.</w:t>
-      </w:r>
-      <w:r>
+        <w:rPr>
+          <w:rFonts w:ascii="Verdana" w:hAnsi="Verdana"/>
+        </w:rPr>
+      </w:pPr>
+      <w:r>
+        <w:rPr>
+          <w:rFonts w:ascii="Verdana" w:hAnsi="Verdana"/>
+        </w:rPr>
+        <w:t>Na het eerste semester is in het kader van het herexamen verder gewerkt aan een werkende flight controller op basis van de MPU6050 als vervangende IMU, met DShot als aansturingsprotocol voor de</w:t>
+      </w:r>
+      <w:r>
+        <w:rPr>
+          <w:rFonts w:ascii="Verdana" w:hAnsi="Verdana"/>
+        </w:rPr>
+        <w:t xml:space="preserve">  esc’s.</w:t>
+      </w:r>
+      <w:r>
+        <w:rPr>
+          <w:rFonts w:ascii="Verdana" w:hAnsi="Verdana"/>
+        </w:rPr>
         <w:t xml:space="preserve"> Hieronder volgt een overzicht van de problemen die tijdens deze fase zijn opgetreden, telkens met het symptoom, de oorzaak en de gehanteerde oplossing.</w:t>
       </w:r>
     </w:p>
@@ -851,76 +2014,127 @@
           <w:sz w:val="26"/>
           <w:szCs w:val="26"/>
         </w:rPr>
-        <w:t xml:space="preserve">6.1  Werking </w:t>
-      </w:r>
-      <w:proofErr w:type="spellStart"/>
+        <w:lastRenderedPageBreak/>
+        <w:t xml:space="preserve">6.1  </w:t>
+      </w:r>
       <w:r>
         <w:rPr>
           <w:color w:val="2E74B5"/>
           <w:sz w:val="26"/>
           <w:szCs w:val="26"/>
         </w:rPr>
-        <w:t>DShot</w:t>
-      </w:r>
-      <w:proofErr w:type="spellEnd"/>
+        <w:t>DSHOT/ESC</w:t>
+      </w:r>
     </w:p>
     <w:p>
       <w:pPr>
         <w:spacing w:after="200" w:line="276" w:lineRule="auto"/>
-      </w:pPr>
-      <w:r>
-        <w:t xml:space="preserve">De code voor het </w:t>
-      </w:r>
-      <w:proofErr w:type="spellStart"/>
-      <w:r>
-        <w:t>dshot</w:t>
-      </w:r>
-      <w:proofErr w:type="spellEnd"/>
-      <w:r>
-        <w:t xml:space="preserve"> protocol is geschreven doorheen het semester en uitvoerig getest echter kregen we nooit een gewenst resultaat op de motoren. </w:t>
-      </w:r>
-      <w:r>
-        <w:t xml:space="preserve">De controle met behulp van een logic analyzer en de oscilloscoop was de uitgestuurde data van de chip wel correct en in lijn met de verwachting. Na het </w:t>
-      </w:r>
-      <w:proofErr w:type="spellStart"/>
-      <w:r>
-        <w:t>bestuken</w:t>
-      </w:r>
-      <w:proofErr w:type="spellEnd"/>
-      <w:r>
-        <w:t xml:space="preserve"> van een nieuwe print werkte dit wel. Echter om het enkel op de nieuwe print af te schuiven zou onjuist zijn want we hebben dit ook getest met het </w:t>
-      </w:r>
-      <w:r>
-        <w:t>STM32F746G-DISCO</w:t>
-      </w:r>
-      <w:r>
-        <w:t xml:space="preserve"> die dezelfde processor </w:t>
-      </w:r>
-      <w:proofErr w:type="spellStart"/>
-      <w:r>
-        <w:t>aanboord</w:t>
-      </w:r>
-      <w:proofErr w:type="spellEnd"/>
-      <w:r>
-        <w:t xml:space="preserve"> </w:t>
-      </w:r>
-      <w:r>
-        <w:rPr>
-          <w:highlight w:val="yellow"/>
-        </w:rPr>
-        <w:t>(dit was toch he want als ik da op internet zoek geeft da andere chip precies)</w:t>
-      </w:r>
-      <w:r>
-        <w:t xml:space="preserve"> heeft maar dit werkte ook niet. Het zal waarschijnlijk een combinatie van kleine </w:t>
-      </w:r>
-      <w:proofErr w:type="spellStart"/>
-      <w:r>
-        <w:t>tweaks</w:t>
-      </w:r>
-      <w:proofErr w:type="spellEnd"/>
-      <w:r>
-        <w:t xml:space="preserve"> zijn die tot het gehoopte resultaat geleid hebben.</w:t>
-      </w:r>
+        <w:rPr>
+          <w:rFonts w:ascii="Verdana" w:hAnsi="Verdana"/>
+        </w:rPr>
+      </w:pPr>
+      <w:r>
+        <w:rPr>
+          <w:rFonts w:ascii="Verdana" w:hAnsi="Verdana"/>
+        </w:rPr>
+        <w:t>Om verder te gaan op de ESC-modules moesten we in essentie een DShot-protocol bit-bangen om de ESC's aan te sturen. Deze code werd doorheen het semester geschreven en uitvoerig getest, maar leverde nooit het gewenste resultaat op: de motoren draaiden niet consistent en niet op de momenten die verwacht werden.</w:t>
+      </w:r>
+    </w:p>
+    <w:p>
+      <w:pPr>
+        <w:spacing w:after="200" w:line="276" w:lineRule="auto"/>
+        <w:rPr>
+          <w:rFonts w:ascii="Verdana" w:hAnsi="Verdana"/>
+        </w:rPr>
+      </w:pPr>
+      <w:r>
+        <w:rPr>
+          <w:rFonts w:ascii="Verdana" w:hAnsi="Verdana"/>
+        </w:rPr>
+        <w:t>Metingen</w:t>
+      </w:r>
+      <w:r>
+        <w:rPr>
+          <w:rFonts w:ascii="Verdana" w:hAnsi="Verdana"/>
+        </w:rPr>
+        <w:t xml:space="preserve"> met behulp van een logic analyzer en oscilloscoop toonde echter aan dat de door de STM32 uitgestuurde data wel degelijk </w:t>
+      </w:r>
+      <w:r>
+        <w:rPr>
+          <w:rFonts w:ascii="Verdana" w:hAnsi="Verdana"/>
+        </w:rPr>
+        <w:t xml:space="preserve">  </w:t>
+      </w:r>
+      <w:r>
+        <w:rPr>
+          <w:rFonts w:ascii="Verdana" w:hAnsi="Verdana"/>
+        </w:rPr>
+        <w:t>correct was en overeenkwam met de verwachte DShot-timing. Om dit verder te bevestigen, werd dezelfde code getest via een ESP32, waar de motoren w</w:t>
+      </w:r>
+      <w:r>
+        <w:rPr>
+          <w:rFonts w:ascii="Verdana" w:hAnsi="Verdana"/>
+        </w:rPr>
+        <w:t>e</w:t>
+      </w:r>
+      <w:r>
+        <w:rPr>
+          <w:rFonts w:ascii="Verdana" w:hAnsi="Verdana"/>
+        </w:rPr>
+        <w:t>l naar behoren functioneerden</w:t>
+      </w:r>
+      <w:r>
+        <w:rPr>
+          <w:rFonts w:ascii="Verdana" w:hAnsi="Verdana"/>
+        </w:rPr>
+        <w:t>,</w:t>
+      </w:r>
+      <w:r>
+        <w:rPr>
+          <w:rFonts w:ascii="Verdana" w:hAnsi="Verdana"/>
+        </w:rPr>
+        <w:t xml:space="preserve"> ondanks dat de uitgestuurde data, gemeten met dezelfde logic analyzer, identiek was aan die van de STM32. Dezelfde data resulteerde dus in een ander resultaat, afhankelijk van de gebruikte microcontroller.</w:t>
+      </w:r>
+    </w:p>
+    <w:p>
+      <w:pPr>
+        <w:spacing w:after="200" w:line="276" w:lineRule="auto"/>
+        <w:rPr>
+          <w:rFonts w:ascii="Verdana" w:hAnsi="Verdana"/>
+        </w:rPr>
+      </w:pPr>
+      <w:r>
+        <w:rPr>
+          <w:rFonts w:ascii="Verdana" w:hAnsi="Verdana"/>
+        </w:rPr>
+        <w:t xml:space="preserve">Na het bestukken van een nieuwe print werkte de aansturing wel naar behoren. </w:t>
+      </w:r>
+      <w:r>
+        <w:rPr>
+          <w:rFonts w:ascii="Verdana" w:hAnsi="Verdana"/>
+        </w:rPr>
+        <w:t xml:space="preserve">We weten niet </w:t>
+      </w:r>
+      <w:r>
+        <w:rPr>
+          <w:rFonts w:ascii="Verdana" w:hAnsi="Verdana"/>
+        </w:rPr>
+        <w:t xml:space="preserve">waaraan het zou kunnen liggen dat de oude print het niet werkende kreeg. We weten dat er overspanning is geweest maar dit had geen invloed op de werking van het dshot protocol normaal gezien. </w:t>
+      </w:r>
+      <w:r>
+        <w:rPr>
+          <w:rFonts w:ascii="Verdana" w:hAnsi="Verdana"/>
+        </w:rPr>
+        <w:t>Een echte verklaring kunnen we dan ook niet geven.</w:t>
+      </w:r>
+    </w:p>
+    <w:p>
+      <w:pPr>
+        <w:spacing w:after="200" w:line="276" w:lineRule="auto"/>
+        <w:rPr>
+          <w:rFonts w:ascii="Verdana" w:hAnsi="Verdana"/>
+        </w:rPr>
+      </w:pPr>
     </w:p>
     <w:p>
       <w:pPr>
@@ -951,15 +2165,77 @@
     <w:p>
       <w:pPr>
         <w:spacing w:after="200" w:line="276" w:lineRule="auto"/>
-      </w:pPr>
-      <w:r>
+        <w:rPr>
+          <w:rFonts w:ascii="Verdana" w:hAnsi="Verdana"/>
+        </w:rPr>
+      </w:pPr>
+      <w:r>
+        <w:rPr>
+          <w:rFonts w:ascii="Verdana" w:hAnsi="Verdana"/>
+        </w:rPr>
         <w:t>Ook deze code was al in het semester geschreven en deze werkte maar kon in deze periode dankzij de werkende motors geïmplementeerd worden in de PID-loop.</w:t>
       </w:r>
     </w:p>
     <w:p>
       <w:pPr>
         <w:spacing w:after="200" w:line="276" w:lineRule="auto"/>
-      </w:pPr>
+        <w:rPr>
+          <w:color w:val="2E74B5"/>
+          <w:sz w:val="26"/>
+          <w:szCs w:val="26"/>
+        </w:rPr>
+      </w:pPr>
+      <w:r>
+        <w:rPr>
+          <w:color w:val="2E74B5"/>
+          <w:sz w:val="26"/>
+          <w:szCs w:val="26"/>
+        </w:rPr>
+        <w:t>6.3 ESC’s</w:t>
+      </w:r>
+    </w:p>
+    <w:p>
+      <w:pPr>
+        <w:spacing w:after="200" w:line="276" w:lineRule="auto"/>
+      </w:pPr>
+      <w:r>
+        <w:t xml:space="preserve">Door verder te gaan </w:t>
+      </w:r>
+      <w:r>
+        <w:t xml:space="preserve">op de ESC modules moesten we eigenlijk enkel een dshot code bitbangen die we konden gebruiken om </w:t>
+      </w:r>
+      <w:r>
+        <w:t xml:space="preserve">de esc’s aan te sturen. We hebben deze code geschreven en getest echter werkte dit niet zoals verwacht. De motors draaide niet consistent en </w:t>
+      </w:r>
+      <w:r>
+        <w:t xml:space="preserve">niet op de momenten dat we wouden. We hebben dezelfde code dan getest via een ESP32 en dit bleek wel naar behoren te werken. </w:t>
+      </w:r>
+      <w:r>
+        <w:t>Na het uitmeten met de logic analyzer konden we aantonen dat de data die onze stm uitstuurde wel degelijk ook correct was en zelfs overeen kwam met de data die uit de esp kwam</w:t>
+      </w:r>
+      <w:r>
+        <w:t xml:space="preserve">. Dezelfde data maar dus met een ander resultaat. Na dit enkele weken aan de kant te hebben laten staan hebben we dit opnieuw getest en zonder grote aantoonbare aanpassingen werkt dit plots wel. We zouden dit kunnen classificeren als de zwarte magie die elektronica soms is maar in realiteit zal het ergens een </w:t>
+      </w:r>
+      <w:r>
+        <w:t>minuscuul</w:t>
+      </w:r>
+      <w:r>
+        <w:t xml:space="preserve"> fo</w:t>
+      </w:r>
+      <w:r>
+        <w:t xml:space="preserve">utje zijn geweest dat we onbedoeld maar zeer welkom hebben opgelost. We vermoeden een timing </w:t>
+      </w:r>
+      <w:r>
+        <w:t>fout maar kunnen dus niet achterhalen wat dit geweest is.</w:t>
+      </w:r>
+    </w:p>
+    <w:p>
+      <w:pPr>
+        <w:spacing w:after="200" w:line="276" w:lineRule="auto"/>
+      </w:pPr>
+      <w:r>
+        <w:t>6.4 TX/RX probleem</w:t>
+      </w:r>
     </w:p>
     <w:p>
       <w:pPr>
@@ -967,7 +2243,6 @@
         <w:spacing w:before="400" w:after="200"/>
       </w:pPr>
       <w:r>
-        <w:lastRenderedPageBreak/>
         <w:t>7. Conclusie</w:t>
       </w:r>
     </w:p>
@@ -1156,6 +2431,119 @@
     </w:lvl>
   </w:abstractNum>
   <w:abstractNum w:abstractNumId="2" w15:restartNumberingAfterBreak="0">
+    <w:nsid w:val="2A2F0C07"/>
+    <w:multiLevelType w:val="hybridMultilevel"/>
+    <w:tmpl w:val="AB6CC138"/>
+    <w:lvl w:ilvl="0" w:tplc="08130001">
+      <w:start w:val="1"/>
+      <w:numFmt w:val="bullet"/>
+      <w:lvlText w:val=""/>
+      <w:lvlJc w:val="left"/>
+      <w:pPr>
+        <w:ind w:left="720" w:hanging="360"/>
+      </w:pPr>
+      <w:rPr>
+        <w:rFonts w:ascii="Symbol" w:hAnsi="Symbol" w:hint="default"/>
+      </w:rPr>
+    </w:lvl>
+    <w:lvl w:ilvl="1" w:tplc="08130003" w:tentative="1">
+      <w:start w:val="1"/>
+      <w:numFmt w:val="bullet"/>
+      <w:lvlText w:val="o"/>
+      <w:lvlJc w:val="left"/>
+      <w:pPr>
+        <w:ind w:left="1440" w:hanging="360"/>
+      </w:pPr>
+      <w:rPr>
+        <w:rFonts w:ascii="Courier New" w:hAnsi="Courier New" w:cs="Courier New" w:hint="default"/>
+      </w:rPr>
+    </w:lvl>
+    <w:lvl w:ilvl="2" w:tplc="08130005" w:tentative="1">
+      <w:start w:val="1"/>
+      <w:numFmt w:val="bullet"/>
+      <w:lvlText w:val=""/>
+      <w:lvlJc w:val="left"/>
+      <w:pPr>
+        <w:ind w:left="2160" w:hanging="360"/>
+      </w:pPr>
+      <w:rPr>
+        <w:rFonts w:ascii="Wingdings" w:hAnsi="Wingdings" w:hint="default"/>
+      </w:rPr>
+    </w:lvl>
+    <w:lvl w:ilvl="3" w:tplc="08130001" w:tentative="1">
+      <w:start w:val="1"/>
+      <w:numFmt w:val="bullet"/>
+      <w:lvlText w:val=""/>
+      <w:lvlJc w:val="left"/>
+      <w:pPr>
+        <w:ind w:left="2880" w:hanging="360"/>
+      </w:pPr>
+      <w:rPr>
+        <w:rFonts w:ascii="Symbol" w:hAnsi="Symbol" w:hint="default"/>
+      </w:rPr>
+    </w:lvl>
+    <w:lvl w:ilvl="4" w:tplc="08130003" w:tentative="1">
+      <w:start w:val="1"/>
+      <w:numFmt w:val="bullet"/>
+      <w:lvlText w:val="o"/>
+      <w:lvlJc w:val="left"/>
+      <w:pPr>
+        <w:ind w:left="3600" w:hanging="360"/>
+      </w:pPr>
+      <w:rPr>
+        <w:rFonts w:ascii="Courier New" w:hAnsi="Courier New" w:cs="Courier New" w:hint="default"/>
+      </w:rPr>
+    </w:lvl>
+    <w:lvl w:ilvl="5" w:tplc="08130005" w:tentative="1">
+      <w:start w:val="1"/>
+      <w:numFmt w:val="bullet"/>
+      <w:lvlText w:val=""/>
+      <w:lvlJc w:val="left"/>
+      <w:pPr>
+        <w:ind w:left="4320" w:hanging="360"/>
+      </w:pPr>
+      <w:rPr>
+        <w:rFonts w:ascii="Wingdings" w:hAnsi="Wingdings" w:hint="default"/>
+      </w:rPr>
+    </w:lvl>
+    <w:lvl w:ilvl="6" w:tplc="08130001" w:tentative="1">
+      <w:start w:val="1"/>
+      <w:numFmt w:val="bullet"/>
+      <w:lvlText w:val=""/>
+      <w:lvlJc w:val="left"/>
+      <w:pPr>
+        <w:ind w:left="5040" w:hanging="360"/>
+      </w:pPr>
+      <w:rPr>
+        <w:rFonts w:ascii="Symbol" w:hAnsi="Symbol" w:hint="default"/>
+      </w:rPr>
+    </w:lvl>
+    <w:lvl w:ilvl="7" w:tplc="08130003" w:tentative="1">
+      <w:start w:val="1"/>
+      <w:numFmt w:val="bullet"/>
+      <w:lvlText w:val="o"/>
+      <w:lvlJc w:val="left"/>
+      <w:pPr>
+        <w:ind w:left="5760" w:hanging="360"/>
+      </w:pPr>
+      <w:rPr>
+        <w:rFonts w:ascii="Courier New" w:hAnsi="Courier New" w:cs="Courier New" w:hint="default"/>
+      </w:rPr>
+    </w:lvl>
+    <w:lvl w:ilvl="8" w:tplc="08130005" w:tentative="1">
+      <w:start w:val="1"/>
+      <w:numFmt w:val="bullet"/>
+      <w:lvlText w:val=""/>
+      <w:lvlJc w:val="left"/>
+      <w:pPr>
+        <w:ind w:left="6480" w:hanging="360"/>
+      </w:pPr>
+      <w:rPr>
+        <w:rFonts w:ascii="Wingdings" w:hAnsi="Wingdings" w:hint="default"/>
+      </w:rPr>
+    </w:lvl>
+  </w:abstractNum>
+  <w:abstractNum w:abstractNumId="3" w15:restartNumberingAfterBreak="0">
     <w:nsid w:val="40605AE6"/>
     <w:multiLevelType w:val="hybridMultilevel"/>
     <w:tmpl w:val="D8BE7CC6"/>
@@ -1241,7 +2629,7 @@
       </w:pPr>
     </w:lvl>
   </w:abstractNum>
-  <w:abstractNum w:abstractNumId="3" w15:restartNumberingAfterBreak="0">
+  <w:abstractNum w:abstractNumId="4" w15:restartNumberingAfterBreak="0">
     <w:nsid w:val="544A719D"/>
     <w:multiLevelType w:val="hybridMultilevel"/>
     <w:tmpl w:val="D4369AAC"/>
@@ -1354,7 +2742,7 @@
       </w:rPr>
     </w:lvl>
   </w:abstractNum>
-  <w:abstractNum w:abstractNumId="4" w15:restartNumberingAfterBreak="0">
+  <w:abstractNum w:abstractNumId="5" w15:restartNumberingAfterBreak="0">
     <w:nsid w:val="62936EF8"/>
     <w:multiLevelType w:val="hybridMultilevel"/>
     <w:tmpl w:val="BBB21CF4"/>
@@ -1468,7 +2856,7 @@
     </w:lvl>
   </w:abstractNum>
   <w:num w:numId="1" w16cid:durableId="352339988">
-    <w:abstractNumId w:val="2"/>
+    <w:abstractNumId w:val="3"/>
     <w:lvlOverride w:ilvl="0">
       <w:startOverride w:val="1"/>
     </w:lvlOverride>
@@ -1480,13 +2868,16 @@
     </w:lvlOverride>
   </w:num>
   <w:num w:numId="3" w16cid:durableId="1139036140">
-    <w:abstractNumId w:val="4"/>
+    <w:abstractNumId w:val="5"/>
   </w:num>
   <w:num w:numId="4" w16cid:durableId="1256983194">
-    <w:abstractNumId w:val="3"/>
+    <w:abstractNumId w:val="4"/>
   </w:num>
   <w:num w:numId="5" w16cid:durableId="531309747">
     <w:abstractNumId w:val="1"/>
+  </w:num>
+  <w:num w:numId="6" w16cid:durableId="302005933">
+    <w:abstractNumId w:val="2"/>
   </w:num>
 </w:numbering>
 </file>

</xml_diff>

<commit_message>
versie 2 van het drone frame
</commit_message>
<xml_diff>
--- a/scriptie en voorstelling/Flight_Controller_Scriptie.docx
+++ b/scriptie en voorstelling/Flight_Controller_Scriptie.docx
@@ -20,7 +20,29 @@
           <w:szCs w:val="16"/>
           <w:highlight w:val="green"/>
         </w:rPr>
-        <w:t>Bijlage nog doen opt einde</w:t>
+        <w:t xml:space="preserve">Bijlage nog doen </w:t>
+      </w:r>
+      <w:proofErr w:type="spellStart"/>
+      <w:r>
+        <w:rPr>
+          <w:b/>
+          <w:bCs/>
+          <w:sz w:val="16"/>
+          <w:szCs w:val="16"/>
+          <w:highlight w:val="green"/>
+        </w:rPr>
+        <w:t>opt</w:t>
+      </w:r>
+      <w:proofErr w:type="spellEnd"/>
+      <w:r>
+        <w:rPr>
+          <w:b/>
+          <w:bCs/>
+          <w:sz w:val="16"/>
+          <w:szCs w:val="16"/>
+          <w:highlight w:val="green"/>
+        </w:rPr>
+        <w:t xml:space="preserve"> einde</w:t>
       </w:r>
       <w:r>
         <w:rPr>
@@ -120,7 +142,49 @@
         <w:rPr>
           <w:rFonts w:ascii="Verdana" w:hAnsi="Verdana"/>
         </w:rPr>
-        <w:t>, de esc en de motor. De motors hebben we aangekocht de andere twee waren de bedoeling om zelf te ontwikkelen. Doorheen het semester hebben we bij beide onze problemen gehad. Er is uiteindelijk besloten om voor de herkansing in augustus te gaan voor het werkende krijgen van de flight controller en ook de esc modules aan te kopen. Ondanks dat dit een teleurstelling is zullen we in deze scriptie de esc als module nog wel aanhalen maar de eigen ontwikkeling ervan aan de kant laten.</w:t>
+        <w:t xml:space="preserve">, de </w:t>
+      </w:r>
+      <w:proofErr w:type="spellStart"/>
+      <w:r>
+        <w:rPr>
+          <w:rFonts w:ascii="Verdana" w:hAnsi="Verdana"/>
+        </w:rPr>
+        <w:t>esc</w:t>
+      </w:r>
+      <w:proofErr w:type="spellEnd"/>
+      <w:r>
+        <w:rPr>
+          <w:rFonts w:ascii="Verdana" w:hAnsi="Verdana"/>
+        </w:rPr>
+        <w:t xml:space="preserve"> en de motor. De motors hebben we aangekocht de andere twee waren de bedoeling om zelf te ontwikkelen. Doorheen het semester hebben we bij beide onze problemen gehad. Er is uiteindelijk besloten om voor de herkansing in augustus te gaan voor het werkende krijgen van de flight controller en ook de </w:t>
+      </w:r>
+      <w:proofErr w:type="spellStart"/>
+      <w:r>
+        <w:rPr>
+          <w:rFonts w:ascii="Verdana" w:hAnsi="Verdana"/>
+        </w:rPr>
+        <w:t>esc</w:t>
+      </w:r>
+      <w:proofErr w:type="spellEnd"/>
+      <w:r>
+        <w:rPr>
+          <w:rFonts w:ascii="Verdana" w:hAnsi="Verdana"/>
+        </w:rPr>
+        <w:t xml:space="preserve"> modules aan te kopen. Ondanks dat dit een teleurstelling is zullen we in deze scriptie de </w:t>
+      </w:r>
+      <w:proofErr w:type="spellStart"/>
+      <w:r>
+        <w:rPr>
+          <w:rFonts w:ascii="Verdana" w:hAnsi="Verdana"/>
+        </w:rPr>
+        <w:t>esc</w:t>
+      </w:r>
+      <w:proofErr w:type="spellEnd"/>
+      <w:r>
+        <w:rPr>
+          <w:rFonts w:ascii="Verdana" w:hAnsi="Verdana"/>
+        </w:rPr>
+        <w:t xml:space="preserve"> als module nog wel aanhalen maar de eigen ontwikkeling ervan aan de kant laten.</w:t>
       </w:r>
     </w:p>
     <w:p>
@@ -177,7 +241,14 @@
         <w:rPr>
           <w:rFonts w:ascii="Verdana" w:hAnsi="Verdana"/>
         </w:rPr>
-        <w:t>Om de drone stabiel te houden en beide vliegmod</w:t>
+        <w:t xml:space="preserve">Om de drone stabiel te houden en beide </w:t>
+      </w:r>
+      <w:proofErr w:type="spellStart"/>
+      <w:r>
+        <w:rPr>
+          <w:rFonts w:ascii="Verdana" w:hAnsi="Verdana"/>
+        </w:rPr>
+        <w:t>vliegmod</w:t>
       </w:r>
       <w:r>
         <w:rPr>
@@ -185,6 +256,7 @@
         </w:rPr>
         <w:t>usen</w:t>
       </w:r>
+      <w:proofErr w:type="spellEnd"/>
       <w:r>
         <w:rPr>
           <w:rFonts w:ascii="Verdana" w:hAnsi="Verdana"/>
@@ -239,7 +311,21 @@
         <w:rPr>
           <w:rFonts w:ascii="Verdana" w:hAnsi="Verdana"/>
         </w:rPr>
-        <w:t>BMI330 – IMU met drie accelerometers en drie gyroscopen</w:t>
+        <w:t xml:space="preserve">BMI330 – IMU met drie </w:t>
+      </w:r>
+      <w:proofErr w:type="spellStart"/>
+      <w:r>
+        <w:rPr>
+          <w:rFonts w:ascii="Verdana" w:hAnsi="Verdana"/>
+        </w:rPr>
+        <w:t>accelerometers</w:t>
+      </w:r>
+      <w:proofErr w:type="spellEnd"/>
+      <w:r>
+        <w:rPr>
+          <w:rFonts w:ascii="Verdana" w:hAnsi="Verdana"/>
+        </w:rPr>
+        <w:t xml:space="preserve"> en drie gyroscopen</w:t>
       </w:r>
     </w:p>
     <w:p>
@@ -281,7 +367,21 @@
         <w:rPr>
           <w:rFonts w:ascii="Verdana" w:hAnsi="Verdana"/>
         </w:rPr>
-        <w:t xml:space="preserve">MPU6050 – IMU module drie accelerometers en drie gyroscopen </w:t>
+        <w:t xml:space="preserve">MPU6050 – IMU module drie </w:t>
+      </w:r>
+      <w:proofErr w:type="spellStart"/>
+      <w:r>
+        <w:rPr>
+          <w:rFonts w:ascii="Verdana" w:hAnsi="Verdana"/>
+        </w:rPr>
+        <w:t>accelerometers</w:t>
+      </w:r>
+      <w:proofErr w:type="spellEnd"/>
+      <w:r>
+        <w:rPr>
+          <w:rFonts w:ascii="Verdana" w:hAnsi="Verdana"/>
+        </w:rPr>
+        <w:t xml:space="preserve"> en drie gyroscopen </w:t>
       </w:r>
     </w:p>
     <w:p>
@@ -366,11 +466,19 @@
           <w:rFonts w:ascii="Verdana" w:hAnsi="Verdana"/>
         </w:rPr>
       </w:pPr>
-      <w:r>
-        <w:rPr>
-          <w:rFonts w:ascii="Verdana" w:hAnsi="Verdana"/>
-        </w:rPr>
-        <w:t>MicroSD-kaart voor routegegevens</w:t>
+      <w:proofErr w:type="spellStart"/>
+      <w:r>
+        <w:rPr>
+          <w:rFonts w:ascii="Verdana" w:hAnsi="Verdana"/>
+        </w:rPr>
+        <w:t>MicroSD</w:t>
+      </w:r>
+      <w:proofErr w:type="spellEnd"/>
+      <w:r>
+        <w:rPr>
+          <w:rFonts w:ascii="Verdana" w:hAnsi="Verdana"/>
+        </w:rPr>
+        <w:t>-kaart voor routegegevens</w:t>
       </w:r>
     </w:p>
     <w:p>
@@ -402,7 +510,21 @@
         <w:rPr>
           <w:rFonts w:ascii="Verdana" w:hAnsi="Verdana"/>
         </w:rPr>
-        <w:t>2,4 GHz-transceiver met bijhorende antenne</w:t>
+        <w:t>2,4 GHz-</w:t>
+      </w:r>
+      <w:proofErr w:type="spellStart"/>
+      <w:r>
+        <w:rPr>
+          <w:rFonts w:ascii="Verdana" w:hAnsi="Verdana"/>
+        </w:rPr>
+        <w:t>transceiver</w:t>
+      </w:r>
+      <w:proofErr w:type="spellEnd"/>
+      <w:r>
+        <w:rPr>
+          <w:rFonts w:ascii="Verdana" w:hAnsi="Verdana"/>
+        </w:rPr>
+        <w:t xml:space="preserve"> met bijhorende antenne</w:t>
       </w:r>
     </w:p>
     <w:p>
@@ -421,7 +543,21 @@
         <w:rPr>
           <w:rFonts w:ascii="Verdana" w:hAnsi="Verdana"/>
         </w:rPr>
-        <w:t>Gebruik van enkele sensors nodig voor autnoom vliegen als aanvulling</w:t>
+        <w:t xml:space="preserve">Gebruik van enkele sensors nodig voor </w:t>
+      </w:r>
+      <w:proofErr w:type="spellStart"/>
+      <w:r>
+        <w:rPr>
+          <w:rFonts w:ascii="Verdana" w:hAnsi="Verdana"/>
+        </w:rPr>
+        <w:t>autnoom</w:t>
+      </w:r>
+      <w:proofErr w:type="spellEnd"/>
+      <w:r>
+        <w:rPr>
+          <w:rFonts w:ascii="Verdana" w:hAnsi="Verdana"/>
+        </w:rPr>
+        <w:t xml:space="preserve"> vliegen als aanvulling</w:t>
       </w:r>
     </w:p>
     <w:p>
@@ -646,7 +782,21 @@
         <w:rPr>
           <w:rFonts w:ascii="Verdana" w:hAnsi="Verdana"/>
         </w:rPr>
-        <w:t>: voor positionering is gekozen voor de U-blox DAN-F10N. Deze module beschikt over een geïntegreerde antenne, waardoor geen aparte antenne en RF-ontvanger op de printplaat nodig zijn.</w:t>
+        <w:t>: voor positionering is gekozen voor de U-</w:t>
+      </w:r>
+      <w:proofErr w:type="spellStart"/>
+      <w:r>
+        <w:rPr>
+          <w:rFonts w:ascii="Verdana" w:hAnsi="Verdana"/>
+        </w:rPr>
+        <w:t>blox</w:t>
+      </w:r>
+      <w:proofErr w:type="spellEnd"/>
+      <w:r>
+        <w:rPr>
+          <w:rFonts w:ascii="Verdana" w:hAnsi="Verdana"/>
+        </w:rPr>
+        <w:t xml:space="preserve"> DAN-F10N. Deze module beschikt over een geïntegreerde antenne, waardoor geen aparte antenne en RF-ontvanger op de printplaat nodig zijn.</w:t>
       </w:r>
       <w:r>
         <w:rPr>
@@ -696,7 +846,21 @@
         <w:rPr>
           <w:rFonts w:ascii="Verdana" w:hAnsi="Verdana"/>
         </w:rPr>
-        <w:t>-chip toegepast. Deze chip ondersteunt het ExpressLRS-protocol (ELRS</w:t>
+        <w:t xml:space="preserve">-chip toegepast. Deze chip ondersteunt het </w:t>
+      </w:r>
+      <w:proofErr w:type="spellStart"/>
+      <w:r>
+        <w:rPr>
+          <w:rFonts w:ascii="Verdana" w:hAnsi="Verdana"/>
+        </w:rPr>
+        <w:t>ExpressLRS</w:t>
+      </w:r>
+      <w:proofErr w:type="spellEnd"/>
+      <w:r>
+        <w:rPr>
+          <w:rFonts w:ascii="Verdana" w:hAnsi="Verdana"/>
+        </w:rPr>
+        <w:t>-protocol (ELRS</w:t>
       </w:r>
       <w:r>
         <w:rPr>
@@ -771,6 +935,7 @@
       <w:r>
         <w:rPr>
           <w:rFonts w:ascii="Verdana" w:hAnsi="Verdana"/>
+          <w:noProof/>
           <w:color w:val="auto"/>
           <w:sz w:val="20"/>
           <w:szCs w:val="20"/>
@@ -841,16 +1006,96 @@
           <w:sz w:val="20"/>
           <w:szCs w:val="20"/>
         </w:rPr>
-        <w:t xml:space="preserve">moesten we rekening houden met enkele dingen. De belangrijkste waren de AAD (average amp Draw), </w:t>
-      </w:r>
-      <w:r>
-        <w:rPr>
-          <w:rFonts w:ascii="Verdana" w:hAnsi="Verdana"/>
-          <w:color w:val="auto"/>
-          <w:sz w:val="20"/>
-          <w:szCs w:val="20"/>
-        </w:rPr>
-        <w:t xml:space="preserve">AUW (all up weight) en de tijd. De tijd was natuurlijk flexibel maar het mag ook niet te kort zijn want we wouden wel een </w:t>
+        <w:t>moesten we rekening houden met enkele dingen. De belangrijkste waren de AAD (</w:t>
+      </w:r>
+      <w:proofErr w:type="spellStart"/>
+      <w:r>
+        <w:rPr>
+          <w:rFonts w:ascii="Verdana" w:hAnsi="Verdana"/>
+          <w:color w:val="auto"/>
+          <w:sz w:val="20"/>
+          <w:szCs w:val="20"/>
+        </w:rPr>
+        <w:t>average</w:t>
+      </w:r>
+      <w:proofErr w:type="spellEnd"/>
+      <w:r>
+        <w:rPr>
+          <w:rFonts w:ascii="Verdana" w:hAnsi="Verdana"/>
+          <w:color w:val="auto"/>
+          <w:sz w:val="20"/>
+          <w:szCs w:val="20"/>
+        </w:rPr>
+        <w:t xml:space="preserve"> </w:t>
+      </w:r>
+      <w:proofErr w:type="spellStart"/>
+      <w:r>
+        <w:rPr>
+          <w:rFonts w:ascii="Verdana" w:hAnsi="Verdana"/>
+          <w:color w:val="auto"/>
+          <w:sz w:val="20"/>
+          <w:szCs w:val="20"/>
+        </w:rPr>
+        <w:t>amp</w:t>
+      </w:r>
+      <w:proofErr w:type="spellEnd"/>
+      <w:r>
+        <w:rPr>
+          <w:rFonts w:ascii="Verdana" w:hAnsi="Verdana"/>
+          <w:color w:val="auto"/>
+          <w:sz w:val="20"/>
+          <w:szCs w:val="20"/>
+        </w:rPr>
+        <w:t xml:space="preserve"> Draw), </w:t>
+      </w:r>
+      <w:r>
+        <w:rPr>
+          <w:rFonts w:ascii="Verdana" w:hAnsi="Verdana"/>
+          <w:color w:val="auto"/>
+          <w:sz w:val="20"/>
+          <w:szCs w:val="20"/>
+        </w:rPr>
+        <w:t>AUW (</w:t>
+      </w:r>
+      <w:proofErr w:type="spellStart"/>
+      <w:r>
+        <w:rPr>
+          <w:rFonts w:ascii="Verdana" w:hAnsi="Verdana"/>
+          <w:color w:val="auto"/>
+          <w:sz w:val="20"/>
+          <w:szCs w:val="20"/>
+        </w:rPr>
+        <w:t>all</w:t>
+      </w:r>
+      <w:proofErr w:type="spellEnd"/>
+      <w:r>
+        <w:rPr>
+          <w:rFonts w:ascii="Verdana" w:hAnsi="Verdana"/>
+          <w:color w:val="auto"/>
+          <w:sz w:val="20"/>
+          <w:szCs w:val="20"/>
+        </w:rPr>
+        <w:t xml:space="preserve"> up </w:t>
+      </w:r>
+      <w:proofErr w:type="spellStart"/>
+      <w:r>
+        <w:rPr>
+          <w:rFonts w:ascii="Verdana" w:hAnsi="Verdana"/>
+          <w:color w:val="auto"/>
+          <w:sz w:val="20"/>
+          <w:szCs w:val="20"/>
+        </w:rPr>
+        <w:t>weight</w:t>
+      </w:r>
+      <w:proofErr w:type="spellEnd"/>
+      <w:r>
+        <w:rPr>
+          <w:rFonts w:ascii="Verdana" w:hAnsi="Verdana"/>
+          <w:color w:val="auto"/>
+          <w:sz w:val="20"/>
+          <w:szCs w:val="20"/>
+        </w:rPr>
+        <w:t xml:space="preserve">) en de tijd. De tijd was natuurlijk flexibel maar het mag ook niet te kort zijn want we wouden wel een </w:t>
       </w:r>
       <w:r>
         <w:rPr>
@@ -949,7 +1194,27 @@
           <w:sz w:val="20"/>
           <w:szCs w:val="20"/>
         </w:rPr>
-        <w:t>ongeveer 15 volt kwam waardoor we op een 4s LIPo batterij kwamen.</w:t>
+        <w:t xml:space="preserve">ongeveer 15 volt kwam waardoor we op een 4s </w:t>
+      </w:r>
+      <w:proofErr w:type="spellStart"/>
+      <w:r>
+        <w:rPr>
+          <w:rFonts w:ascii="Verdana" w:hAnsi="Verdana"/>
+          <w:color w:val="auto"/>
+          <w:sz w:val="20"/>
+          <w:szCs w:val="20"/>
+        </w:rPr>
+        <w:t>LIPo</w:t>
+      </w:r>
+      <w:proofErr w:type="spellEnd"/>
+      <w:r>
+        <w:rPr>
+          <w:rFonts w:ascii="Verdana" w:hAnsi="Verdana"/>
+          <w:color w:val="auto"/>
+          <w:sz w:val="20"/>
+          <w:szCs w:val="20"/>
+        </w:rPr>
+        <w:t xml:space="preserve"> batterij kwamen.</w:t>
       </w:r>
       <w:r>
         <w:rPr>
@@ -1011,25 +1276,27 @@
           <w:sz w:val="20"/>
           <w:szCs w:val="20"/>
         </w:rPr>
-        <w:t>De KV-waarde van een b</w:t>
-      </w:r>
-      <w:r>
-        <w:rPr>
-          <w:rFonts w:ascii="Verdana" w:hAnsi="Verdana"/>
-          <w:color w:val="auto"/>
-          <w:sz w:val="20"/>
-          <w:szCs w:val="20"/>
-        </w:rPr>
-        <w:t xml:space="preserve">rushless dc </w:t>
-      </w:r>
-      <w:r>
-        <w:rPr>
-          <w:rFonts w:ascii="Verdana" w:hAnsi="Verdana"/>
-          <w:color w:val="auto"/>
-          <w:sz w:val="20"/>
-          <w:szCs w:val="20"/>
-        </w:rPr>
-        <w:t>motor (uitgedrukt in RPM/volt) geeft aan hoeveel toeren per minuut de motor onbelast draait per volt aangelegde spanning. Deze waarde is een directe ontwerpparameter: ze bepaalt in grote mate of een motor geschikt is voor snelle, wendbare toepassingen dan wel voor toepassingen met veel stuwkracht bij lagere toerentallen.</w:t>
+        <w:t xml:space="preserve">De KV-waarde van een </w:t>
+      </w:r>
+      <w:proofErr w:type="spellStart"/>
+      <w:r>
+        <w:rPr>
+          <w:rFonts w:ascii="Verdana" w:hAnsi="Verdana"/>
+          <w:color w:val="auto"/>
+          <w:sz w:val="20"/>
+          <w:szCs w:val="20"/>
+        </w:rPr>
+        <w:t>brushless</w:t>
+      </w:r>
+      <w:proofErr w:type="spellEnd"/>
+      <w:r>
+        <w:rPr>
+          <w:rFonts w:ascii="Verdana" w:hAnsi="Verdana"/>
+          <w:color w:val="auto"/>
+          <w:sz w:val="20"/>
+          <w:szCs w:val="20"/>
+        </w:rPr>
+        <w:t xml:space="preserve"> dc motor (uitgedrukt in RPM/volt) geeft aan hoeveel toeren per minuut de motor onbelast draait per volt aangelegde spanning. Deze waarde is een directe ontwerpparameter: ze bepaalt in grote mate of een motor geschikt is voor snelle, wendbare toepassingen dan wel voor toepassingen met veel stuwkracht bij lagere toerentallen.</w:t>
       </w:r>
     </w:p>
     <w:p>
@@ -1050,34 +1317,134 @@
           <w:sz w:val="20"/>
           <w:szCs w:val="20"/>
         </w:rPr>
-        <w:t xml:space="preserve">Onze kv waarde werd dus berekend met de door de batterij geleverde spanning, nominaal 14.8v. </w:t>
-      </w:r>
-      <w:r>
-        <w:rPr>
-          <w:rFonts w:ascii="Verdana" w:hAnsi="Verdana"/>
-          <w:color w:val="auto"/>
-          <w:sz w:val="20"/>
-          <w:szCs w:val="20"/>
-        </w:rPr>
-        <w:t xml:space="preserve">De vraag was nu hoeveel RPM we nodig hadden. Hier is de grote en hoeveelheid spaken van de propollors ook van belang. </w:t>
-      </w:r>
-      <w:r>
-        <w:rPr>
-          <w:rFonts w:ascii="Verdana" w:hAnsi="Verdana"/>
-          <w:color w:val="auto"/>
-          <w:sz w:val="20"/>
-          <w:szCs w:val="20"/>
-        </w:rPr>
-        <w:t xml:space="preserve">Uiteindelijk is het geen exacte wetenschap met 1 exact antwoord. Maar aangeizen kleine propellors met hoog toerental vooral nodig is voor pure snelheid en het omgekeerde voor stabiele vlucht hebben we gekozen voor een middenweg. </w:t>
-      </w:r>
-      <w:r>
-        <w:rPr>
-          <w:rFonts w:ascii="Verdana" w:hAnsi="Verdana"/>
-          <w:color w:val="auto"/>
-          <w:sz w:val="20"/>
-          <w:szCs w:val="20"/>
-        </w:rPr>
-        <w:t xml:space="preserve"> We hebben uiteinlijk motors van</w:t>
+        <w:t xml:space="preserve">Onze </w:t>
+      </w:r>
+      <w:proofErr w:type="spellStart"/>
+      <w:r>
+        <w:rPr>
+          <w:rFonts w:ascii="Verdana" w:hAnsi="Verdana"/>
+          <w:color w:val="auto"/>
+          <w:sz w:val="20"/>
+          <w:szCs w:val="20"/>
+        </w:rPr>
+        <w:t>kv</w:t>
+      </w:r>
+      <w:proofErr w:type="spellEnd"/>
+      <w:r>
+        <w:rPr>
+          <w:rFonts w:ascii="Verdana" w:hAnsi="Verdana"/>
+          <w:color w:val="auto"/>
+          <w:sz w:val="20"/>
+          <w:szCs w:val="20"/>
+        </w:rPr>
+        <w:t xml:space="preserve"> waarde werd dus berekend met de door de batterij geleverde spanning, nominaal 14.8v. </w:t>
+      </w:r>
+      <w:r>
+        <w:rPr>
+          <w:rFonts w:ascii="Verdana" w:hAnsi="Verdana"/>
+          <w:color w:val="auto"/>
+          <w:sz w:val="20"/>
+          <w:szCs w:val="20"/>
+        </w:rPr>
+        <w:t xml:space="preserve">De vraag was nu hoeveel RPM we nodig hadden. Hier is de grote en hoeveelheid spaken van de </w:t>
+      </w:r>
+      <w:proofErr w:type="spellStart"/>
+      <w:r>
+        <w:rPr>
+          <w:rFonts w:ascii="Verdana" w:hAnsi="Verdana"/>
+          <w:color w:val="auto"/>
+          <w:sz w:val="20"/>
+          <w:szCs w:val="20"/>
+        </w:rPr>
+        <w:t>propollors</w:t>
+      </w:r>
+      <w:proofErr w:type="spellEnd"/>
+      <w:r>
+        <w:rPr>
+          <w:rFonts w:ascii="Verdana" w:hAnsi="Verdana"/>
+          <w:color w:val="auto"/>
+          <w:sz w:val="20"/>
+          <w:szCs w:val="20"/>
+        </w:rPr>
+        <w:t xml:space="preserve"> ook van belang. </w:t>
+      </w:r>
+      <w:r>
+        <w:rPr>
+          <w:rFonts w:ascii="Verdana" w:hAnsi="Verdana"/>
+          <w:color w:val="auto"/>
+          <w:sz w:val="20"/>
+          <w:szCs w:val="20"/>
+        </w:rPr>
+        <w:t xml:space="preserve">Uiteindelijk is het geen exacte wetenschap met 1 exact antwoord. Maar </w:t>
+      </w:r>
+      <w:proofErr w:type="spellStart"/>
+      <w:r>
+        <w:rPr>
+          <w:rFonts w:ascii="Verdana" w:hAnsi="Verdana"/>
+          <w:color w:val="auto"/>
+          <w:sz w:val="20"/>
+          <w:szCs w:val="20"/>
+        </w:rPr>
+        <w:t>aangeizen</w:t>
+      </w:r>
+      <w:proofErr w:type="spellEnd"/>
+      <w:r>
+        <w:rPr>
+          <w:rFonts w:ascii="Verdana" w:hAnsi="Verdana"/>
+          <w:color w:val="auto"/>
+          <w:sz w:val="20"/>
+          <w:szCs w:val="20"/>
+        </w:rPr>
+        <w:t xml:space="preserve"> kleine </w:t>
+      </w:r>
+      <w:proofErr w:type="spellStart"/>
+      <w:r>
+        <w:rPr>
+          <w:rFonts w:ascii="Verdana" w:hAnsi="Verdana"/>
+          <w:color w:val="auto"/>
+          <w:sz w:val="20"/>
+          <w:szCs w:val="20"/>
+        </w:rPr>
+        <w:t>propellors</w:t>
+      </w:r>
+      <w:proofErr w:type="spellEnd"/>
+      <w:r>
+        <w:rPr>
+          <w:rFonts w:ascii="Verdana" w:hAnsi="Verdana"/>
+          <w:color w:val="auto"/>
+          <w:sz w:val="20"/>
+          <w:szCs w:val="20"/>
+        </w:rPr>
+        <w:t xml:space="preserve"> met hoog toerental vooral nodig is voor pure snelheid en het omgekeerde voor stabiele vlucht hebben we gekozen voor een middenweg. </w:t>
+      </w:r>
+      <w:r>
+        <w:rPr>
+          <w:rFonts w:ascii="Verdana" w:hAnsi="Verdana"/>
+          <w:color w:val="auto"/>
+          <w:sz w:val="20"/>
+          <w:szCs w:val="20"/>
+        </w:rPr>
+        <w:t xml:space="preserve"> We hebben </w:t>
+      </w:r>
+      <w:proofErr w:type="spellStart"/>
+      <w:r>
+        <w:rPr>
+          <w:rFonts w:ascii="Verdana" w:hAnsi="Verdana"/>
+          <w:color w:val="auto"/>
+          <w:sz w:val="20"/>
+          <w:szCs w:val="20"/>
+        </w:rPr>
+        <w:t>uiteinlijk</w:t>
+      </w:r>
+      <w:proofErr w:type="spellEnd"/>
+      <w:r>
+        <w:rPr>
+          <w:rFonts w:ascii="Verdana" w:hAnsi="Verdana"/>
+          <w:color w:val="auto"/>
+          <w:sz w:val="20"/>
+          <w:szCs w:val="20"/>
+        </w:rPr>
+        <w:t xml:space="preserve"> motors van</w:t>
       </w:r>
       <w:r>
         <w:rPr>
@@ -1105,7 +1472,47 @@
           <w:sz w:val="20"/>
           <w:szCs w:val="20"/>
         </w:rPr>
-        <w:t xml:space="preserve"> gekocht en 3 spakige propellors.</w:t>
+        <w:t xml:space="preserve"> gekocht en 3 </w:t>
+      </w:r>
+      <w:proofErr w:type="spellStart"/>
+      <w:r>
+        <w:rPr>
+          <w:rFonts w:ascii="Verdana" w:hAnsi="Verdana"/>
+          <w:color w:val="auto"/>
+          <w:sz w:val="20"/>
+          <w:szCs w:val="20"/>
+        </w:rPr>
+        <w:t>spakige</w:t>
+      </w:r>
+      <w:proofErr w:type="spellEnd"/>
+      <w:r>
+        <w:rPr>
+          <w:rFonts w:ascii="Verdana" w:hAnsi="Verdana"/>
+          <w:color w:val="auto"/>
+          <w:sz w:val="20"/>
+          <w:szCs w:val="20"/>
+        </w:rPr>
+        <w:t xml:space="preserve"> </w:t>
+      </w:r>
+      <w:proofErr w:type="spellStart"/>
+      <w:r>
+        <w:rPr>
+          <w:rFonts w:ascii="Verdana" w:hAnsi="Verdana"/>
+          <w:color w:val="auto"/>
+          <w:sz w:val="20"/>
+          <w:szCs w:val="20"/>
+        </w:rPr>
+        <w:t>propellors</w:t>
+      </w:r>
+      <w:proofErr w:type="spellEnd"/>
+      <w:r>
+        <w:rPr>
+          <w:rFonts w:ascii="Verdana" w:hAnsi="Verdana"/>
+          <w:color w:val="auto"/>
+          <w:sz w:val="20"/>
+          <w:szCs w:val="20"/>
+        </w:rPr>
+        <w:t>.</w:t>
       </w:r>
     </w:p>
     <w:p>
@@ -1141,26 +1548,154 @@
           <w:sz w:val="20"/>
           <w:szCs w:val="20"/>
         </w:rPr>
-        <w:t xml:space="preserve">Zoals eerder vermeld was het oorspronkelijk de bedoeling om onze eigen ESC’s te ontwikkelen. Jammer genoeg is dat niet geluk. Hoewel het aangetoond is dat het kan werken (enkele seconden) is het niet gelukt om dit consistent te laten draaien doordat we de interne buck converter van de </w:t>
-      </w:r>
-      <w:r>
-        <w:rPr>
-          <w:rFonts w:ascii="Verdana" w:hAnsi="Verdana"/>
-          <w:color w:val="auto"/>
-          <w:sz w:val="20"/>
-          <w:szCs w:val="20"/>
-        </w:rPr>
-        <w:t>stspin32f0a niet aan de praat kregen. Hierdoor is gekozen om ons in de herexamen te focussen op de flight controller. We zijn dan voor esc modules van ali</w:t>
-      </w:r>
-      <w:r>
-        <w:rPr>
-          <w:rFonts w:ascii="Verdana" w:hAnsi="Verdana"/>
-          <w:color w:val="auto"/>
-          <w:sz w:val="20"/>
-          <w:szCs w:val="20"/>
-        </w:rPr>
-        <w:t>express gegaan.</w:t>
-      </w:r>
+        <w:t xml:space="preserve">Zoals eerder vermeld was het oorspronkelijk de bedoeling om onze eigen </w:t>
+      </w:r>
+      <w:proofErr w:type="spellStart"/>
+      <w:r>
+        <w:rPr>
+          <w:rFonts w:ascii="Verdana" w:hAnsi="Verdana"/>
+          <w:color w:val="auto"/>
+          <w:sz w:val="20"/>
+          <w:szCs w:val="20"/>
+        </w:rPr>
+        <w:t>ESC’s</w:t>
+      </w:r>
+      <w:proofErr w:type="spellEnd"/>
+      <w:r>
+        <w:rPr>
+          <w:rFonts w:ascii="Verdana" w:hAnsi="Verdana"/>
+          <w:color w:val="auto"/>
+          <w:sz w:val="20"/>
+          <w:szCs w:val="20"/>
+        </w:rPr>
+        <w:t xml:space="preserve"> te ontwikkelen. Jammer genoeg is dat niet geluk. Hoewel het aangetoond is dat het kan werken (enkele seconden) is het niet gelukt om dit consistent te laten draaien doordat we de interne </w:t>
+      </w:r>
+      <w:proofErr w:type="spellStart"/>
+      <w:r>
+        <w:rPr>
+          <w:rFonts w:ascii="Verdana" w:hAnsi="Verdana"/>
+          <w:color w:val="auto"/>
+          <w:sz w:val="20"/>
+          <w:szCs w:val="20"/>
+        </w:rPr>
+        <w:t>buck</w:t>
+      </w:r>
+      <w:proofErr w:type="spellEnd"/>
+      <w:r>
+        <w:rPr>
+          <w:rFonts w:ascii="Verdana" w:hAnsi="Verdana"/>
+          <w:color w:val="auto"/>
+          <w:sz w:val="20"/>
+          <w:szCs w:val="20"/>
+        </w:rPr>
+        <w:t xml:space="preserve"> converter van de </w:t>
+      </w:r>
+      <w:r>
+        <w:rPr>
+          <w:rFonts w:ascii="Verdana" w:hAnsi="Verdana"/>
+          <w:color w:val="auto"/>
+          <w:sz w:val="20"/>
+          <w:szCs w:val="20"/>
+        </w:rPr>
+        <w:t xml:space="preserve">stspin32f0a niet aan de praat kregen. Hierdoor is gekozen om ons in de herexamen te focussen op de flight controller. We zijn dan voor </w:t>
+      </w:r>
+      <w:proofErr w:type="spellStart"/>
+      <w:r>
+        <w:rPr>
+          <w:rFonts w:ascii="Verdana" w:hAnsi="Verdana"/>
+          <w:color w:val="auto"/>
+          <w:sz w:val="20"/>
+          <w:szCs w:val="20"/>
+        </w:rPr>
+        <w:t>esc</w:t>
+      </w:r>
+      <w:proofErr w:type="spellEnd"/>
+      <w:r>
+        <w:rPr>
+          <w:rFonts w:ascii="Verdana" w:hAnsi="Verdana"/>
+          <w:color w:val="auto"/>
+          <w:sz w:val="20"/>
+          <w:szCs w:val="20"/>
+        </w:rPr>
+        <w:t xml:space="preserve"> modules van </w:t>
+      </w:r>
+      <w:proofErr w:type="spellStart"/>
+      <w:r>
+        <w:rPr>
+          <w:rFonts w:ascii="Verdana" w:hAnsi="Verdana"/>
+          <w:color w:val="auto"/>
+          <w:sz w:val="20"/>
+          <w:szCs w:val="20"/>
+        </w:rPr>
+        <w:t>ali</w:t>
+      </w:r>
+      <w:r>
+        <w:rPr>
+          <w:rFonts w:ascii="Verdana" w:hAnsi="Verdana"/>
+          <w:color w:val="auto"/>
+          <w:sz w:val="20"/>
+          <w:szCs w:val="20"/>
+        </w:rPr>
+        <w:t>express</w:t>
+      </w:r>
+      <w:proofErr w:type="spellEnd"/>
+      <w:r>
+        <w:rPr>
+          <w:rFonts w:ascii="Verdana" w:hAnsi="Verdana"/>
+          <w:color w:val="auto"/>
+          <w:sz w:val="20"/>
+          <w:szCs w:val="20"/>
+        </w:rPr>
+        <w:t xml:space="preserve"> gegaan.</w:t>
+      </w:r>
+    </w:p>
+    <w:p>
+      <w:pPr>
+        <w:pStyle w:val="Kop2"/>
+        <w:spacing w:before="300" w:after="150"/>
+        <w:rPr>
+          <w:rFonts w:ascii="Verdana" w:hAnsi="Verdana"/>
+          <w:color w:val="auto"/>
+          <w:sz w:val="20"/>
+          <w:szCs w:val="20"/>
+        </w:rPr>
+      </w:pPr>
+    </w:p>
+    <w:p>
+      <w:pPr>
+        <w:pStyle w:val="Kop2"/>
+        <w:spacing w:before="300" w:after="150"/>
+        <w:rPr>
+          <w:rFonts w:ascii="Verdana" w:hAnsi="Verdana"/>
+          <w:color w:val="auto"/>
+          <w:sz w:val="20"/>
+          <w:szCs w:val="20"/>
+        </w:rPr>
+      </w:pPr>
+    </w:p>
+    <w:p>
+      <w:pPr>
+        <w:pStyle w:val="Kop2"/>
+        <w:spacing w:before="300" w:after="150"/>
+        <w:rPr>
+          <w:rFonts w:ascii="Verdana" w:hAnsi="Verdana"/>
+          <w:color w:val="auto"/>
+          <w:sz w:val="20"/>
+          <w:szCs w:val="20"/>
+        </w:rPr>
+      </w:pPr>
+    </w:p>
+    <w:p>
+      <w:pPr>
+        <w:pStyle w:val="Kop2"/>
+        <w:spacing w:before="300" w:after="150"/>
+        <w:rPr>
+          <w:rFonts w:ascii="Verdana" w:hAnsi="Verdana"/>
+          <w:color w:val="auto"/>
+          <w:sz w:val="20"/>
+          <w:szCs w:val="20"/>
+        </w:rPr>
+      </w:pPr>
     </w:p>
     <w:p>
       <w:pPr>
@@ -1168,6 +1703,7 @@
         <w:spacing w:before="400" w:after="200"/>
       </w:pPr>
       <w:r>
+        <w:lastRenderedPageBreak/>
         <w:t xml:space="preserve">4. </w:t>
       </w:r>
       <w:r>
@@ -1215,11 +1751,11 @@
       <w:r>
         <w:rPr>
           <w:rFonts w:ascii="Verdana" w:hAnsi="Verdana"/>
-          <w:color w:val="auto"/>
-          <w:sz w:val="20"/>
-          <w:szCs w:val="20"/>
-        </w:rPr>
-        <w:lastRenderedPageBreak/>
+          <w:noProof/>
+          <w:color w:val="auto"/>
+          <w:sz w:val="20"/>
+          <w:szCs w:val="20"/>
+        </w:rPr>
         <w:drawing>
           <wp:anchor distT="0" distB="0" distL="114300" distR="114300" simplePos="0" relativeHeight="251658240" behindDoc="1" locked="0" layoutInCell="1" allowOverlap="1" wp14:anchorId="72992E55" wp14:editId="131C12DF">
             <wp:simplePos x="0" y="0"/>
@@ -1304,16 +1840,56 @@
           <w:sz w:val="20"/>
           <w:szCs w:val="20"/>
         </w:rPr>
-        <w:t xml:space="preserve">. De eerste en belangrijkste reden was om verschillende powerplanes te hebben er loopt namelijk heel wat stroom </w:t>
-      </w:r>
-      <w:r>
-        <w:rPr>
-          <w:rFonts w:ascii="Verdana" w:hAnsi="Verdana"/>
-          <w:color w:val="auto"/>
-          <w:sz w:val="20"/>
-          <w:szCs w:val="20"/>
-        </w:rPr>
-        <w:t xml:space="preserve">door de flight controller aangezien de esc’s ook gevoed worden vanop de FC. Het maakte het ook mogelijk </w:t>
+        <w:t xml:space="preserve">. De eerste en belangrijkste reden was om verschillende </w:t>
+      </w:r>
+      <w:proofErr w:type="spellStart"/>
+      <w:r>
+        <w:rPr>
+          <w:rFonts w:ascii="Verdana" w:hAnsi="Verdana"/>
+          <w:color w:val="auto"/>
+          <w:sz w:val="20"/>
+          <w:szCs w:val="20"/>
+        </w:rPr>
+        <w:t>powerplanes</w:t>
+      </w:r>
+      <w:proofErr w:type="spellEnd"/>
+      <w:r>
+        <w:rPr>
+          <w:rFonts w:ascii="Verdana" w:hAnsi="Verdana"/>
+          <w:color w:val="auto"/>
+          <w:sz w:val="20"/>
+          <w:szCs w:val="20"/>
+        </w:rPr>
+        <w:t xml:space="preserve"> te hebben er loopt namelijk heel wat stroom </w:t>
+      </w:r>
+      <w:r>
+        <w:rPr>
+          <w:rFonts w:ascii="Verdana" w:hAnsi="Verdana"/>
+          <w:color w:val="auto"/>
+          <w:sz w:val="20"/>
+          <w:szCs w:val="20"/>
+        </w:rPr>
+        <w:t xml:space="preserve">door de flight controller aangezien de </w:t>
+      </w:r>
+      <w:proofErr w:type="spellStart"/>
+      <w:r>
+        <w:rPr>
+          <w:rFonts w:ascii="Verdana" w:hAnsi="Verdana"/>
+          <w:color w:val="auto"/>
+          <w:sz w:val="20"/>
+          <w:szCs w:val="20"/>
+        </w:rPr>
+        <w:t>esc’s</w:t>
+      </w:r>
+      <w:proofErr w:type="spellEnd"/>
+      <w:r>
+        <w:rPr>
+          <w:rFonts w:ascii="Verdana" w:hAnsi="Verdana"/>
+          <w:color w:val="auto"/>
+          <w:sz w:val="20"/>
+          <w:szCs w:val="20"/>
+        </w:rPr>
+        <w:t xml:space="preserve"> ook gevoed worden vanop de FC. Het maakte het ook mogelijk </w:t>
       </w:r>
       <w:r>
         <w:rPr>
@@ -1350,7 +1926,27 @@
           <w:sz w:val="20"/>
           <w:szCs w:val="20"/>
         </w:rPr>
-        <w:t xml:space="preserve"> is een voorbeeld van 1 van de planes.</w:t>
+        <w:t xml:space="preserve"> is een voorbeeld van 1 van de </w:t>
+      </w:r>
+      <w:proofErr w:type="spellStart"/>
+      <w:r>
+        <w:rPr>
+          <w:rFonts w:ascii="Verdana" w:hAnsi="Verdana"/>
+          <w:color w:val="auto"/>
+          <w:sz w:val="20"/>
+          <w:szCs w:val="20"/>
+        </w:rPr>
+        <w:t>planes</w:t>
+      </w:r>
+      <w:proofErr w:type="spellEnd"/>
+      <w:r>
+        <w:rPr>
+          <w:rFonts w:ascii="Verdana" w:hAnsi="Verdana"/>
+          <w:color w:val="auto"/>
+          <w:sz w:val="20"/>
+          <w:szCs w:val="20"/>
+        </w:rPr>
+        <w:t>.</w:t>
       </w:r>
     </w:p>
     <w:p>
@@ -1427,25 +2023,96 @@
           <w:sz w:val="20"/>
           <w:szCs w:val="20"/>
         </w:rPr>
-        <w:t xml:space="preserve"> 2 een twee traps </w:t>
-      </w:r>
-      <w:r>
-        <w:rPr>
-          <w:rFonts w:ascii="Verdana" w:hAnsi="Verdana"/>
-          <w:color w:val="auto"/>
-          <w:sz w:val="20"/>
-          <w:szCs w:val="20"/>
-        </w:rPr>
-        <w:t>voeding keten. De eerste trap gaan we van de batterij spanning naar de 3.3volt voedingspanning voor het over grote deel van onze fc</w:t>
-      </w:r>
-      <w:r>
-        <w:rPr>
-          <w:rFonts w:ascii="Verdana" w:hAnsi="Verdana"/>
-          <w:color w:val="auto"/>
-          <w:sz w:val="20"/>
-          <w:szCs w:val="20"/>
-        </w:rPr>
-        <w:t>. De esc’s worden hier trouwens niet aan verbonden dit gebeurd via de fc maar is wel op de batterij spanning.</w:t>
+        <w:t xml:space="preserve"> 2 een twee </w:t>
+      </w:r>
+      <w:proofErr w:type="spellStart"/>
+      <w:r>
+        <w:rPr>
+          <w:rFonts w:ascii="Verdana" w:hAnsi="Verdana"/>
+          <w:color w:val="auto"/>
+          <w:sz w:val="20"/>
+          <w:szCs w:val="20"/>
+        </w:rPr>
+        <w:t>traps</w:t>
+      </w:r>
+      <w:proofErr w:type="spellEnd"/>
+      <w:r>
+        <w:rPr>
+          <w:rFonts w:ascii="Verdana" w:hAnsi="Verdana"/>
+          <w:color w:val="auto"/>
+          <w:sz w:val="20"/>
+          <w:szCs w:val="20"/>
+        </w:rPr>
+        <w:t xml:space="preserve"> </w:t>
+      </w:r>
+      <w:r>
+        <w:rPr>
+          <w:rFonts w:ascii="Verdana" w:hAnsi="Verdana"/>
+          <w:color w:val="auto"/>
+          <w:sz w:val="20"/>
+          <w:szCs w:val="20"/>
+        </w:rPr>
+        <w:t xml:space="preserve">voeding keten. De eerste trap gaan we van de batterij spanning naar de 3.3volt voedingspanning voor het over grote deel van onze </w:t>
+      </w:r>
+      <w:proofErr w:type="spellStart"/>
+      <w:r>
+        <w:rPr>
+          <w:rFonts w:ascii="Verdana" w:hAnsi="Verdana"/>
+          <w:color w:val="auto"/>
+          <w:sz w:val="20"/>
+          <w:szCs w:val="20"/>
+        </w:rPr>
+        <w:t>fc</w:t>
+      </w:r>
+      <w:proofErr w:type="spellEnd"/>
+      <w:r>
+        <w:rPr>
+          <w:rFonts w:ascii="Verdana" w:hAnsi="Verdana"/>
+          <w:color w:val="auto"/>
+          <w:sz w:val="20"/>
+          <w:szCs w:val="20"/>
+        </w:rPr>
+        <w:t xml:space="preserve">. De </w:t>
+      </w:r>
+      <w:proofErr w:type="spellStart"/>
+      <w:r>
+        <w:rPr>
+          <w:rFonts w:ascii="Verdana" w:hAnsi="Verdana"/>
+          <w:color w:val="auto"/>
+          <w:sz w:val="20"/>
+          <w:szCs w:val="20"/>
+        </w:rPr>
+        <w:t>esc’s</w:t>
+      </w:r>
+      <w:proofErr w:type="spellEnd"/>
+      <w:r>
+        <w:rPr>
+          <w:rFonts w:ascii="Verdana" w:hAnsi="Verdana"/>
+          <w:color w:val="auto"/>
+          <w:sz w:val="20"/>
+          <w:szCs w:val="20"/>
+        </w:rPr>
+        <w:t xml:space="preserve"> worden hier trouwens niet aan verbonden dit gebeurd via de </w:t>
+      </w:r>
+      <w:proofErr w:type="spellStart"/>
+      <w:r>
+        <w:rPr>
+          <w:rFonts w:ascii="Verdana" w:hAnsi="Verdana"/>
+          <w:color w:val="auto"/>
+          <w:sz w:val="20"/>
+          <w:szCs w:val="20"/>
+        </w:rPr>
+        <w:t>fc</w:t>
+      </w:r>
+      <w:proofErr w:type="spellEnd"/>
+      <w:r>
+        <w:rPr>
+          <w:rFonts w:ascii="Verdana" w:hAnsi="Verdana"/>
+          <w:color w:val="auto"/>
+          <w:sz w:val="20"/>
+          <w:szCs w:val="20"/>
+        </w:rPr>
+        <w:t xml:space="preserve"> maar is wel op de batterij spanning.</w:t>
       </w:r>
       <w:r>
         <w:rPr>
@@ -1535,7 +2202,27 @@
           <w:sz w:val="20"/>
           <w:szCs w:val="20"/>
         </w:rPr>
-        <w:t>de effectieve buck converter</w:t>
+        <w:t xml:space="preserve">de effectieve </w:t>
+      </w:r>
+      <w:proofErr w:type="spellStart"/>
+      <w:r>
+        <w:rPr>
+          <w:rFonts w:ascii="Verdana" w:hAnsi="Verdana"/>
+          <w:color w:val="auto"/>
+          <w:sz w:val="20"/>
+          <w:szCs w:val="20"/>
+        </w:rPr>
+        <w:t>buck</w:t>
+      </w:r>
+      <w:proofErr w:type="spellEnd"/>
+      <w:r>
+        <w:rPr>
+          <w:rFonts w:ascii="Verdana" w:hAnsi="Verdana"/>
+          <w:color w:val="auto"/>
+          <w:sz w:val="20"/>
+          <w:szCs w:val="20"/>
+        </w:rPr>
+        <w:t xml:space="preserve"> converter</w:t>
       </w:r>
       <w:r>
         <w:rPr>
@@ -1598,7 +2285,27 @@
           <w:sz w:val="20"/>
           <w:szCs w:val="20"/>
         </w:rPr>
-        <w:t xml:space="preserve"> gaat door een pwm signaal aan de </w:t>
+        <w:t xml:space="preserve"> gaat door een </w:t>
+      </w:r>
+      <w:proofErr w:type="spellStart"/>
+      <w:r>
+        <w:rPr>
+          <w:rFonts w:ascii="Verdana" w:hAnsi="Verdana"/>
+          <w:color w:val="auto"/>
+          <w:sz w:val="20"/>
+          <w:szCs w:val="20"/>
+        </w:rPr>
+        <w:t>pwm</w:t>
+      </w:r>
+      <w:proofErr w:type="spellEnd"/>
+      <w:r>
+        <w:rPr>
+          <w:rFonts w:ascii="Verdana" w:hAnsi="Verdana"/>
+          <w:color w:val="auto"/>
+          <w:sz w:val="20"/>
+          <w:szCs w:val="20"/>
+        </w:rPr>
+        <w:t xml:space="preserve"> signaal aan de </w:t>
       </w:r>
       <w:r>
         <w:rPr>
@@ -1691,7 +2398,27 @@
           <w:sz w:val="20"/>
           <w:szCs w:val="20"/>
         </w:rPr>
-        <w:t xml:space="preserve">gebruiken we een ldo. </w:t>
+        <w:t xml:space="preserve">gebruiken we een </w:t>
+      </w:r>
+      <w:proofErr w:type="spellStart"/>
+      <w:r>
+        <w:rPr>
+          <w:rFonts w:ascii="Verdana" w:hAnsi="Verdana"/>
+          <w:color w:val="auto"/>
+          <w:sz w:val="20"/>
+          <w:szCs w:val="20"/>
+        </w:rPr>
+        <w:t>ldo</w:t>
+      </w:r>
+      <w:proofErr w:type="spellEnd"/>
+      <w:r>
+        <w:rPr>
+          <w:rFonts w:ascii="Verdana" w:hAnsi="Verdana"/>
+          <w:color w:val="auto"/>
+          <w:sz w:val="20"/>
+          <w:szCs w:val="20"/>
+        </w:rPr>
+        <w:t xml:space="preserve">. </w:t>
       </w:r>
       <w:r>
         <w:rPr>
@@ -1724,6 +2451,7 @@
       </w:pPr>
       <w:r>
         <w:rPr>
+          <w:noProof/>
           <w:color w:val="auto"/>
           <w:sz w:val="20"/>
           <w:szCs w:val="20"/>
@@ -1782,10 +2510,30 @@
     <w:p>
       <w:pPr>
         <w:pStyle w:val="Kop1"/>
+        <w:spacing w:before="120" w:after="200"/>
+        <w:rPr>
+          <w:color w:val="auto"/>
+          <w:sz w:val="20"/>
+          <w:szCs w:val="20"/>
+        </w:rPr>
+      </w:pPr>
+    </w:p>
+    <w:p>
+      <w:pPr>
+        <w:pStyle w:val="Kop1"/>
         <w:spacing w:before="400" w:after="200"/>
       </w:pPr>
       <w:r>
-        <w:t>5. Problemen en troubleshooting – eerste semester</w:t>
+        <w:lastRenderedPageBreak/>
+        <w:t xml:space="preserve">5. Problemen en </w:t>
+      </w:r>
+      <w:proofErr w:type="spellStart"/>
+      <w:r>
+        <w:t>troubleshooting</w:t>
+      </w:r>
+      <w:proofErr w:type="spellEnd"/>
+      <w:r>
+        <w:t xml:space="preserve"> – eerste semester</w:t>
       </w:r>
     </w:p>
     <w:p>
@@ -1808,8 +2556,15 @@
         <w:spacing w:before="300" w:after="150"/>
       </w:pPr>
       <w:r>
-        <w:lastRenderedPageBreak/>
-        <w:t>5.1 Voeding en de buck-converter</w:t>
+        <w:t xml:space="preserve">5.1 Voeding en de </w:t>
+      </w:r>
+      <w:proofErr w:type="spellStart"/>
+      <w:r>
+        <w:t>buck</w:t>
+      </w:r>
+      <w:proofErr w:type="spellEnd"/>
+      <w:r>
+        <w:t>-converter</w:t>
       </w:r>
     </w:p>
     <w:p>
@@ -1843,7 +2598,21 @@
         <w:rPr>
           <w:rFonts w:ascii="Verdana" w:hAnsi="Verdana"/>
         </w:rPr>
-        <w:t xml:space="preserve"> wees uit dat dit werd veroorzaakt door een verkeerd gekozen spoel na de buck-converter. De oorspronkelijk gekozen spoel had een saturatiestroom van slechts 60 mA, terwijl de print in normaal </w:t>
+        <w:t xml:space="preserve"> wees uit dat dit werd veroorzaakt door een verkeerd gekozen spoel na de </w:t>
+      </w:r>
+      <w:proofErr w:type="spellStart"/>
+      <w:r>
+        <w:rPr>
+          <w:rFonts w:ascii="Verdana" w:hAnsi="Verdana"/>
+        </w:rPr>
+        <w:t>buck</w:t>
+      </w:r>
+      <w:proofErr w:type="spellEnd"/>
+      <w:r>
+        <w:rPr>
+          <w:rFonts w:ascii="Verdana" w:hAnsi="Verdana"/>
+        </w:rPr>
+        <w:t xml:space="preserve">-converter. De oorspronkelijk gekozen spoel had een saturatiestroom van slechts 60 mA, terwijl de print in normaal </w:t>
       </w:r>
       <w:r>
         <w:rPr>
@@ -1869,7 +2638,21 @@
         <w:rPr>
           <w:rFonts w:ascii="Verdana" w:hAnsi="Verdana"/>
         </w:rPr>
-        <w:t xml:space="preserve">Bij het bestellen van een vervangende spoel is bovendien per ongeluk een metrische in plaats van een imperial 0603-behuizing besteld, waardoor in werkelijkheid een 0201-spoel werd geleverd die niet bruikbaar was. </w:t>
+        <w:t xml:space="preserve">Bij het bestellen van een vervangende spoel is bovendien per ongeluk een metrische in plaats van een </w:t>
+      </w:r>
+      <w:proofErr w:type="spellStart"/>
+      <w:r>
+        <w:rPr>
+          <w:rFonts w:ascii="Verdana" w:hAnsi="Verdana"/>
+        </w:rPr>
+        <w:t>imperial</w:t>
+      </w:r>
+      <w:proofErr w:type="spellEnd"/>
+      <w:r>
+        <w:rPr>
+          <w:rFonts w:ascii="Verdana" w:hAnsi="Verdana"/>
+        </w:rPr>
+        <w:t xml:space="preserve"> 0603-behuizing besteld, waardoor in werkelijkheid een 0201-spoel werd geleverd die niet bruikbaar was. </w:t>
       </w:r>
       <w:r>
         <w:rPr>
@@ -1958,8 +2741,30 @@
         <w:rPr>
           <w:rFonts w:ascii="Verdana" w:hAnsi="Verdana"/>
         </w:rPr>
-        <w:t>Bij het ontwerpen van de footprint voor de ST-Link is de pinout gespiegeld aangebracht. Hierdoor was achteraf een extra tussenstuk nodig om de ST-Link met de STM32 te kunnen laten communiceren.</w:t>
-      </w:r>
+        <w:t xml:space="preserve">Bij het ontwerpen van de footprint voor de ST-Link is de </w:t>
+      </w:r>
+      <w:proofErr w:type="spellStart"/>
+      <w:r>
+        <w:rPr>
+          <w:rFonts w:ascii="Verdana" w:hAnsi="Verdana"/>
+        </w:rPr>
+        <w:t>pinout</w:t>
+      </w:r>
+      <w:proofErr w:type="spellEnd"/>
+      <w:r>
+        <w:rPr>
+          <w:rFonts w:ascii="Verdana" w:hAnsi="Verdana"/>
+        </w:rPr>
+        <w:t xml:space="preserve"> gespiegeld aangebracht. Hierdoor was achteraf een extra tussenstuk nodig om de ST-Link met de STM32 te kunnen laten communiceren.</w:t>
+      </w:r>
+    </w:p>
+    <w:p>
+      <w:pPr>
+        <w:spacing w:after="200" w:line="276" w:lineRule="auto"/>
+        <w:rPr>
+          <w:rFonts w:ascii="Verdana" w:hAnsi="Verdana"/>
+        </w:rPr>
+      </w:pPr>
     </w:p>
     <w:p>
       <w:pPr>
@@ -1967,6 +2772,7 @@
         <w:spacing w:before="400" w:after="200"/>
       </w:pPr>
       <w:r>
+        <w:lastRenderedPageBreak/>
         <w:t>6. Herexamen</w:t>
       </w:r>
       <w:r>
@@ -1984,13 +2790,41 @@
         <w:rPr>
           <w:rFonts w:ascii="Verdana" w:hAnsi="Verdana"/>
         </w:rPr>
-        <w:t>Na het eerste semester is in het kader van het herexamen verder gewerkt aan een werkende flight controller op basis van de MPU6050 als vervangende IMU, met DShot als aansturingsprotocol voor de</w:t>
-      </w:r>
-      <w:r>
-        <w:rPr>
-          <w:rFonts w:ascii="Verdana" w:hAnsi="Verdana"/>
-        </w:rPr>
-        <w:t xml:space="preserve">  esc’s.</w:t>
+        <w:t xml:space="preserve">Na het eerste semester is in het kader van het herexamen verder gewerkt aan een werkende flight controller op basis van de MPU6050 als vervangende IMU, met </w:t>
+      </w:r>
+      <w:proofErr w:type="spellStart"/>
+      <w:r>
+        <w:rPr>
+          <w:rFonts w:ascii="Verdana" w:hAnsi="Verdana"/>
+        </w:rPr>
+        <w:t>DShot</w:t>
+      </w:r>
+      <w:proofErr w:type="spellEnd"/>
+      <w:r>
+        <w:rPr>
+          <w:rFonts w:ascii="Verdana" w:hAnsi="Verdana"/>
+        </w:rPr>
+        <w:t xml:space="preserve"> als aansturingsprotocol voor de</w:t>
+      </w:r>
+      <w:r>
+        <w:rPr>
+          <w:rFonts w:ascii="Verdana" w:hAnsi="Verdana"/>
+        </w:rPr>
+        <w:t xml:space="preserve">  </w:t>
+      </w:r>
+      <w:proofErr w:type="spellStart"/>
+      <w:r>
+        <w:rPr>
+          <w:rFonts w:ascii="Verdana" w:hAnsi="Verdana"/>
+        </w:rPr>
+        <w:t>esc’s</w:t>
+      </w:r>
+      <w:proofErr w:type="spellEnd"/>
+      <w:r>
+        <w:rPr>
+          <w:rFonts w:ascii="Verdana" w:hAnsi="Verdana"/>
+        </w:rPr>
+        <w:t>.</w:t>
       </w:r>
       <w:r>
         <w:rPr>
@@ -1998,6 +2832,14 @@
         </w:rPr>
         <w:t xml:space="preserve"> Hieronder volgt een overzicht van de problemen die tijdens deze fase zijn opgetreden, telkens met het symptoom, de oorzaak en de gehanteerde oplossing.</w:t>
       </w:r>
+    </w:p>
+    <w:p>
+      <w:pPr>
+        <w:spacing w:after="200" w:line="276" w:lineRule="auto"/>
+        <w:rPr>
+          <w:rFonts w:ascii="Verdana" w:hAnsi="Verdana"/>
+        </w:rPr>
+      </w:pPr>
     </w:p>
     <w:p>
       <w:pPr>
@@ -2014,144 +2856,521 @@
           <w:sz w:val="26"/>
           <w:szCs w:val="26"/>
         </w:rPr>
-        <w:lastRenderedPageBreak/>
-        <w:t xml:space="preserve">6.1  </w:t>
-      </w:r>
-      <w:r>
+        <w:t>6.1 PID</w:t>
+      </w:r>
+    </w:p>
+    <w:p>
+      <w:pPr>
+        <w:spacing w:after="200" w:line="276" w:lineRule="auto"/>
+        <w:rPr>
+          <w:rFonts w:ascii="Verdana" w:hAnsi="Verdana"/>
+        </w:rPr>
+      </w:pPr>
+      <w:r>
+        <w:rPr>
+          <w:rFonts w:ascii="Verdana" w:hAnsi="Verdana"/>
+        </w:rPr>
+        <w:t xml:space="preserve">De stabilisatie van </w:t>
+      </w:r>
+      <w:r>
+        <w:rPr>
+          <w:rFonts w:ascii="Verdana" w:hAnsi="Verdana"/>
+        </w:rPr>
+        <w:t>onze</w:t>
+      </w:r>
+      <w:r>
+        <w:rPr>
+          <w:rFonts w:ascii="Verdana" w:hAnsi="Verdana"/>
+        </w:rPr>
+        <w:t xml:space="preserve"> drone gebeurt met behulp van een PID</w:t>
+      </w:r>
+      <w:r>
+        <w:rPr>
+          <w:rFonts w:ascii="Verdana" w:hAnsi="Verdana"/>
+        </w:rPr>
+        <w:t xml:space="preserve"> controller</w:t>
+      </w:r>
+      <w:r>
+        <w:rPr>
+          <w:rFonts w:ascii="Verdana" w:hAnsi="Verdana"/>
+        </w:rPr>
+        <w:t xml:space="preserve">. </w:t>
+      </w:r>
+      <w:r>
+        <w:rPr>
+          <w:rFonts w:ascii="Verdana" w:hAnsi="Verdana"/>
+        </w:rPr>
+        <w:t>Deze code hadden we ook al ontwikkeld tijdens het semester</w:t>
+      </w:r>
+      <w:r>
+        <w:rPr>
+          <w:rFonts w:ascii="Verdana" w:hAnsi="Verdana"/>
+        </w:rPr>
+        <w:t xml:space="preserve">. Oorspronkelijk hadden we 4 loops. De 3 voor de hand liggende </w:t>
+      </w:r>
+      <w:r>
+        <w:rPr>
+          <w:rFonts w:ascii="Verdana" w:hAnsi="Verdana"/>
+        </w:rPr>
+        <w:t xml:space="preserve">zoals de pitch, </w:t>
+      </w:r>
+      <w:proofErr w:type="spellStart"/>
+      <w:r>
+        <w:rPr>
+          <w:rFonts w:ascii="Verdana" w:hAnsi="Verdana"/>
+        </w:rPr>
+        <w:t>yaw</w:t>
+      </w:r>
+      <w:proofErr w:type="spellEnd"/>
+      <w:r>
+        <w:rPr>
+          <w:rFonts w:ascii="Verdana" w:hAnsi="Verdana"/>
+        </w:rPr>
+        <w:t xml:space="preserve"> en </w:t>
+      </w:r>
+      <w:proofErr w:type="spellStart"/>
+      <w:r>
+        <w:rPr>
+          <w:rFonts w:ascii="Verdana" w:hAnsi="Verdana"/>
+        </w:rPr>
+        <w:t>roll</w:t>
+      </w:r>
+      <w:proofErr w:type="spellEnd"/>
+      <w:r>
+        <w:rPr>
+          <w:rFonts w:ascii="Verdana" w:hAnsi="Verdana"/>
+        </w:rPr>
+        <w:t xml:space="preserve"> van de drone</w:t>
+      </w:r>
+      <w:r>
+        <w:rPr>
+          <w:rFonts w:ascii="Verdana" w:hAnsi="Verdana"/>
+        </w:rPr>
+        <w:t xml:space="preserve"> dit doen we met de IMU op de drone aanwezig. We hadden er ook nog 1 voorzien voor de hoogte</w:t>
+      </w:r>
+      <w:r>
+        <w:rPr>
+          <w:rFonts w:ascii="Verdana" w:hAnsi="Verdana"/>
+        </w:rPr>
+        <w:t xml:space="preserve"> zeker voor het autonoom te laten vliegen is dit zeer handig en bijna essentieel</w:t>
+      </w:r>
+      <w:r>
+        <w:rPr>
+          <w:rFonts w:ascii="Verdana" w:hAnsi="Verdana"/>
+        </w:rPr>
+        <w:t>,</w:t>
+      </w:r>
+      <w:r>
+        <w:rPr>
+          <w:rFonts w:ascii="Verdana" w:hAnsi="Verdana"/>
+        </w:rPr>
+        <w:t xml:space="preserve"> echter </w:t>
+      </w:r>
+      <w:r>
+        <w:rPr>
+          <w:rFonts w:ascii="Verdana" w:hAnsi="Verdana"/>
+          <w:highlight w:val="yellow"/>
+        </w:rPr>
+        <w:t>werkt onze barometer niet</w:t>
+      </w:r>
+      <w:r>
+        <w:rPr>
+          <w:rFonts w:ascii="Verdana" w:hAnsi="Verdana"/>
+        </w:rPr>
+        <w:t xml:space="preserve"> dus momenteel is deze loop nog niet in gebruik.</w:t>
+      </w:r>
+    </w:p>
+    <w:p>
+      <w:pPr>
+        <w:spacing w:after="200" w:line="276" w:lineRule="auto"/>
+        <w:rPr>
+          <w:rFonts w:ascii="Verdana" w:hAnsi="Verdana"/>
+        </w:rPr>
+      </w:pPr>
+      <w:r>
+        <w:rPr>
+          <w:rFonts w:ascii="Verdana" w:hAnsi="Verdana"/>
+        </w:rPr>
+        <w:t xml:space="preserve">Het principe van een PID-regelaar is dat op elk moment een fout (error) wordt berekend als het verschil tussen de gewenste waarde (setpoint) en de werkelijk gemeten waarde. </w:t>
+      </w:r>
+      <w:r>
+        <w:rPr>
+          <w:rFonts w:ascii="Verdana" w:hAnsi="Verdana"/>
+        </w:rPr>
+        <w:t>Deze wordt dan via 3 verschillende kanalen bepaald.</w:t>
+      </w:r>
+    </w:p>
+    <w:p>
+      <w:pPr>
+        <w:numPr>
+          <w:ilvl w:val="0"/>
+          <w:numId w:val="7"/>
+        </w:numPr>
+        <w:spacing w:after="200" w:line="276" w:lineRule="auto"/>
+        <w:rPr>
+          <w:rFonts w:ascii="Verdana" w:hAnsi="Verdana"/>
+        </w:rPr>
+      </w:pPr>
+      <w:r>
+        <w:rPr>
+          <w:rFonts w:ascii="Verdana" w:hAnsi="Verdana"/>
+          <w:b/>
+          <w:bCs/>
+        </w:rPr>
+        <w:t>P-term (</w:t>
+      </w:r>
+      <w:r>
+        <w:rPr>
+          <w:rFonts w:ascii="Verdana" w:hAnsi="Verdana"/>
+          <w:b/>
+          <w:bCs/>
+        </w:rPr>
+        <w:t>Proportion</w:t>
+      </w:r>
+      <w:r>
+        <w:rPr>
+          <w:rFonts w:ascii="Verdana" w:hAnsi="Verdana"/>
+          <w:b/>
+          <w:bCs/>
+        </w:rPr>
+        <w:t>e</w:t>
+      </w:r>
+      <w:r>
+        <w:rPr>
+          <w:rFonts w:ascii="Verdana" w:hAnsi="Verdana"/>
+          <w:b/>
+          <w:bCs/>
+        </w:rPr>
+        <w:t>el</w:t>
+      </w:r>
+      <w:r>
+        <w:rPr>
+          <w:rFonts w:ascii="Verdana" w:hAnsi="Verdana"/>
+          <w:b/>
+          <w:bCs/>
+        </w:rPr>
+        <w:t>):</w:t>
+      </w:r>
+      <w:r>
+        <w:rPr>
+          <w:rFonts w:ascii="Verdana" w:hAnsi="Verdana"/>
+        </w:rPr>
+        <w:t xml:space="preserve"> reageert onmiddellijk en proportioneel op de huidige fout. Een grote afwijking levert een grote correctie op, een kleine afwijking een kleine correctie. De P-term zorgt voor de basisreactiesnelheid van de regelaar, maar kan bij een te hoge waarde leiden tot </w:t>
+      </w:r>
+      <w:proofErr w:type="spellStart"/>
+      <w:r>
+        <w:rPr>
+          <w:rFonts w:ascii="Verdana" w:hAnsi="Verdana"/>
+        </w:rPr>
+        <w:t>overshoot</w:t>
+      </w:r>
+      <w:proofErr w:type="spellEnd"/>
+      <w:r>
+        <w:rPr>
+          <w:rFonts w:ascii="Verdana" w:hAnsi="Verdana"/>
+        </w:rPr>
+        <w:t xml:space="preserve"> en oscillaties.</w:t>
+      </w:r>
+    </w:p>
+    <w:p>
+      <w:pPr>
+        <w:numPr>
+          <w:ilvl w:val="0"/>
+          <w:numId w:val="7"/>
+        </w:numPr>
+        <w:spacing w:after="200" w:line="276" w:lineRule="auto"/>
+        <w:rPr>
+          <w:rFonts w:ascii="Verdana" w:hAnsi="Verdana"/>
+        </w:rPr>
+      </w:pPr>
+      <w:r>
+        <w:rPr>
+          <w:rFonts w:ascii="Verdana" w:hAnsi="Verdana"/>
+          <w:b/>
+          <w:bCs/>
+        </w:rPr>
+        <w:t>I-term (Integrerend):</w:t>
+      </w:r>
+      <w:r>
+        <w:rPr>
+          <w:rFonts w:ascii="Verdana" w:hAnsi="Verdana"/>
+        </w:rPr>
+        <w:t xml:space="preserve"> houdt de opbouw van de fout over tijd bij en corrigeert voor kleine, blijvende afwijkingen die de P-term alleen niet wegwerkt. Een te hoge I-term veroorzaakt echter een trage, slingerende reactie (</w:t>
+      </w:r>
+      <w:proofErr w:type="spellStart"/>
+      <w:r>
+        <w:rPr>
+          <w:rFonts w:ascii="Verdana" w:hAnsi="Verdana"/>
+        </w:rPr>
+        <w:t>windup</w:t>
+      </w:r>
+      <w:proofErr w:type="spellEnd"/>
+      <w:r>
+        <w:rPr>
+          <w:rFonts w:ascii="Verdana" w:hAnsi="Verdana"/>
+        </w:rPr>
+        <w:t>).</w:t>
+      </w:r>
+    </w:p>
+    <w:p>
+      <w:pPr>
+        <w:numPr>
+          <w:ilvl w:val="0"/>
+          <w:numId w:val="7"/>
+        </w:numPr>
+        <w:spacing w:after="200" w:line="276" w:lineRule="auto"/>
+        <w:rPr>
+          <w:rFonts w:ascii="Verdana" w:hAnsi="Verdana"/>
+        </w:rPr>
+      </w:pPr>
+      <w:r>
+        <w:rPr>
+          <w:rFonts w:ascii="Verdana" w:hAnsi="Verdana"/>
+          <w:b/>
+          <w:bCs/>
+        </w:rPr>
+        <w:t>D-term (Differentiërend):</w:t>
+      </w:r>
+      <w:r>
+        <w:rPr>
+          <w:rFonts w:ascii="Verdana" w:hAnsi="Verdana"/>
+        </w:rPr>
+        <w:t xml:space="preserve"> kijkt naar de snelheid waarmee de fout verandert en werkt dempend: ze remt de correctie af naarmate het setpoint wordt benaderd, wat </w:t>
+      </w:r>
+      <w:proofErr w:type="spellStart"/>
+      <w:r>
+        <w:rPr>
+          <w:rFonts w:ascii="Verdana" w:hAnsi="Verdana"/>
+        </w:rPr>
+        <w:t>overshoot</w:t>
+      </w:r>
+      <w:proofErr w:type="spellEnd"/>
+      <w:r>
+        <w:rPr>
+          <w:rFonts w:ascii="Verdana" w:hAnsi="Verdana"/>
+        </w:rPr>
+        <w:t xml:space="preserve"> en oscillaties helpt onderdrukken. Een te hoge D-term maakt de regelaar echter gevoelig voor sensorruis.</w:t>
+      </w:r>
+    </w:p>
+    <w:p>
+      <w:pPr>
+        <w:spacing w:after="200" w:line="276" w:lineRule="auto"/>
+        <w:rPr>
+          <w:rFonts w:ascii="Verdana" w:hAnsi="Verdana"/>
+        </w:rPr>
+      </w:pPr>
+      <w:r>
+        <w:rPr>
+          <w:rFonts w:ascii="Verdana" w:hAnsi="Verdana"/>
+        </w:rPr>
+        <w:t>De som van deze drie termen, elk vermenigvuldigd met een eigen versterkingsfactor (</w:t>
+      </w:r>
+      <w:proofErr w:type="spellStart"/>
+      <w:r>
+        <w:rPr>
+          <w:rFonts w:ascii="Verdana" w:hAnsi="Verdana"/>
+        </w:rPr>
+        <w:t>Kp</w:t>
+      </w:r>
+      <w:proofErr w:type="spellEnd"/>
+      <w:r>
+        <w:rPr>
+          <w:rFonts w:ascii="Verdana" w:hAnsi="Verdana"/>
+        </w:rPr>
+        <w:t xml:space="preserve">, Ki en </w:t>
+      </w:r>
+      <w:proofErr w:type="spellStart"/>
+      <w:r>
+        <w:rPr>
+          <w:rFonts w:ascii="Verdana" w:hAnsi="Verdana"/>
+        </w:rPr>
+        <w:t>Kd</w:t>
+      </w:r>
+      <w:proofErr w:type="spellEnd"/>
+      <w:r>
+        <w:rPr>
+          <w:rFonts w:ascii="Verdana" w:hAnsi="Verdana"/>
+        </w:rPr>
+        <w:t>), bepaalt de uiteindelijke stuuruitgang die aan de motoren wordt doorgegeven via de mixer.</w:t>
+      </w:r>
+    </w:p>
+    <w:p>
+      <w:pPr>
+        <w:spacing w:after="200" w:line="276" w:lineRule="auto"/>
+        <w:rPr>
+          <w:rFonts w:ascii="Verdana" w:hAnsi="Verdana"/>
+        </w:rPr>
+      </w:pPr>
+      <w:r>
+        <w:rPr>
+          <w:rFonts w:ascii="Verdana" w:hAnsi="Verdana"/>
+          <w:b/>
+          <w:bCs/>
+        </w:rPr>
+        <w:t>Van PID-uitgang naar motoraansturing</w:t>
+      </w:r>
+    </w:p>
+    <w:p>
+      <w:pPr>
+        <w:spacing w:after="200" w:line="276" w:lineRule="auto"/>
+        <w:rPr>
+          <w:rFonts w:ascii="Verdana" w:hAnsi="Verdana"/>
+        </w:rPr>
+      </w:pPr>
+      <w:r>
+        <w:rPr>
+          <w:rFonts w:ascii="Verdana" w:hAnsi="Verdana"/>
+        </w:rPr>
+        <w:t xml:space="preserve">De uitgangswaarden van de drie PID-regelaars (voor </w:t>
+      </w:r>
+      <w:proofErr w:type="spellStart"/>
+      <w:r>
+        <w:rPr>
+          <w:rFonts w:ascii="Verdana" w:hAnsi="Verdana"/>
+        </w:rPr>
+        <w:t>roll</w:t>
+      </w:r>
+      <w:proofErr w:type="spellEnd"/>
+      <w:r>
+        <w:rPr>
+          <w:rFonts w:ascii="Verdana" w:hAnsi="Verdana"/>
+        </w:rPr>
+        <w:t xml:space="preserve">, pitch en </w:t>
+      </w:r>
+      <w:proofErr w:type="spellStart"/>
+      <w:r>
+        <w:rPr>
+          <w:rFonts w:ascii="Verdana" w:hAnsi="Verdana"/>
+        </w:rPr>
+        <w:t>yaw</w:t>
+      </w:r>
+      <w:proofErr w:type="spellEnd"/>
+      <w:r>
+        <w:rPr>
+          <w:rFonts w:ascii="Verdana" w:hAnsi="Verdana"/>
+        </w:rPr>
+        <w:t xml:space="preserve">) worden samen met de throttle-waarde van de </w:t>
+      </w:r>
+      <w:r>
+        <w:rPr>
+          <w:rFonts w:ascii="Verdana" w:hAnsi="Verdana"/>
+        </w:rPr>
+        <w:t>controller/</w:t>
+      </w:r>
+      <w:proofErr w:type="spellStart"/>
+      <w:r>
+        <w:rPr>
+          <w:rFonts w:ascii="Verdana" w:hAnsi="Verdana"/>
+        </w:rPr>
+        <w:t>sd</w:t>
+      </w:r>
+      <w:proofErr w:type="spellEnd"/>
+      <w:r>
+        <w:rPr>
+          <w:rFonts w:ascii="Verdana" w:hAnsi="Verdana"/>
+        </w:rPr>
+        <w:t xml:space="preserve"> kaart</w:t>
+      </w:r>
+      <w:r>
+        <w:rPr>
+          <w:rFonts w:ascii="Verdana" w:hAnsi="Verdana"/>
+        </w:rPr>
+        <w:t xml:space="preserve"> doorgegeven aan de motormixer. Deze mixer verdeelt de correcties over de vier motoren</w:t>
+      </w:r>
+      <w:r>
+        <w:rPr>
+          <w:rFonts w:ascii="Verdana" w:hAnsi="Verdana"/>
+        </w:rPr>
+        <w:t xml:space="preserve">. </w:t>
+      </w:r>
+      <w:r>
+        <w:rPr>
+          <w:rFonts w:ascii="Verdana" w:hAnsi="Verdana"/>
+        </w:rPr>
+        <w:t xml:space="preserve">Het resultaat van deze mixer wordt uiteindelijk als </w:t>
+      </w:r>
+      <w:proofErr w:type="spellStart"/>
+      <w:r>
+        <w:rPr>
+          <w:rFonts w:ascii="Verdana" w:hAnsi="Verdana"/>
+        </w:rPr>
+        <w:t>DShot</w:t>
+      </w:r>
+      <w:proofErr w:type="spellEnd"/>
+      <w:r>
+        <w:rPr>
+          <w:rFonts w:ascii="Verdana" w:hAnsi="Verdana"/>
+        </w:rPr>
+        <w:t xml:space="preserve">-frame naar de </w:t>
+      </w:r>
+      <w:proofErr w:type="spellStart"/>
+      <w:r>
+        <w:rPr>
+          <w:rFonts w:ascii="Verdana" w:hAnsi="Verdana"/>
+        </w:rPr>
+        <w:t>ESC's</w:t>
+      </w:r>
+      <w:proofErr w:type="spellEnd"/>
+      <w:r>
+        <w:rPr>
+          <w:rFonts w:ascii="Verdana" w:hAnsi="Verdana"/>
+        </w:rPr>
+        <w:t xml:space="preserve"> van elke motor gestuurd.</w:t>
+      </w:r>
+    </w:p>
+    <w:p>
+      <w:pPr>
+        <w:spacing w:after="200" w:line="276" w:lineRule="auto"/>
+        <w:rPr>
+          <w:rFonts w:ascii="Verdana" w:hAnsi="Verdana"/>
+          <w:b/>
+          <w:bCs/>
+        </w:rPr>
+      </w:pPr>
+    </w:p>
+    <w:p>
+      <w:pPr>
+        <w:spacing w:after="200" w:line="276" w:lineRule="auto"/>
+        <w:rPr>
+          <w:rFonts w:ascii="Verdana" w:hAnsi="Verdana"/>
+          <w:b/>
+          <w:bCs/>
+        </w:rPr>
+      </w:pPr>
+    </w:p>
+    <w:p>
+      <w:pPr>
+        <w:spacing w:after="200" w:line="276" w:lineRule="auto"/>
+        <w:rPr>
+          <w:rFonts w:ascii="Verdana" w:hAnsi="Verdana"/>
+        </w:rPr>
+      </w:pPr>
+    </w:p>
+    <w:p>
+      <w:pPr>
+        <w:spacing w:after="200" w:line="276" w:lineRule="auto"/>
         <w:rPr>
           <w:color w:val="2E74B5"/>
           <w:sz w:val="26"/>
           <w:szCs w:val="26"/>
         </w:rPr>
-        <w:t>DSHOT/ESC</w:t>
-      </w:r>
-    </w:p>
-    <w:p>
-      <w:pPr>
-        <w:spacing w:after="200" w:line="276" w:lineRule="auto"/>
-        <w:rPr>
-          <w:rFonts w:ascii="Verdana" w:hAnsi="Verdana"/>
-        </w:rPr>
-      </w:pPr>
-      <w:r>
-        <w:rPr>
-          <w:rFonts w:ascii="Verdana" w:hAnsi="Verdana"/>
-        </w:rPr>
-        <w:t>Om verder te gaan op de ESC-modules moesten we in essentie een DShot-protocol bit-bangen om de ESC's aan te sturen. Deze code werd doorheen het semester geschreven en uitvoerig getest, maar leverde nooit het gewenste resultaat op: de motoren draaiden niet consistent en niet op de momenten die verwacht werden.</w:t>
-      </w:r>
-    </w:p>
-    <w:p>
-      <w:pPr>
-        <w:spacing w:after="200" w:line="276" w:lineRule="auto"/>
-        <w:rPr>
-          <w:rFonts w:ascii="Verdana" w:hAnsi="Verdana"/>
-        </w:rPr>
-      </w:pPr>
-      <w:r>
-        <w:rPr>
-          <w:rFonts w:ascii="Verdana" w:hAnsi="Verdana"/>
-        </w:rPr>
-        <w:t>Metingen</w:t>
-      </w:r>
-      <w:r>
-        <w:rPr>
-          <w:rFonts w:ascii="Verdana" w:hAnsi="Verdana"/>
-        </w:rPr>
-        <w:t xml:space="preserve"> met behulp van een logic analyzer en oscilloscoop toonde echter aan dat de door de STM32 uitgestuurde data wel degelijk </w:t>
-      </w:r>
-      <w:r>
-        <w:rPr>
-          <w:rFonts w:ascii="Verdana" w:hAnsi="Verdana"/>
-        </w:rPr>
-        <w:t xml:space="preserve">  </w:t>
-      </w:r>
-      <w:r>
-        <w:rPr>
-          <w:rFonts w:ascii="Verdana" w:hAnsi="Verdana"/>
-        </w:rPr>
-        <w:t>correct was en overeenkwam met de verwachte DShot-timing. Om dit verder te bevestigen, werd dezelfde code getest via een ESP32, waar de motoren w</w:t>
-      </w:r>
-      <w:r>
-        <w:rPr>
-          <w:rFonts w:ascii="Verdana" w:hAnsi="Verdana"/>
-        </w:rPr>
-        <w:t>e</w:t>
-      </w:r>
-      <w:r>
-        <w:rPr>
-          <w:rFonts w:ascii="Verdana" w:hAnsi="Verdana"/>
-        </w:rPr>
-        <w:t>l naar behoren functioneerden</w:t>
-      </w:r>
-      <w:r>
-        <w:rPr>
-          <w:rFonts w:ascii="Verdana" w:hAnsi="Verdana"/>
-        </w:rPr>
-        <w:t>,</w:t>
-      </w:r>
-      <w:r>
-        <w:rPr>
-          <w:rFonts w:ascii="Verdana" w:hAnsi="Verdana"/>
-        </w:rPr>
-        <w:t xml:space="preserve"> ondanks dat de uitgestuurde data, gemeten met dezelfde logic analyzer, identiek was aan die van de STM32. Dezelfde data resulteerde dus in een ander resultaat, afhankelijk van de gebruikte microcontroller.</w:t>
-      </w:r>
-    </w:p>
-    <w:p>
-      <w:pPr>
-        <w:spacing w:after="200" w:line="276" w:lineRule="auto"/>
-        <w:rPr>
-          <w:rFonts w:ascii="Verdana" w:hAnsi="Verdana"/>
-        </w:rPr>
-      </w:pPr>
-      <w:r>
-        <w:rPr>
-          <w:rFonts w:ascii="Verdana" w:hAnsi="Verdana"/>
-        </w:rPr>
-        <w:t xml:space="preserve">Na het bestukken van een nieuwe print werkte de aansturing wel naar behoren. </w:t>
-      </w:r>
-      <w:r>
-        <w:rPr>
-          <w:rFonts w:ascii="Verdana" w:hAnsi="Verdana"/>
-        </w:rPr>
-        <w:t xml:space="preserve">We weten niet </w:t>
-      </w:r>
-      <w:r>
-        <w:rPr>
-          <w:rFonts w:ascii="Verdana" w:hAnsi="Verdana"/>
-        </w:rPr>
-        <w:t xml:space="preserve">waaraan het zou kunnen liggen dat de oude print het niet werkende kreeg. We weten dat er overspanning is geweest maar dit had geen invloed op de werking van het dshot protocol normaal gezien. </w:t>
-      </w:r>
-      <w:r>
-        <w:rPr>
-          <w:rFonts w:ascii="Verdana" w:hAnsi="Verdana"/>
-        </w:rPr>
-        <w:t>Een echte verklaring kunnen we dan ook niet geven.</w:t>
-      </w:r>
-    </w:p>
-    <w:p>
-      <w:pPr>
-        <w:spacing w:after="200" w:line="276" w:lineRule="auto"/>
-        <w:rPr>
-          <w:rFonts w:ascii="Verdana" w:hAnsi="Verdana"/>
-        </w:rPr>
-      </w:pPr>
-    </w:p>
-    <w:p>
-      <w:pPr>
-        <w:spacing w:after="200" w:line="276" w:lineRule="auto"/>
+      </w:pPr>
+      <w:r>
         <w:rPr>
           <w:color w:val="2E74B5"/>
           <w:sz w:val="26"/>
           <w:szCs w:val="26"/>
         </w:rPr>
-      </w:pPr>
+        <w:lastRenderedPageBreak/>
+        <w:t>6.</w:t>
+      </w:r>
       <w:r>
         <w:rPr>
           <w:color w:val="2E74B5"/>
           <w:sz w:val="26"/>
           <w:szCs w:val="26"/>
         </w:rPr>
-        <w:t>6.2 C</w:t>
+        <w:t>2</w:t>
       </w:r>
       <w:r>
         <w:rPr>
@@ -2159,83 +3378,560 @@
           <w:sz w:val="26"/>
           <w:szCs w:val="26"/>
         </w:rPr>
-        <w:t xml:space="preserve">ode van de MPU6050 </w:t>
-      </w:r>
-    </w:p>
-    <w:p>
-      <w:pPr>
-        <w:spacing w:after="200" w:line="276" w:lineRule="auto"/>
-        <w:rPr>
-          <w:rFonts w:ascii="Verdana" w:hAnsi="Verdana"/>
-        </w:rPr>
-      </w:pPr>
-      <w:r>
-        <w:rPr>
-          <w:rFonts w:ascii="Verdana" w:hAnsi="Verdana"/>
-        </w:rPr>
-        <w:t>Ook deze code was al in het semester geschreven en deze werkte maar kon in deze periode dankzij de werkende motors geïmplementeerd worden in de PID-loop.</w:t>
-      </w:r>
-    </w:p>
-    <w:p>
-      <w:pPr>
-        <w:spacing w:after="200" w:line="276" w:lineRule="auto"/>
+        <w:t xml:space="preserve"> </w:t>
+      </w:r>
+      <w:r>
         <w:rPr>
           <w:color w:val="2E74B5"/>
           <w:sz w:val="26"/>
           <w:szCs w:val="26"/>
         </w:rPr>
-      </w:pPr>
-      <w:r>
+        <w:t>DSHOT/ESC</w:t>
+      </w:r>
+    </w:p>
+    <w:p>
+      <w:pPr>
+        <w:spacing w:after="200" w:line="276" w:lineRule="auto"/>
+        <w:rPr>
+          <w:rFonts w:ascii="Verdana" w:hAnsi="Verdana"/>
+        </w:rPr>
+      </w:pPr>
+      <w:r>
+        <w:rPr>
+          <w:rFonts w:ascii="Verdana" w:hAnsi="Verdana"/>
+        </w:rPr>
+        <w:t xml:space="preserve">Om verder te gaan op de ESC-modules moesten we in essentie een </w:t>
+      </w:r>
+      <w:proofErr w:type="spellStart"/>
+      <w:r>
+        <w:rPr>
+          <w:rFonts w:ascii="Verdana" w:hAnsi="Verdana"/>
+        </w:rPr>
+        <w:t>DShot</w:t>
+      </w:r>
+      <w:proofErr w:type="spellEnd"/>
+      <w:r>
+        <w:rPr>
+          <w:rFonts w:ascii="Verdana" w:hAnsi="Verdana"/>
+        </w:rPr>
+        <w:t>-protocol bit-</w:t>
+      </w:r>
+      <w:proofErr w:type="spellStart"/>
+      <w:r>
+        <w:rPr>
+          <w:rFonts w:ascii="Verdana" w:hAnsi="Verdana"/>
+        </w:rPr>
+        <w:t>bangen</w:t>
+      </w:r>
+      <w:proofErr w:type="spellEnd"/>
+      <w:r>
+        <w:rPr>
+          <w:rFonts w:ascii="Verdana" w:hAnsi="Verdana"/>
+        </w:rPr>
+        <w:t xml:space="preserve"> om de </w:t>
+      </w:r>
+      <w:proofErr w:type="spellStart"/>
+      <w:r>
+        <w:rPr>
+          <w:rFonts w:ascii="Verdana" w:hAnsi="Verdana"/>
+        </w:rPr>
+        <w:t>ESC's</w:t>
+      </w:r>
+      <w:proofErr w:type="spellEnd"/>
+      <w:r>
+        <w:rPr>
+          <w:rFonts w:ascii="Verdana" w:hAnsi="Verdana"/>
+        </w:rPr>
+        <w:t xml:space="preserve"> aan te sturen. Deze code werd doorheen het semester geschreven en uitvoerig getest, maar leverde nooit het gewenste resultaat op: de motoren draaiden niet consistent en niet op de momenten die verwacht werden.</w:t>
+      </w:r>
+    </w:p>
+    <w:p>
+      <w:pPr>
+        <w:spacing w:after="200" w:line="276" w:lineRule="auto"/>
+        <w:rPr>
+          <w:rFonts w:ascii="Verdana" w:hAnsi="Verdana"/>
+        </w:rPr>
+      </w:pPr>
+      <w:r>
+        <w:rPr>
+          <w:rFonts w:ascii="Verdana" w:hAnsi="Verdana"/>
+        </w:rPr>
+        <w:t>Metingen</w:t>
+      </w:r>
+      <w:r>
+        <w:rPr>
+          <w:rFonts w:ascii="Verdana" w:hAnsi="Verdana"/>
+        </w:rPr>
+        <w:t xml:space="preserve"> met behulp van een logic analyzer en oscilloscoop toonde echter aan dat de door de STM32 uitgestuurde data wel degelijk </w:t>
+      </w:r>
+      <w:r>
+        <w:rPr>
+          <w:rFonts w:ascii="Verdana" w:hAnsi="Verdana"/>
+        </w:rPr>
+        <w:t xml:space="preserve">  </w:t>
+      </w:r>
+      <w:r>
+        <w:rPr>
+          <w:rFonts w:ascii="Verdana" w:hAnsi="Verdana"/>
+        </w:rPr>
+        <w:t xml:space="preserve">correct was en overeenkwam met de verwachte </w:t>
+      </w:r>
+      <w:proofErr w:type="spellStart"/>
+      <w:r>
+        <w:rPr>
+          <w:rFonts w:ascii="Verdana" w:hAnsi="Verdana"/>
+        </w:rPr>
+        <w:t>DShot</w:t>
+      </w:r>
+      <w:proofErr w:type="spellEnd"/>
+      <w:r>
+        <w:rPr>
+          <w:rFonts w:ascii="Verdana" w:hAnsi="Verdana"/>
+        </w:rPr>
+        <w:t>-timing. Om dit verder te bevestigen, werd dezelfde code getest via een ESP32, waar de motoren w</w:t>
+      </w:r>
+      <w:r>
+        <w:rPr>
+          <w:rFonts w:ascii="Verdana" w:hAnsi="Verdana"/>
+        </w:rPr>
+        <w:t>e</w:t>
+      </w:r>
+      <w:r>
+        <w:rPr>
+          <w:rFonts w:ascii="Verdana" w:hAnsi="Verdana"/>
+        </w:rPr>
+        <w:t>l naar behoren functioneerden</w:t>
+      </w:r>
+      <w:r>
+        <w:rPr>
+          <w:rFonts w:ascii="Verdana" w:hAnsi="Verdana"/>
+        </w:rPr>
+        <w:t>,</w:t>
+      </w:r>
+      <w:r>
+        <w:rPr>
+          <w:rFonts w:ascii="Verdana" w:hAnsi="Verdana"/>
+        </w:rPr>
+        <w:t xml:space="preserve"> ondanks dat de uitgestuurde data, gemeten met dezelfde logic analyzer, identiek was aan die van de STM32. Dezelfde data resulteerde dus in een ander resultaat, afhankelijk van de gebruikte microcontroller.</w:t>
+      </w:r>
+    </w:p>
+    <w:p>
+      <w:pPr>
+        <w:spacing w:after="200" w:line="276" w:lineRule="auto"/>
+        <w:rPr>
+          <w:rFonts w:ascii="Verdana" w:hAnsi="Verdana"/>
+        </w:rPr>
+      </w:pPr>
+      <w:r>
+        <w:rPr>
+          <w:rFonts w:ascii="Verdana" w:hAnsi="Verdana"/>
+        </w:rPr>
+        <w:t xml:space="preserve">Na het </w:t>
+      </w:r>
+      <w:proofErr w:type="spellStart"/>
+      <w:r>
+        <w:rPr>
+          <w:rFonts w:ascii="Verdana" w:hAnsi="Verdana"/>
+        </w:rPr>
+        <w:t>bestukken</w:t>
+      </w:r>
+      <w:proofErr w:type="spellEnd"/>
+      <w:r>
+        <w:rPr>
+          <w:rFonts w:ascii="Verdana" w:hAnsi="Verdana"/>
+        </w:rPr>
+        <w:t xml:space="preserve"> van een nieuwe print werkte de aansturing wel naar behoren. </w:t>
+      </w:r>
+      <w:r>
+        <w:rPr>
+          <w:rFonts w:ascii="Verdana" w:hAnsi="Verdana"/>
+        </w:rPr>
+        <w:t xml:space="preserve">We weten niet </w:t>
+      </w:r>
+      <w:r>
+        <w:rPr>
+          <w:rFonts w:ascii="Verdana" w:hAnsi="Verdana"/>
+        </w:rPr>
+        <w:t xml:space="preserve">waaraan het zou kunnen liggen dat de oude print het niet werkende kreeg. We weten dat er overspanning is geweest maar dit had geen invloed op de werking van het </w:t>
+      </w:r>
+      <w:proofErr w:type="spellStart"/>
+      <w:r>
+        <w:rPr>
+          <w:rFonts w:ascii="Verdana" w:hAnsi="Verdana"/>
+        </w:rPr>
+        <w:t>dshot</w:t>
+      </w:r>
+      <w:proofErr w:type="spellEnd"/>
+      <w:r>
+        <w:rPr>
+          <w:rFonts w:ascii="Verdana" w:hAnsi="Verdana"/>
+        </w:rPr>
+        <w:t xml:space="preserve"> protocol normaal gezien. </w:t>
+      </w:r>
+      <w:r>
+        <w:rPr>
+          <w:rFonts w:ascii="Verdana" w:hAnsi="Verdana"/>
+        </w:rPr>
+        <w:t>Een echte verklaring kunnen we dan ook niet geven.</w:t>
+      </w:r>
+    </w:p>
+    <w:p>
+      <w:pPr>
+        <w:spacing w:after="200" w:line="276" w:lineRule="auto"/>
+        <w:rPr>
+          <w:rFonts w:ascii="Verdana" w:hAnsi="Verdana"/>
+        </w:rPr>
+      </w:pPr>
+    </w:p>
+    <w:p>
+      <w:pPr>
+        <w:spacing w:after="200" w:line="276" w:lineRule="auto"/>
         <w:rPr>
           <w:color w:val="2E74B5"/>
           <w:sz w:val="26"/>
           <w:szCs w:val="26"/>
         </w:rPr>
-        <w:t>6.3 ESC’s</w:t>
+      </w:pPr>
+      <w:r>
+        <w:rPr>
+          <w:color w:val="2E74B5"/>
+          <w:sz w:val="26"/>
+          <w:szCs w:val="26"/>
+        </w:rPr>
+        <w:t>6.</w:t>
+      </w:r>
+      <w:r>
+        <w:rPr>
+          <w:color w:val="2E74B5"/>
+          <w:sz w:val="26"/>
+          <w:szCs w:val="26"/>
+        </w:rPr>
+        <w:t>3</w:t>
+      </w:r>
+      <w:r>
+        <w:rPr>
+          <w:color w:val="2E74B5"/>
+          <w:sz w:val="26"/>
+          <w:szCs w:val="26"/>
+        </w:rPr>
+        <w:t xml:space="preserve"> C</w:t>
+      </w:r>
+      <w:r>
+        <w:rPr>
+          <w:color w:val="2E74B5"/>
+          <w:sz w:val="26"/>
+          <w:szCs w:val="26"/>
+        </w:rPr>
+        <w:t xml:space="preserve">ode van de MPU6050 </w:t>
       </w:r>
     </w:p>
     <w:p>
       <w:pPr>
         <w:spacing w:after="200" w:line="276" w:lineRule="auto"/>
-      </w:pPr>
-      <w:r>
+        <w:rPr>
+          <w:rFonts w:ascii="Verdana" w:hAnsi="Verdana"/>
+        </w:rPr>
+      </w:pPr>
+      <w:r>
+        <w:rPr>
+          <w:rFonts w:ascii="Verdana" w:hAnsi="Verdana"/>
+        </w:rPr>
+        <w:t>Ook deze code was al in het semester geschreven en deze werkte maar kon in deze periode dankzij de werkende motors geïmplementeerd worden in de PID-loop.</w:t>
+      </w:r>
+    </w:p>
+    <w:p>
+      <w:pPr>
+        <w:spacing w:after="200" w:line="276" w:lineRule="auto"/>
+        <w:rPr>
+          <w:color w:val="2E74B5"/>
+          <w:sz w:val="26"/>
+          <w:szCs w:val="26"/>
+        </w:rPr>
+      </w:pPr>
+      <w:r>
+        <w:rPr>
+          <w:color w:val="2E74B5"/>
+          <w:sz w:val="26"/>
+          <w:szCs w:val="26"/>
+        </w:rPr>
+        <w:t>6.</w:t>
+      </w:r>
+      <w:r>
+        <w:rPr>
+          <w:color w:val="2E74B5"/>
+          <w:sz w:val="26"/>
+          <w:szCs w:val="26"/>
+        </w:rPr>
+        <w:t>4</w:t>
+      </w:r>
+      <w:r>
+        <w:rPr>
+          <w:color w:val="2E74B5"/>
+          <w:sz w:val="26"/>
+          <w:szCs w:val="26"/>
+        </w:rPr>
+        <w:t xml:space="preserve"> </w:t>
+      </w:r>
+      <w:proofErr w:type="spellStart"/>
+      <w:r>
+        <w:rPr>
+          <w:color w:val="2E74B5"/>
+          <w:sz w:val="26"/>
+          <w:szCs w:val="26"/>
+        </w:rPr>
+        <w:t>ESC’s</w:t>
+      </w:r>
+      <w:proofErr w:type="spellEnd"/>
+    </w:p>
+    <w:p>
+      <w:pPr>
+        <w:spacing w:after="200" w:line="276" w:lineRule="auto"/>
+        <w:rPr>
+          <w:rFonts w:ascii="Verdana" w:hAnsi="Verdana"/>
+        </w:rPr>
+      </w:pPr>
+      <w:r>
+        <w:rPr>
+          <w:rFonts w:ascii="Verdana" w:hAnsi="Verdana"/>
+        </w:rPr>
         <w:t xml:space="preserve">Door verder te gaan </w:t>
       </w:r>
       <w:r>
-        <w:t xml:space="preserve">op de ESC modules moesten we eigenlijk enkel een dshot code bitbangen die we konden gebruiken om </w:t>
-      </w:r>
-      <w:r>
-        <w:t xml:space="preserve">de esc’s aan te sturen. We hebben deze code geschreven en getest echter werkte dit niet zoals verwacht. De motors draaide niet consistent en </w:t>
-      </w:r>
-      <w:r>
+        <w:rPr>
+          <w:rFonts w:ascii="Verdana" w:hAnsi="Verdana"/>
+        </w:rPr>
+        <w:t xml:space="preserve">op de ESC modules moesten we eigenlijk enkel een </w:t>
+      </w:r>
+      <w:proofErr w:type="spellStart"/>
+      <w:r>
+        <w:rPr>
+          <w:rFonts w:ascii="Verdana" w:hAnsi="Verdana"/>
+        </w:rPr>
+        <w:t>dshot</w:t>
+      </w:r>
+      <w:proofErr w:type="spellEnd"/>
+      <w:r>
+        <w:rPr>
+          <w:rFonts w:ascii="Verdana" w:hAnsi="Verdana"/>
+        </w:rPr>
+        <w:t xml:space="preserve"> code </w:t>
+      </w:r>
+      <w:proofErr w:type="spellStart"/>
+      <w:r>
+        <w:rPr>
+          <w:rFonts w:ascii="Verdana" w:hAnsi="Verdana"/>
+        </w:rPr>
+        <w:t>bitbangen</w:t>
+      </w:r>
+      <w:proofErr w:type="spellEnd"/>
+      <w:r>
+        <w:rPr>
+          <w:rFonts w:ascii="Verdana" w:hAnsi="Verdana"/>
+        </w:rPr>
+        <w:t xml:space="preserve"> die we konden gebruiken om </w:t>
+      </w:r>
+      <w:r>
+        <w:rPr>
+          <w:rFonts w:ascii="Verdana" w:hAnsi="Verdana"/>
+        </w:rPr>
+        <w:t xml:space="preserve">de </w:t>
+      </w:r>
+      <w:proofErr w:type="spellStart"/>
+      <w:r>
+        <w:rPr>
+          <w:rFonts w:ascii="Verdana" w:hAnsi="Verdana"/>
+        </w:rPr>
+        <w:t>esc’s</w:t>
+      </w:r>
+      <w:proofErr w:type="spellEnd"/>
+      <w:r>
+        <w:rPr>
+          <w:rFonts w:ascii="Verdana" w:hAnsi="Verdana"/>
+        </w:rPr>
+        <w:t xml:space="preserve"> aan te sturen. We hebben deze code geschreven en getest echter werkte dit niet zoals verwacht. De motors draaide niet consistent en </w:t>
+      </w:r>
+      <w:r>
+        <w:rPr>
+          <w:rFonts w:ascii="Verdana" w:hAnsi="Verdana"/>
+        </w:rPr>
         <w:t xml:space="preserve">niet op de momenten dat we wouden. We hebben dezelfde code dan getest via een ESP32 en dit bleek wel naar behoren te werken. </w:t>
       </w:r>
       <w:r>
-        <w:t>Na het uitmeten met de logic analyzer konden we aantonen dat de data die onze stm uitstuurde wel degelijk ook correct was en zelfs overeen kwam met de data die uit de esp kwam</w:t>
-      </w:r>
-      <w:r>
+        <w:rPr>
+          <w:rFonts w:ascii="Verdana" w:hAnsi="Verdana"/>
+        </w:rPr>
+        <w:t xml:space="preserve">Na het uitmeten met de logic analyzer konden we aantonen dat de data die onze </w:t>
+      </w:r>
+      <w:proofErr w:type="spellStart"/>
+      <w:r>
+        <w:rPr>
+          <w:rFonts w:ascii="Verdana" w:hAnsi="Verdana"/>
+        </w:rPr>
+        <w:t>stm</w:t>
+      </w:r>
+      <w:proofErr w:type="spellEnd"/>
+      <w:r>
+        <w:rPr>
+          <w:rFonts w:ascii="Verdana" w:hAnsi="Verdana"/>
+        </w:rPr>
+        <w:t xml:space="preserve"> uitstuurde wel degelijk ook correct was en zelfs overeen kwam met de data die uit de esp kwam</w:t>
+      </w:r>
+      <w:r>
+        <w:rPr>
+          <w:rFonts w:ascii="Verdana" w:hAnsi="Verdana"/>
+        </w:rPr>
         <w:t xml:space="preserve">. Dezelfde data maar dus met een ander resultaat. Na dit enkele weken aan de kant te hebben laten staan hebben we dit opnieuw getest en zonder grote aantoonbare aanpassingen werkt dit plots wel. We zouden dit kunnen classificeren als de zwarte magie die elektronica soms is maar in realiteit zal het ergens een </w:t>
       </w:r>
       <w:r>
+        <w:rPr>
+          <w:rFonts w:ascii="Verdana" w:hAnsi="Verdana"/>
+        </w:rPr>
         <w:t>minuscuul</w:t>
       </w:r>
       <w:r>
+        <w:rPr>
+          <w:rFonts w:ascii="Verdana" w:hAnsi="Verdana"/>
+        </w:rPr>
         <w:t xml:space="preserve"> fo</w:t>
       </w:r>
       <w:r>
+        <w:rPr>
+          <w:rFonts w:ascii="Verdana" w:hAnsi="Verdana"/>
+        </w:rPr>
         <w:t xml:space="preserve">utje zijn geweest dat we onbedoeld maar zeer welkom hebben opgelost. We vermoeden een timing </w:t>
       </w:r>
       <w:r>
+        <w:rPr>
+          <w:rFonts w:ascii="Verdana" w:hAnsi="Verdana"/>
+        </w:rPr>
         <w:t>fout maar kunnen dus niet achterhalen wat dit geweest is.</w:t>
       </w:r>
     </w:p>
     <w:p>
       <w:pPr>
         <w:spacing w:after="200" w:line="276" w:lineRule="auto"/>
-      </w:pPr>
-      <w:r>
-        <w:t>6.4 TX/RX probleem</w:t>
-      </w:r>
+        <w:rPr>
+          <w:color w:val="2E74B5"/>
+          <w:sz w:val="26"/>
+          <w:szCs w:val="26"/>
+        </w:rPr>
+      </w:pPr>
+      <w:r>
+        <w:rPr>
+          <w:color w:val="2E74B5"/>
+          <w:sz w:val="26"/>
+          <w:szCs w:val="26"/>
+        </w:rPr>
+        <w:t>6.</w:t>
+      </w:r>
+      <w:r>
+        <w:rPr>
+          <w:color w:val="2E74B5"/>
+          <w:sz w:val="26"/>
+          <w:szCs w:val="26"/>
+        </w:rPr>
+        <w:t>5</w:t>
+      </w:r>
+      <w:r>
+        <w:rPr>
+          <w:color w:val="2E74B5"/>
+          <w:sz w:val="26"/>
+          <w:szCs w:val="26"/>
+        </w:rPr>
+        <w:t xml:space="preserve"> TX/RX probleem</w:t>
+      </w:r>
+    </w:p>
+    <w:p>
+      <w:pPr>
+        <w:spacing w:after="200" w:line="276" w:lineRule="auto"/>
+        <w:rPr>
+          <w:rFonts w:ascii="Verdana" w:hAnsi="Verdana"/>
+        </w:rPr>
+      </w:pPr>
+      <w:r>
+        <w:rPr>
+          <w:rFonts w:ascii="Verdana" w:hAnsi="Verdana"/>
+        </w:rPr>
+        <w:t xml:space="preserve">Doordat we de </w:t>
+      </w:r>
+      <w:proofErr w:type="spellStart"/>
+      <w:r>
+        <w:rPr>
+          <w:rFonts w:ascii="Verdana" w:hAnsi="Verdana"/>
+        </w:rPr>
+        <w:t>Tx</w:t>
+      </w:r>
+      <w:proofErr w:type="spellEnd"/>
+      <w:r>
+        <w:rPr>
+          <w:rFonts w:ascii="Verdana" w:hAnsi="Verdana"/>
+        </w:rPr>
+        <w:t xml:space="preserve"> </w:t>
+      </w:r>
+      <w:r>
+        <w:rPr>
+          <w:rFonts w:ascii="Verdana" w:hAnsi="Verdana"/>
+        </w:rPr>
+        <w:t xml:space="preserve">en </w:t>
+      </w:r>
+      <w:proofErr w:type="spellStart"/>
+      <w:r>
+        <w:rPr>
+          <w:rFonts w:ascii="Verdana" w:hAnsi="Verdana"/>
+        </w:rPr>
+        <w:t>Rx</w:t>
+      </w:r>
+      <w:proofErr w:type="spellEnd"/>
+      <w:r>
+        <w:rPr>
+          <w:rFonts w:ascii="Verdana" w:hAnsi="Verdana"/>
+        </w:rPr>
+        <w:t xml:space="preserve"> lijn hadden kortgesloten werkte onze </w:t>
+      </w:r>
+      <w:proofErr w:type="spellStart"/>
+      <w:r>
+        <w:rPr>
+          <w:rFonts w:ascii="Verdana" w:hAnsi="Verdana"/>
+        </w:rPr>
+        <w:t>printf</w:t>
+      </w:r>
+      <w:proofErr w:type="spellEnd"/>
+      <w:r>
+        <w:rPr>
+          <w:rFonts w:ascii="Verdana" w:hAnsi="Verdana"/>
+        </w:rPr>
+        <w:t xml:space="preserve"> niet meer. In de IOC hebben we dan RX en </w:t>
+      </w:r>
+      <w:proofErr w:type="spellStart"/>
+      <w:r>
+        <w:rPr>
+          <w:rFonts w:ascii="Verdana" w:hAnsi="Verdana"/>
+        </w:rPr>
+        <w:t>Tx</w:t>
+      </w:r>
+      <w:proofErr w:type="spellEnd"/>
+      <w:r>
+        <w:rPr>
+          <w:rFonts w:ascii="Verdana" w:hAnsi="Verdana"/>
+        </w:rPr>
+        <w:t xml:space="preserve"> swapping aangezet wat zorgde voorde oplossing.</w:t>
+      </w:r>
+    </w:p>
+    <w:p>
+      <w:pPr>
+        <w:spacing w:after="200" w:line="276" w:lineRule="auto"/>
+        <w:rPr>
+          <w:rFonts w:ascii="Verdana" w:hAnsi="Verdana"/>
+        </w:rPr>
+      </w:pPr>
+    </w:p>
+    <w:p>
+      <w:pPr>
+        <w:spacing w:after="200" w:line="276" w:lineRule="auto"/>
+        <w:rPr>
+          <w:rFonts w:ascii="Verdana" w:hAnsi="Verdana"/>
+        </w:rPr>
+      </w:pPr>
     </w:p>
     <w:p>
       <w:pPr>
@@ -2243,6 +3939,7 @@
         <w:spacing w:before="400" w:after="200"/>
       </w:pPr>
       <w:r>
+        <w:lastRenderedPageBreak/>
         <w:t>7. Conclusie</w:t>
       </w:r>
     </w:p>
@@ -2544,6 +4241,155 @@
     </w:lvl>
   </w:abstractNum>
   <w:abstractNum w:abstractNumId="3" w15:restartNumberingAfterBreak="0">
+    <w:nsid w:val="350E2526"/>
+    <w:multiLevelType w:val="multilevel"/>
+    <w:tmpl w:val="C27C8376"/>
+    <w:lvl w:ilvl="0">
+      <w:start w:val="1"/>
+      <w:numFmt w:val="bullet"/>
+      <w:lvlText w:val=""/>
+      <w:lvlJc w:val="left"/>
+      <w:pPr>
+        <w:tabs>
+          <w:tab w:val="num" w:pos="720"/>
+        </w:tabs>
+        <w:ind w:left="720" w:hanging="360"/>
+      </w:pPr>
+      <w:rPr>
+        <w:rFonts w:ascii="Symbol" w:hAnsi="Symbol" w:hint="default"/>
+        <w:sz w:val="20"/>
+      </w:rPr>
+    </w:lvl>
+    <w:lvl w:ilvl="1" w:tentative="1">
+      <w:start w:val="1"/>
+      <w:numFmt w:val="bullet"/>
+      <w:lvlText w:val="o"/>
+      <w:lvlJc w:val="left"/>
+      <w:pPr>
+        <w:tabs>
+          <w:tab w:val="num" w:pos="1440"/>
+        </w:tabs>
+        <w:ind w:left="1440" w:hanging="360"/>
+      </w:pPr>
+      <w:rPr>
+        <w:rFonts w:ascii="Courier New" w:hAnsi="Courier New" w:hint="default"/>
+        <w:sz w:val="20"/>
+      </w:rPr>
+    </w:lvl>
+    <w:lvl w:ilvl="2" w:tentative="1">
+      <w:start w:val="1"/>
+      <w:numFmt w:val="bullet"/>
+      <w:lvlText w:val=""/>
+      <w:lvlJc w:val="left"/>
+      <w:pPr>
+        <w:tabs>
+          <w:tab w:val="num" w:pos="2160"/>
+        </w:tabs>
+        <w:ind w:left="2160" w:hanging="360"/>
+      </w:pPr>
+      <w:rPr>
+        <w:rFonts w:ascii="Wingdings" w:hAnsi="Wingdings" w:hint="default"/>
+        <w:sz w:val="20"/>
+      </w:rPr>
+    </w:lvl>
+    <w:lvl w:ilvl="3" w:tentative="1">
+      <w:start w:val="1"/>
+      <w:numFmt w:val="bullet"/>
+      <w:lvlText w:val=""/>
+      <w:lvlJc w:val="left"/>
+      <w:pPr>
+        <w:tabs>
+          <w:tab w:val="num" w:pos="2880"/>
+        </w:tabs>
+        <w:ind w:left="2880" w:hanging="360"/>
+      </w:pPr>
+      <w:rPr>
+        <w:rFonts w:ascii="Wingdings" w:hAnsi="Wingdings" w:hint="default"/>
+        <w:sz w:val="20"/>
+      </w:rPr>
+    </w:lvl>
+    <w:lvl w:ilvl="4" w:tentative="1">
+      <w:start w:val="1"/>
+      <w:numFmt w:val="bullet"/>
+      <w:lvlText w:val=""/>
+      <w:lvlJc w:val="left"/>
+      <w:pPr>
+        <w:tabs>
+          <w:tab w:val="num" w:pos="3600"/>
+        </w:tabs>
+        <w:ind w:left="3600" w:hanging="360"/>
+      </w:pPr>
+      <w:rPr>
+        <w:rFonts w:ascii="Wingdings" w:hAnsi="Wingdings" w:hint="default"/>
+        <w:sz w:val="20"/>
+      </w:rPr>
+    </w:lvl>
+    <w:lvl w:ilvl="5" w:tentative="1">
+      <w:start w:val="1"/>
+      <w:numFmt w:val="bullet"/>
+      <w:lvlText w:val=""/>
+      <w:lvlJc w:val="left"/>
+      <w:pPr>
+        <w:tabs>
+          <w:tab w:val="num" w:pos="4320"/>
+        </w:tabs>
+        <w:ind w:left="4320" w:hanging="360"/>
+      </w:pPr>
+      <w:rPr>
+        <w:rFonts w:ascii="Wingdings" w:hAnsi="Wingdings" w:hint="default"/>
+        <w:sz w:val="20"/>
+      </w:rPr>
+    </w:lvl>
+    <w:lvl w:ilvl="6" w:tentative="1">
+      <w:start w:val="1"/>
+      <w:numFmt w:val="bullet"/>
+      <w:lvlText w:val=""/>
+      <w:lvlJc w:val="left"/>
+      <w:pPr>
+        <w:tabs>
+          <w:tab w:val="num" w:pos="5040"/>
+        </w:tabs>
+        <w:ind w:left="5040" w:hanging="360"/>
+      </w:pPr>
+      <w:rPr>
+        <w:rFonts w:ascii="Wingdings" w:hAnsi="Wingdings" w:hint="default"/>
+        <w:sz w:val="20"/>
+      </w:rPr>
+    </w:lvl>
+    <w:lvl w:ilvl="7" w:tentative="1">
+      <w:start w:val="1"/>
+      <w:numFmt w:val="bullet"/>
+      <w:lvlText w:val=""/>
+      <w:lvlJc w:val="left"/>
+      <w:pPr>
+        <w:tabs>
+          <w:tab w:val="num" w:pos="5760"/>
+        </w:tabs>
+        <w:ind w:left="5760" w:hanging="360"/>
+      </w:pPr>
+      <w:rPr>
+        <w:rFonts w:ascii="Wingdings" w:hAnsi="Wingdings" w:hint="default"/>
+        <w:sz w:val="20"/>
+      </w:rPr>
+    </w:lvl>
+    <w:lvl w:ilvl="8" w:tentative="1">
+      <w:start w:val="1"/>
+      <w:numFmt w:val="bullet"/>
+      <w:lvlText w:val=""/>
+      <w:lvlJc w:val="left"/>
+      <w:pPr>
+        <w:tabs>
+          <w:tab w:val="num" w:pos="6480"/>
+        </w:tabs>
+        <w:ind w:left="6480" w:hanging="360"/>
+      </w:pPr>
+      <w:rPr>
+        <w:rFonts w:ascii="Wingdings" w:hAnsi="Wingdings" w:hint="default"/>
+        <w:sz w:val="20"/>
+      </w:rPr>
+    </w:lvl>
+  </w:abstractNum>
+  <w:abstractNum w:abstractNumId="4" w15:restartNumberingAfterBreak="0">
     <w:nsid w:val="40605AE6"/>
     <w:multiLevelType w:val="hybridMultilevel"/>
     <w:tmpl w:val="D8BE7CC6"/>
@@ -2629,7 +4475,7 @@
       </w:pPr>
     </w:lvl>
   </w:abstractNum>
-  <w:abstractNum w:abstractNumId="4" w15:restartNumberingAfterBreak="0">
+  <w:abstractNum w:abstractNumId="5" w15:restartNumberingAfterBreak="0">
     <w:nsid w:val="544A719D"/>
     <w:multiLevelType w:val="hybridMultilevel"/>
     <w:tmpl w:val="D4369AAC"/>
@@ -2742,7 +4588,7 @@
       </w:rPr>
     </w:lvl>
   </w:abstractNum>
-  <w:abstractNum w:abstractNumId="5" w15:restartNumberingAfterBreak="0">
+  <w:abstractNum w:abstractNumId="6" w15:restartNumberingAfterBreak="0">
     <w:nsid w:val="62936EF8"/>
     <w:multiLevelType w:val="hybridMultilevel"/>
     <w:tmpl w:val="BBB21CF4"/>
@@ -2855,8 +4701,157 @@
       </w:rPr>
     </w:lvl>
   </w:abstractNum>
+  <w:abstractNum w:abstractNumId="7" w15:restartNumberingAfterBreak="0">
+    <w:nsid w:val="6AF92664"/>
+    <w:multiLevelType w:val="multilevel"/>
+    <w:tmpl w:val="0C904818"/>
+    <w:lvl w:ilvl="0">
+      <w:start w:val="1"/>
+      <w:numFmt w:val="bullet"/>
+      <w:lvlText w:val=""/>
+      <w:lvlJc w:val="left"/>
+      <w:pPr>
+        <w:tabs>
+          <w:tab w:val="num" w:pos="720"/>
+        </w:tabs>
+        <w:ind w:left="720" w:hanging="360"/>
+      </w:pPr>
+      <w:rPr>
+        <w:rFonts w:ascii="Symbol" w:hAnsi="Symbol" w:hint="default"/>
+        <w:sz w:val="20"/>
+      </w:rPr>
+    </w:lvl>
+    <w:lvl w:ilvl="1" w:tentative="1">
+      <w:start w:val="1"/>
+      <w:numFmt w:val="bullet"/>
+      <w:lvlText w:val="o"/>
+      <w:lvlJc w:val="left"/>
+      <w:pPr>
+        <w:tabs>
+          <w:tab w:val="num" w:pos="1440"/>
+        </w:tabs>
+        <w:ind w:left="1440" w:hanging="360"/>
+      </w:pPr>
+      <w:rPr>
+        <w:rFonts w:ascii="Courier New" w:hAnsi="Courier New" w:hint="default"/>
+        <w:sz w:val="20"/>
+      </w:rPr>
+    </w:lvl>
+    <w:lvl w:ilvl="2" w:tentative="1">
+      <w:start w:val="1"/>
+      <w:numFmt w:val="bullet"/>
+      <w:lvlText w:val=""/>
+      <w:lvlJc w:val="left"/>
+      <w:pPr>
+        <w:tabs>
+          <w:tab w:val="num" w:pos="2160"/>
+        </w:tabs>
+        <w:ind w:left="2160" w:hanging="360"/>
+      </w:pPr>
+      <w:rPr>
+        <w:rFonts w:ascii="Wingdings" w:hAnsi="Wingdings" w:hint="default"/>
+        <w:sz w:val="20"/>
+      </w:rPr>
+    </w:lvl>
+    <w:lvl w:ilvl="3" w:tentative="1">
+      <w:start w:val="1"/>
+      <w:numFmt w:val="bullet"/>
+      <w:lvlText w:val=""/>
+      <w:lvlJc w:val="left"/>
+      <w:pPr>
+        <w:tabs>
+          <w:tab w:val="num" w:pos="2880"/>
+        </w:tabs>
+        <w:ind w:left="2880" w:hanging="360"/>
+      </w:pPr>
+      <w:rPr>
+        <w:rFonts w:ascii="Wingdings" w:hAnsi="Wingdings" w:hint="default"/>
+        <w:sz w:val="20"/>
+      </w:rPr>
+    </w:lvl>
+    <w:lvl w:ilvl="4" w:tentative="1">
+      <w:start w:val="1"/>
+      <w:numFmt w:val="bullet"/>
+      <w:lvlText w:val=""/>
+      <w:lvlJc w:val="left"/>
+      <w:pPr>
+        <w:tabs>
+          <w:tab w:val="num" w:pos="3600"/>
+        </w:tabs>
+        <w:ind w:left="3600" w:hanging="360"/>
+      </w:pPr>
+      <w:rPr>
+        <w:rFonts w:ascii="Wingdings" w:hAnsi="Wingdings" w:hint="default"/>
+        <w:sz w:val="20"/>
+      </w:rPr>
+    </w:lvl>
+    <w:lvl w:ilvl="5" w:tentative="1">
+      <w:start w:val="1"/>
+      <w:numFmt w:val="bullet"/>
+      <w:lvlText w:val=""/>
+      <w:lvlJc w:val="left"/>
+      <w:pPr>
+        <w:tabs>
+          <w:tab w:val="num" w:pos="4320"/>
+        </w:tabs>
+        <w:ind w:left="4320" w:hanging="360"/>
+      </w:pPr>
+      <w:rPr>
+        <w:rFonts w:ascii="Wingdings" w:hAnsi="Wingdings" w:hint="default"/>
+        <w:sz w:val="20"/>
+      </w:rPr>
+    </w:lvl>
+    <w:lvl w:ilvl="6" w:tentative="1">
+      <w:start w:val="1"/>
+      <w:numFmt w:val="bullet"/>
+      <w:lvlText w:val=""/>
+      <w:lvlJc w:val="left"/>
+      <w:pPr>
+        <w:tabs>
+          <w:tab w:val="num" w:pos="5040"/>
+        </w:tabs>
+        <w:ind w:left="5040" w:hanging="360"/>
+      </w:pPr>
+      <w:rPr>
+        <w:rFonts w:ascii="Wingdings" w:hAnsi="Wingdings" w:hint="default"/>
+        <w:sz w:val="20"/>
+      </w:rPr>
+    </w:lvl>
+    <w:lvl w:ilvl="7" w:tentative="1">
+      <w:start w:val="1"/>
+      <w:numFmt w:val="bullet"/>
+      <w:lvlText w:val=""/>
+      <w:lvlJc w:val="left"/>
+      <w:pPr>
+        <w:tabs>
+          <w:tab w:val="num" w:pos="5760"/>
+        </w:tabs>
+        <w:ind w:left="5760" w:hanging="360"/>
+      </w:pPr>
+      <w:rPr>
+        <w:rFonts w:ascii="Wingdings" w:hAnsi="Wingdings" w:hint="default"/>
+        <w:sz w:val="20"/>
+      </w:rPr>
+    </w:lvl>
+    <w:lvl w:ilvl="8" w:tentative="1">
+      <w:start w:val="1"/>
+      <w:numFmt w:val="bullet"/>
+      <w:lvlText w:val=""/>
+      <w:lvlJc w:val="left"/>
+      <w:pPr>
+        <w:tabs>
+          <w:tab w:val="num" w:pos="6480"/>
+        </w:tabs>
+        <w:ind w:left="6480" w:hanging="360"/>
+      </w:pPr>
+      <w:rPr>
+        <w:rFonts w:ascii="Wingdings" w:hAnsi="Wingdings" w:hint="default"/>
+        <w:sz w:val="20"/>
+      </w:rPr>
+    </w:lvl>
+  </w:abstractNum>
   <w:num w:numId="1" w16cid:durableId="352339988">
-    <w:abstractNumId w:val="3"/>
+    <w:abstractNumId w:val="4"/>
     <w:lvlOverride w:ilvl="0">
       <w:startOverride w:val="1"/>
     </w:lvlOverride>
@@ -2868,16 +4863,22 @@
     </w:lvlOverride>
   </w:num>
   <w:num w:numId="3" w16cid:durableId="1139036140">
-    <w:abstractNumId w:val="5"/>
+    <w:abstractNumId w:val="6"/>
   </w:num>
   <w:num w:numId="4" w16cid:durableId="1256983194">
-    <w:abstractNumId w:val="4"/>
+    <w:abstractNumId w:val="5"/>
   </w:num>
   <w:num w:numId="5" w16cid:durableId="531309747">
     <w:abstractNumId w:val="1"/>
   </w:num>
   <w:num w:numId="6" w16cid:durableId="302005933">
     <w:abstractNumId w:val="2"/>
+  </w:num>
+  <w:num w:numId="7" w16cid:durableId="1712069786">
+    <w:abstractNumId w:val="3"/>
+  </w:num>
+  <w:num w:numId="8" w16cid:durableId="274824953">
+    <w:abstractNumId w:val="7"/>
   </w:num>
 </w:numbering>
 </file>

</xml_diff>